<commit_message>
Rebuild portfolio with Untitled UI and FDE positioning
</commit_message>
<xml_diff>
--- a/public/resume/mohamed-moheyeldin-resume-detailed.docx
+++ b/public/resume/mohamed-moheyeldin-resume-detailed.docx
@@ -5,14 +5,14 @@
     <w:p>
       <w:pPr>
         <w:spacing w:after="20"/>
-        <w:jc w:val="center"/>
+        <w:jc w:val="left"/>
       </w:pPr>
       <w:r>
         <w:rPr>
-          <w:rFonts w:ascii="Arial" w:hAnsi="Arial"/>
+          <w:rFonts w:ascii="Inter" w:hAnsi="Inter"/>
           <w:b/>
           <w:i w:val="0"/>
-          <w:color w:val="0B1020"/>
+          <w:color w:val="171717"/>
           <w:sz w:val="46"/>
         </w:rPr>
         <w:t>Mohamed Moheyeldin</w:t>
@@ -21,33 +21,30 @@
     <w:p>
       <w:pPr>
         <w:spacing w:after="100"/>
-        <w:jc w:val="center"/>
+        <w:jc w:val="left"/>
       </w:pPr>
       <w:r>
         <w:rPr>
-          <w:rFonts w:ascii="Arial" w:hAnsi="Arial"/>
+          <w:rFonts w:ascii="Inter" w:hAnsi="Inter"/>
           <w:b/>
           <w:i w:val="0"/>
-          <w:color w:val="1267E8"/>
+          <w:color w:val="1447E6"/>
           <w:sz w:val="22"/>
         </w:rPr>
-        <w:t>Senior SDET | Test Automation Lead | Quality Engineering</w:t>
+        <w:t>Forward Deployed Engineer</w:t>
       </w:r>
     </w:p>
     <w:p>
       <w:pPr>
         <w:spacing w:after="160"/>
-        <w:jc w:val="center"/>
-        <w:pBdr>
-          <w:bottom w:val="single" w:sz="6" w:space="3" w:color="DFE3EB"/>
-        </w:pBdr>
+        <w:jc w:val="left"/>
       </w:pPr>
       <w:r>
         <w:rPr>
-          <w:rFonts w:ascii="Arial" w:hAnsi="Arial"/>
+          <w:rFonts w:ascii="Inter" w:hAnsi="Inter"/>
           <w:b w:val="0"/>
           <w:i w:val="0"/>
-          <w:color w:val="4D5568"/>
+          <w:color w:val="525252"/>
           <w:sz w:val="16"/>
         </w:rPr>
         <w:t>Reston, VA  |  mohamedmoheyeldin.com  |  mohamedmoheyeldin.jobs@gmail.com  |  linkedin.com/in/moheyeldin  |  github.com/mohamedmoheyeldin</w:t>
@@ -57,29 +54,16 @@
       <w:pPr>
         <w:keepNext/>
         <w:spacing w:before="200" w:after="80"/>
-        <w:pBdr>
-          <w:bottom w:val="single" w:sz="4" w:space="3" w:color="DFE3EB"/>
-        </w:pBdr>
       </w:pPr>
       <w:r>
         <w:rPr>
-          <w:rFonts w:ascii="Arial" w:hAnsi="Arial"/>
+          <w:rFonts w:ascii="Inter" w:hAnsi="Inter"/>
           <w:b/>
           <w:i w:val="0"/>
-          <w:color w:val="0B1020"/>
-          <w:sz w:val="20"/>
+          <w:color w:val="1447E6"/>
+          <w:sz w:val="24"/>
         </w:rPr>
-        <w:t xml:space="preserve">PROFESSIONAL </w:t>
-      </w:r>
-      <w:r>
-        <w:rPr>
-          <w:rFonts w:ascii="Arial" w:hAnsi="Arial"/>
-          <w:b/>
-          <w:i w:val="0"/>
-          <w:color w:val="1267E8"/>
-          <w:sz w:val="20"/>
-        </w:rPr>
-        <w:t>PROFILE</w:t>
+        <w:t>Professional profile</w:t>
       </w:r>
     </w:p>
     <w:p>
@@ -88,45 +72,32 @@
       </w:pPr>
       <w:r>
         <w:rPr>
-          <w:rFonts w:ascii="Arial" w:hAnsi="Arial"/>
+          <w:rFonts w:ascii="Inter" w:hAnsi="Inter"/>
           <w:b w:val="0"/>
           <w:i w:val="0"/>
-          <w:color w:val="0B1020"/>
+          <w:color w:val="171717"/>
           <w:sz w:val="18"/>
         </w:rPr>
-        <w:t>Senior Software Development Engineer in Test and Test Automation Lead with 10+ years of experience delivering scalable, reliable software across federal, banking, e-commerce, and enterprise environments. Specialized in UI, API, integration, and end-to-end automation using Playwright, Cypress, Selenium WebDriver, TypeScript, JavaScript, Java, Cucumber BDD, REST Assured, and Postman.</w:t>
+        <w:t>Engineer focused on forward deployed work, bringing 10+ years of hands-on experience across federal, e-commerce, and banking environments. My background spans TypeScript, JavaScript, Java, SQL, API integration, automation architecture, and cloud delivery.</w:t>
         <w:br/>
         <w:br/>
-        <w:t>Combines hands-on framework engineering with technical leadership: defining test strategy, automation roadmaps, framework standards, risk-based testing, release-readiness criteria, and quality engineering practices while remaining active in development, debugging, code review, test implementation, and failure analysis.</w:t>
+        <w:t>I build tools and workflows that connect APIs, data, and infrastructure: Jira integrations, data-provisioning utilities, GitHub Actions pipelines, and AWS environments. I combine implementation and debugging with technical leadership, code review, and mentoring, including experience leading five automation engineers.</w:t>
       </w:r>
     </w:p>
     <w:p>
       <w:pPr>
         <w:keepNext/>
         <w:spacing w:before="200" w:after="80"/>
-        <w:pBdr>
-          <w:bottom w:val="single" w:sz="4" w:space="3" w:color="DFE3EB"/>
-        </w:pBdr>
       </w:pPr>
       <w:r>
         <w:rPr>
-          <w:rFonts w:ascii="Arial" w:hAnsi="Arial"/>
+          <w:rFonts w:ascii="Inter" w:hAnsi="Inter"/>
           <w:b/>
           <w:i w:val="0"/>
-          <w:color w:val="0B1020"/>
-          <w:sz w:val="20"/>
+          <w:color w:val="1447E6"/>
+          <w:sz w:val="24"/>
         </w:rPr>
-        <w:t xml:space="preserve">CORE </w:t>
-      </w:r>
-      <w:r>
-        <w:rPr>
-          <w:rFonts w:ascii="Arial" w:hAnsi="Arial"/>
-          <w:b/>
-          <w:i w:val="0"/>
-          <w:color w:val="1267E8"/>
-          <w:sz w:val="20"/>
-        </w:rPr>
-        <w:t>EXPERTISE</w:t>
+        <w:t>Core expertise</w:t>
       </w:r>
     </w:p>
     <w:p>
@@ -135,42 +106,29 @@
       </w:pPr>
       <w:r>
         <w:rPr>
-          <w:rFonts w:ascii="Arial" w:hAnsi="Arial"/>
+          <w:rFonts w:ascii="Inter" w:hAnsi="Inter"/>
           <w:b w:val="0"/>
           <w:i w:val="0"/>
-          <w:color w:val="0B1020"/>
+          <w:color w:val="171717"/>
           <w:sz w:val="18"/>
         </w:rPr>
-        <w:t>Test Automation Architecture  |  UI and API Testing  |  CI/CD Quality Gates  |  Manual and Exploratory Testing  |  Risk-Based Testing  |  Team Leadership and Mentoring</w:t>
+        <w:t>API Integration &amp; Automation  |  Cloud Environments &amp; CI/CD  |  Requirements to Implementation  |  Debugging &amp; Diagnostics  |  Data Provisioning &amp; Validation  |  Technical Leadership &amp; Mentoring</w:t>
       </w:r>
     </w:p>
     <w:p>
       <w:pPr>
         <w:keepNext/>
         <w:spacing w:before="200" w:after="80"/>
-        <w:pBdr>
-          <w:bottom w:val="single" w:sz="4" w:space="3" w:color="DFE3EB"/>
-        </w:pBdr>
       </w:pPr>
       <w:r>
         <w:rPr>
-          <w:rFonts w:ascii="Arial" w:hAnsi="Arial"/>
+          <w:rFonts w:ascii="Inter" w:hAnsi="Inter"/>
           <w:b/>
           <w:i w:val="0"/>
-          <w:color w:val="0B1020"/>
-          <w:sz w:val="20"/>
+          <w:color w:val="1447E6"/>
+          <w:sz w:val="24"/>
         </w:rPr>
-        <w:t xml:space="preserve">TECHNICAL </w:t>
-      </w:r>
-      <w:r>
-        <w:rPr>
-          <w:rFonts w:ascii="Arial" w:hAnsi="Arial"/>
-          <w:b/>
-          <w:i w:val="0"/>
-          <w:color w:val="1267E8"/>
-          <w:sz w:val="20"/>
-        </w:rPr>
-        <w:t>SKILLS</w:t>
+        <w:t>Technical skills</w:t>
       </w:r>
     </w:p>
     <w:p>
@@ -179,20 +137,20 @@
       </w:pPr>
       <w:r>
         <w:rPr>
-          <w:rFonts w:ascii="Arial" w:hAnsi="Arial"/>
+          <w:rFonts w:ascii="Inter" w:hAnsi="Inter"/>
           <w:b/>
           <w:i w:val="0"/>
-          <w:color w:val="0B1020"/>
+          <w:color w:val="171717"/>
           <w:sz w:val="18"/>
         </w:rPr>
         <w:t xml:space="preserve">Automation: </w:t>
       </w:r>
       <w:r>
         <w:rPr>
-          <w:rFonts w:ascii="Arial" w:hAnsi="Arial"/>
+          <w:rFonts w:ascii="Inter" w:hAnsi="Inter"/>
           <w:b w:val="0"/>
           <w:i w:val="0"/>
-          <w:color w:val="4D5568"/>
+          <w:color w:val="525252"/>
           <w:sz w:val="18"/>
         </w:rPr>
         <w:t>Playwright, Cypress, Selenium WebDriver, Cucumber BDD, Applitools</w:t>
@@ -204,20 +162,20 @@
       </w:pPr>
       <w:r>
         <w:rPr>
-          <w:rFonts w:ascii="Arial" w:hAnsi="Arial"/>
+          <w:rFonts w:ascii="Inter" w:hAnsi="Inter"/>
           <w:b/>
           <w:i w:val="0"/>
-          <w:color w:val="0B1020"/>
+          <w:color w:val="171717"/>
           <w:sz w:val="18"/>
         </w:rPr>
         <w:t xml:space="preserve">Programming &amp; API: </w:t>
       </w:r>
       <w:r>
         <w:rPr>
-          <w:rFonts w:ascii="Arial" w:hAnsi="Arial"/>
+          <w:rFonts w:ascii="Inter" w:hAnsi="Inter"/>
           <w:b w:val="0"/>
           <w:i w:val="0"/>
-          <w:color w:val="4D5568"/>
+          <w:color w:val="525252"/>
           <w:sz w:val="18"/>
         </w:rPr>
         <w:t>TypeScript, JavaScript, Java, SQL, Playwright API, REST Assured, Postman, Contract Testing, Schema Validation, Network Mocking</w:t>
@@ -229,20 +187,20 @@
       </w:pPr>
       <w:r>
         <w:rPr>
-          <w:rFonts w:ascii="Arial" w:hAnsi="Arial"/>
+          <w:rFonts w:ascii="Inter" w:hAnsi="Inter"/>
           <w:b/>
           <w:i w:val="0"/>
-          <w:color w:val="0B1020"/>
+          <w:color w:val="171717"/>
           <w:sz w:val="18"/>
         </w:rPr>
         <w:t xml:space="preserve">Delivery: </w:t>
       </w:r>
       <w:r>
         <w:rPr>
-          <w:rFonts w:ascii="Arial" w:hAnsi="Arial"/>
+          <w:rFonts w:ascii="Inter" w:hAnsi="Inter"/>
           <w:b w:val="0"/>
           <w:i w:val="0"/>
-          <w:color w:val="4D5568"/>
+          <w:color w:val="525252"/>
           <w:sz w:val="18"/>
         </w:rPr>
         <w:t>GitHub Actions, Azure DevOps, Jenkins, Bamboo, Cypress Dashboard, AWS, EC2, S3, Aurora DB</w:t>
@@ -254,20 +212,20 @@
       </w:pPr>
       <w:r>
         <w:rPr>
-          <w:rFonts w:ascii="Arial" w:hAnsi="Arial"/>
+          <w:rFonts w:ascii="Inter" w:hAnsi="Inter"/>
           <w:b/>
           <w:i w:val="0"/>
-          <w:color w:val="0B1020"/>
+          <w:color w:val="171717"/>
           <w:sz w:val="18"/>
         </w:rPr>
         <w:t xml:space="preserve">Data &amp; insight: </w:t>
       </w:r>
       <w:r>
         <w:rPr>
-          <w:rFonts w:ascii="Arial" w:hAnsi="Arial"/>
+          <w:rFonts w:ascii="Inter" w:hAnsi="Inter"/>
           <w:b w:val="0"/>
           <w:i w:val="0"/>
-          <w:color w:val="4D5568"/>
+          <w:color w:val="525252"/>
           <w:sz w:val="18"/>
         </w:rPr>
         <w:t>Oracle, SQL Server, MongoDB, JMeter, Datadog, Allure, Elastic Stack, Extent Reports</w:t>
@@ -279,20 +237,20 @@
       </w:pPr>
       <w:r>
         <w:rPr>
-          <w:rFonts w:ascii="Arial" w:hAnsi="Arial"/>
+          <w:rFonts w:ascii="Inter" w:hAnsi="Inter"/>
           <w:b/>
           <w:i w:val="0"/>
-          <w:color w:val="0B1020"/>
+          <w:color w:val="171717"/>
           <w:sz w:val="18"/>
         </w:rPr>
         <w:t xml:space="preserve">Test frameworks: </w:t>
       </w:r>
       <w:r>
         <w:rPr>
-          <w:rFonts w:ascii="Arial" w:hAnsi="Arial"/>
+          <w:rFonts w:ascii="Inter" w:hAnsi="Inter"/>
           <w:b w:val="0"/>
           <w:i w:val="0"/>
-          <w:color w:val="4D5568"/>
+          <w:color w:val="525252"/>
           <w:sz w:val="18"/>
         </w:rPr>
         <w:t>TestNG, JUnit, Mocha, Chai, Jest, Selenium Grid, Applitools Eyes</w:t>
@@ -302,29 +260,16 @@
       <w:pPr>
         <w:keepNext/>
         <w:spacing w:before="200" w:after="80"/>
-        <w:pBdr>
-          <w:bottom w:val="single" w:sz="4" w:space="3" w:color="DFE3EB"/>
-        </w:pBdr>
       </w:pPr>
       <w:r>
         <w:rPr>
-          <w:rFonts w:ascii="Arial" w:hAnsi="Arial"/>
+          <w:rFonts w:ascii="Inter" w:hAnsi="Inter"/>
           <w:b/>
           <w:i w:val="0"/>
-          <w:color w:val="0B1020"/>
-          <w:sz w:val="20"/>
+          <w:color w:val="1447E6"/>
+          <w:sz w:val="24"/>
         </w:rPr>
-        <w:t xml:space="preserve">PROFESSIONAL </w:t>
-      </w:r>
-      <w:r>
-        <w:rPr>
-          <w:rFonts w:ascii="Arial" w:hAnsi="Arial"/>
-          <w:b/>
-          <w:i w:val="0"/>
-          <w:color w:val="1267E8"/>
-          <w:sz w:val="20"/>
-        </w:rPr>
-        <w:t>EXPERIENCE</w:t>
+        <w:t>Professional experience</w:t>
       </w:r>
     </w:p>
     <w:p>
@@ -334,20 +279,20 @@
       </w:pPr>
       <w:r>
         <w:rPr>
-          <w:rFonts w:ascii="Arial" w:hAnsi="Arial"/>
+          <w:rFonts w:ascii="Inter" w:hAnsi="Inter"/>
           <w:b/>
           <w:i w:val="0"/>
-          <w:color w:val="0B1020"/>
+          <w:color w:val="171717"/>
           <w:sz w:val="20"/>
         </w:rPr>
         <w:t>Senior SDET / Test Automation Lead | Booz Allen Hamilton</w:t>
       </w:r>
       <w:r>
         <w:rPr>
-          <w:rFonts w:ascii="Arial" w:hAnsi="Arial"/>
+          <w:rFonts w:ascii="Inter" w:hAnsi="Inter"/>
           <w:b w:val="0"/>
           <w:i w:val="0"/>
-          <w:color w:val="4D5568"/>
+          <w:color w:val="525252"/>
           <w:sz w:val="16"/>
         </w:rPr>
         <w:t xml:space="preserve">  |  2020-12 - Present</w:t>
@@ -359,10 +304,10 @@
       </w:pPr>
       <w:r>
         <w:rPr>
-          <w:rFonts w:ascii="Arial" w:hAnsi="Arial"/>
+          <w:rFonts w:ascii="Inter" w:hAnsi="Inter"/>
           <w:b w:val="0"/>
           <w:i/>
-          <w:color w:val="4D5568"/>
+          <w:color w:val="525252"/>
           <w:sz w:val="18"/>
         </w:rPr>
         <w:t>Hands-on automation engineering and technical leadership in federal delivery environments, guiding framework direction while improving the quality signals teams use to make release decisions.</w:t>
@@ -376,10 +321,10 @@
       </w:pPr>
       <w:r>
         <w:rPr>
-          <w:rFonts w:ascii="Arial" w:hAnsi="Arial"/>
+          <w:rFonts w:ascii="Inter" w:hAnsi="Inter"/>
           <w:b w:val="0"/>
           <w:i w:val="0"/>
-          <w:color w:val="0B1020"/>
+          <w:color w:val="171717"/>
           <w:sz w:val="18"/>
         </w:rPr>
         <w:t>Led a team of five automation engineers, establishing scalable test strategies, resource planning, and automation standards.</w:t>
@@ -393,10 +338,10 @@
       </w:pPr>
       <w:r>
         <w:rPr>
-          <w:rFonts w:ascii="Arial" w:hAnsi="Arial"/>
+          <w:rFonts w:ascii="Inter" w:hAnsi="Inter"/>
           <w:b w:val="0"/>
           <w:i w:val="0"/>
-          <w:color w:val="0B1020"/>
+          <w:color w:val="171717"/>
           <w:sz w:val="18"/>
         </w:rPr>
         <w:t>Designed Cypress and Playwright frameworks for UI and API testing with resilient asynchronous handling, retry logic, and robust assertions.</w:t>
@@ -410,10 +355,10 @@
       </w:pPr>
       <w:r>
         <w:rPr>
-          <w:rFonts w:ascii="Arial" w:hAnsi="Arial"/>
+          <w:rFonts w:ascii="Inter" w:hAnsi="Inter"/>
           <w:b w:val="0"/>
           <w:i w:val="0"/>
-          <w:color w:val="0B1020"/>
+          <w:color w:val="171717"/>
           <w:sz w:val="18"/>
         </w:rPr>
         <w:t>Built GitHub Actions pipelines that distributed Cypress Dashboard and Playwright workloads across multiple virtual machines, managed artifacts, and provisioned environments dynamically for faster, diagnosable feedback.</w:t>
@@ -427,10 +372,10 @@
       </w:pPr>
       <w:r>
         <w:rPr>
-          <w:rFonts w:ascii="Arial" w:hAnsi="Arial"/>
+          <w:rFonts w:ascii="Inter" w:hAnsi="Inter"/>
           <w:b w:val="0"/>
           <w:i w:val="0"/>
-          <w:color w:val="0B1020"/>
+          <w:color w:val="171717"/>
           <w:sz w:val="18"/>
         </w:rPr>
         <w:t>Used AWS EC2, Aurora DB, and S3 to support on-demand test environments and scalable test execution.</w:t>
@@ -444,10 +389,10 @@
       </w:pPr>
       <w:r>
         <w:rPr>
-          <w:rFonts w:ascii="Arial" w:hAnsi="Arial"/>
+          <w:rFonts w:ascii="Inter" w:hAnsi="Inter"/>
           <w:b w:val="0"/>
           <w:i w:val="0"/>
-          <w:color w:val="0B1020"/>
+          <w:color w:val="171717"/>
           <w:sz w:val="18"/>
         </w:rPr>
         <w:t>Implemented automated defect triage through Jira API integration and risk-based failure prioritization.</w:t>
@@ -461,10 +406,10 @@
       </w:pPr>
       <w:r>
         <w:rPr>
-          <w:rFonts w:ascii="Arial" w:hAnsi="Arial"/>
+          <w:rFonts w:ascii="Inter" w:hAnsi="Inter"/>
           <w:b w:val="0"/>
           <w:i w:val="0"/>
-          <w:color w:val="0B1020"/>
+          <w:color w:val="171717"/>
           <w:sz w:val="18"/>
         </w:rPr>
         <w:t>Created test dashboards with Allure and Elastic Stack for trend analysis, failure-pattern recognition, and anomaly detection.</w:t>
@@ -478,10 +423,10 @@
       </w:pPr>
       <w:r>
         <w:rPr>
-          <w:rFonts w:ascii="Arial" w:hAnsi="Arial"/>
+          <w:rFonts w:ascii="Inter" w:hAnsi="Inter"/>
           <w:b w:val="0"/>
           <w:i w:val="0"/>
-          <w:color w:val="0B1020"/>
+          <w:color w:val="171717"/>
           <w:sz w:val="18"/>
         </w:rPr>
         <w:t>Balanced parallel workloads using suite composition and observed execution time, then tracked worker timing, retries, failure categories, artifact completeness, and environment health.</w:t>
@@ -495,10 +440,10 @@
       </w:pPr>
       <w:r>
         <w:rPr>
-          <w:rFonts w:ascii="Arial" w:hAnsi="Arial"/>
+          <w:rFonts w:ascii="Inter" w:hAnsi="Inter"/>
           <w:b w:val="0"/>
           <w:i w:val="0"/>
-          <w:color w:val="0B1020"/>
+          <w:color w:val="171717"/>
           <w:sz w:val="18"/>
         </w:rPr>
         <w:t>Developed data-provisioning utilities using JSON, Excel with Apache POI, and SQL-driven injection for mock responses and contract testing.</w:t>
@@ -512,10 +457,10 @@
       </w:pPr>
       <w:r>
         <w:rPr>
-          <w:rFonts w:ascii="Arial" w:hAnsi="Arial"/>
+          <w:rFonts w:ascii="Inter" w:hAnsi="Inter"/>
           <w:b w:val="0"/>
           <w:i w:val="0"/>
-          <w:color w:val="0B1020"/>
+          <w:color w:val="171717"/>
           <w:sz w:val="18"/>
         </w:rPr>
         <w:t>Configured Selenium Grid for parallel cross-browser testing and JMeter performance benchmarks.</w:t>
@@ -528,20 +473,20 @@
       </w:pPr>
       <w:r>
         <w:rPr>
-          <w:rFonts w:ascii="Arial" w:hAnsi="Arial"/>
+          <w:rFonts w:ascii="Inter" w:hAnsi="Inter"/>
           <w:b/>
           <w:i w:val="0"/>
-          <w:color w:val="0B1020"/>
+          <w:color w:val="171717"/>
           <w:sz w:val="20"/>
         </w:rPr>
         <w:t>Software Engineer in Test | Chick-fil-A Corporate</w:t>
       </w:r>
       <w:r>
         <w:rPr>
-          <w:rFonts w:ascii="Arial" w:hAnsi="Arial"/>
+          <w:rFonts w:ascii="Inter" w:hAnsi="Inter"/>
           <w:b w:val="0"/>
           <w:i w:val="0"/>
-          <w:color w:val="4D5568"/>
+          <w:color w:val="525252"/>
           <w:sz w:val="16"/>
         </w:rPr>
         <w:t xml:space="preserve">  |  2018-11 - 2020-12</w:t>
@@ -553,10 +498,10 @@
       </w:pPr>
       <w:r>
         <w:rPr>
-          <w:rFonts w:ascii="Arial" w:hAnsi="Arial"/>
+          <w:rFonts w:ascii="Inter" w:hAnsi="Inter"/>
           <w:b w:val="0"/>
           <w:i/>
-          <w:color w:val="4D5568"/>
+          <w:color w:val="525252"/>
           <w:sz w:val="18"/>
         </w:rPr>
         <w:t>Moved quality feedback earlier in the delivery lifecycle by connecting browser, API, visual, authentication, cloud-environment, and CI concerns into maintainable test systems.</w:t>
@@ -570,10 +515,10 @@
       </w:pPr>
       <w:r>
         <w:rPr>
-          <w:rFonts w:ascii="Arial" w:hAnsi="Arial"/>
+          <w:rFonts w:ascii="Inter" w:hAnsi="Inter"/>
           <w:b w:val="0"/>
           <w:i w:val="0"/>
-          <w:color w:val="0B1020"/>
+          <w:color w:val="171717"/>
           <w:sz w:val="18"/>
         </w:rPr>
         <w:t>Architected GitHub Actions pipelines integrating Cypress Dashboard and AWS for automated execution and rapid feedback.</w:t>
@@ -587,10 +532,10 @@
       </w:pPr>
       <w:r>
         <w:rPr>
-          <w:rFonts w:ascii="Arial" w:hAnsi="Arial"/>
+          <w:rFonts w:ascii="Inter" w:hAnsi="Inter"/>
           <w:b w:val="0"/>
           <w:i w:val="0"/>
-          <w:color w:val="0B1020"/>
+          <w:color w:val="171717"/>
           <w:sz w:val="18"/>
         </w:rPr>
         <w:t>Designed modular smoke and regression suites with JavaScript, Cypress, and Mocha, including flaky-test mitigation.</w:t>
@@ -604,10 +549,10 @@
       </w:pPr>
       <w:r>
         <w:rPr>
-          <w:rFonts w:ascii="Arial" w:hAnsi="Arial"/>
+          <w:rFonts w:ascii="Inter" w:hAnsi="Inter"/>
           <w:b w:val="0"/>
           <w:i w:val="0"/>
-          <w:color w:val="0B1020"/>
+          <w:color w:val="171717"/>
           <w:sz w:val="18"/>
         </w:rPr>
         <w:t>Integrated Applitools Eyes visual regression testing across multiple resolutions, devices, and browsers.</w:t>
@@ -621,10 +566,10 @@
       </w:pPr>
       <w:r>
         <w:rPr>
-          <w:rFonts w:ascii="Arial" w:hAnsi="Arial"/>
+          <w:rFonts w:ascii="Inter" w:hAnsi="Inter"/>
           <w:b w:val="0"/>
           <w:i w:val="0"/>
-          <w:color w:val="0B1020"/>
+          <w:color w:val="171717"/>
           <w:sz w:val="18"/>
         </w:rPr>
         <w:t>Developed Cypress and Postman API suites with contract testing, schema validation, and dynamic data-driven assertions.</w:t>
@@ -638,10 +583,10 @@
       </w:pPr>
       <w:r>
         <w:rPr>
-          <w:rFonts w:ascii="Arial" w:hAnsi="Arial"/>
+          <w:rFonts w:ascii="Inter" w:hAnsi="Inter"/>
           <w:b w:val="0"/>
           <w:i w:val="0"/>
-          <w:color w:val="0B1020"/>
+          <w:color w:val="171717"/>
           <w:sz w:val="18"/>
         </w:rPr>
         <w:t>Implemented OIDC and Okta MFA automation in Cypress for SSO-based applications.</w:t>
@@ -655,10 +600,10 @@
       </w:pPr>
       <w:r>
         <w:rPr>
-          <w:rFonts w:ascii="Arial" w:hAnsi="Arial"/>
+          <w:rFonts w:ascii="Inter" w:hAnsi="Inter"/>
           <w:b w:val="0"/>
           <w:i w:val="0"/>
-          <w:color w:val="0B1020"/>
+          <w:color w:val="171717"/>
           <w:sz w:val="18"/>
         </w:rPr>
         <w:t>Managed AWS EC2, Aurora DB, and S3 resources with AWS CLI to support scalable test environments.</w:t>
@@ -672,10 +617,10 @@
       </w:pPr>
       <w:r>
         <w:rPr>
-          <w:rFonts w:ascii="Arial" w:hAnsi="Arial"/>
+          <w:rFonts w:ascii="Inter" w:hAnsi="Inter"/>
           <w:b w:val="0"/>
           <w:i w:val="0"/>
-          <w:color w:val="0B1020"/>
+          <w:color w:val="171717"/>
           <w:sz w:val="18"/>
         </w:rPr>
         <w:t>Applied parallel execution, network stubbing, and headless testing to reduce test run time while maintaining accuracy.</w:t>
@@ -689,10 +634,10 @@
       </w:pPr>
       <w:r>
         <w:rPr>
-          <w:rFonts w:ascii="Arial" w:hAnsi="Arial"/>
+          <w:rFonts w:ascii="Inter" w:hAnsi="Inter"/>
           <w:b w:val="0"/>
           <w:i w:val="0"/>
-          <w:color w:val="0B1020"/>
+          <w:color w:val="171717"/>
           <w:sz w:val="18"/>
         </w:rPr>
         <w:t>Used Cypress Dashboard duration, failure, retry, video, and screenshot evidence to diagnose bottlenecks and tune parallel execution.</w:t>
@@ -705,20 +650,20 @@
       </w:pPr>
       <w:r>
         <w:rPr>
-          <w:rFonts w:ascii="Arial" w:hAnsi="Arial"/>
+          <w:rFonts w:ascii="Inter" w:hAnsi="Inter"/>
           <w:b/>
           <w:i w:val="0"/>
-          <w:color w:val="0B1020"/>
+          <w:color w:val="171717"/>
           <w:sz w:val="20"/>
         </w:rPr>
         <w:t>Software QA Engineer | Ally Bank</w:t>
       </w:r>
       <w:r>
         <w:rPr>
-          <w:rFonts w:ascii="Arial" w:hAnsi="Arial"/>
+          <w:rFonts w:ascii="Inter" w:hAnsi="Inter"/>
           <w:b w:val="0"/>
           <w:i w:val="0"/>
-          <w:color w:val="4D5568"/>
+          <w:color w:val="525252"/>
           <w:sz w:val="16"/>
         </w:rPr>
         <w:t xml:space="preserve">  |  2015-09 - 2018-11</w:t>
@@ -730,10 +675,10 @@
       </w:pPr>
       <w:r>
         <w:rPr>
-          <w:rFonts w:ascii="Arial" w:hAnsi="Arial"/>
+          <w:rFonts w:ascii="Inter" w:hAnsi="Inter"/>
           <w:b w:val="0"/>
           <w:i/>
-          <w:color w:val="4D5568"/>
+          <w:color w:val="525252"/>
           <w:sz w:val="18"/>
         </w:rPr>
         <w:t>Built a foundation in risk-based testing, cross-browser investigation, clear defect communication, and release validation across complex banking experiences.</w:t>
@@ -747,10 +692,10 @@
       </w:pPr>
       <w:r>
         <w:rPr>
-          <w:rFonts w:ascii="Arial" w:hAnsi="Arial"/>
+          <w:rFonts w:ascii="Inter" w:hAnsi="Inter"/>
           <w:b w:val="0"/>
           <w:i w:val="0"/>
-          <w:color w:val="0B1020"/>
+          <w:color w:val="171717"/>
           <w:sz w:val="18"/>
         </w:rPr>
         <w:t>Performed exploratory, functional, and regression testing of web applications across multiple platforms.</w:t>
@@ -764,10 +709,10 @@
       </w:pPr>
       <w:r>
         <w:rPr>
-          <w:rFonts w:ascii="Arial" w:hAnsi="Arial"/>
+          <w:rFonts w:ascii="Inter" w:hAnsi="Inter"/>
           <w:b w:val="0"/>
           <w:i w:val="0"/>
-          <w:color w:val="0B1020"/>
+          <w:color w:val="171717"/>
           <w:sz w:val="18"/>
         </w:rPr>
         <w:t>Created test plans, test cases, and acceptance criteria aligned with business and functional requirements.</w:t>
@@ -781,10 +726,10 @@
       </w:pPr>
       <w:r>
         <w:rPr>
-          <w:rFonts w:ascii="Arial" w:hAnsi="Arial"/>
+          <w:rFonts w:ascii="Inter" w:hAnsi="Inter"/>
           <w:b w:val="0"/>
           <w:i w:val="0"/>
-          <w:color w:val="0B1020"/>
+          <w:color w:val="171717"/>
           <w:sz w:val="18"/>
         </w:rPr>
         <w:t>Executed cross-browser and responsive UI testing on Chrome, Firefox, Safari, and Edge.</w:t>
@@ -798,10 +743,10 @@
       </w:pPr>
       <w:r>
         <w:rPr>
-          <w:rFonts w:ascii="Arial" w:hAnsi="Arial"/>
+          <w:rFonts w:ascii="Inter" w:hAnsi="Inter"/>
           <w:b w:val="0"/>
           <w:i w:val="0"/>
-          <w:color w:val="0B1020"/>
+          <w:color w:val="171717"/>
           <w:sz w:val="18"/>
         </w:rPr>
         <w:t>Turned defects into decision-ready evidence in Jira by documenting reproduction paths, business impact, environment details, and verified fixes.</w:t>
@@ -815,10 +760,10 @@
       </w:pPr>
       <w:r>
         <w:rPr>
-          <w:rFonts w:ascii="Arial" w:hAnsi="Arial"/>
+          <w:rFonts w:ascii="Inter" w:hAnsi="Inter"/>
           <w:b w:val="0"/>
           <w:i w:val="0"/>
-          <w:color w:val="0B1020"/>
+          <w:color w:val="171717"/>
           <w:sz w:val="18"/>
         </w:rPr>
         <w:t>Ran smoke, regression, and sanity testing across development, QA, UAT, and staging environments.</w:t>
@@ -832,10 +777,10 @@
       </w:pPr>
       <w:r>
         <w:rPr>
-          <w:rFonts w:ascii="Arial" w:hAnsi="Arial"/>
+          <w:rFonts w:ascii="Inter" w:hAnsi="Inter"/>
           <w:b w:val="0"/>
           <w:i w:val="0"/>
-          <w:color w:val="0B1020"/>
+          <w:color w:val="171717"/>
           <w:sz w:val="18"/>
         </w:rPr>
         <w:t>Connected UI behavior, SQL data checks, pre- and post-deployment validation, hotfix verification, and production monitoring across the customer path.</w:t>
@@ -849,10 +794,10 @@
       </w:pPr>
       <w:r>
         <w:rPr>
-          <w:rFonts w:ascii="Arial" w:hAnsi="Arial"/>
+          <w:rFonts w:ascii="Inter" w:hAnsi="Inter"/>
           <w:b w:val="0"/>
           <w:i w:val="0"/>
-          <w:color w:val="0B1020"/>
+          <w:color w:val="171717"/>
           <w:sz w:val="18"/>
         </w:rPr>
         <w:t>Built traceable coverage across business requirements, platforms, browsers, environments, and high-risk customer scenarios.</w:t>
@@ -862,29 +807,16 @@
       <w:pPr>
         <w:keepNext/>
         <w:spacing w:before="200" w:after="80"/>
-        <w:pBdr>
-          <w:bottom w:val="single" w:sz="4" w:space="3" w:color="DFE3EB"/>
-        </w:pBdr>
       </w:pPr>
       <w:r>
         <w:rPr>
-          <w:rFonts w:ascii="Arial" w:hAnsi="Arial"/>
+          <w:rFonts w:ascii="Inter" w:hAnsi="Inter"/>
           <w:b/>
           <w:i w:val="0"/>
-          <w:color w:val="0B1020"/>
-          <w:sz w:val="20"/>
+          <w:color w:val="1447E6"/>
+          <w:sz w:val="24"/>
         </w:rPr>
-        <w:t xml:space="preserve">PORTFOLIO </w:t>
-      </w:r>
-      <w:r>
-        <w:rPr>
-          <w:rFonts w:ascii="Arial" w:hAnsi="Arial"/>
-          <w:b/>
-          <w:i w:val="0"/>
-          <w:color w:val="1267E8"/>
-          <w:sz w:val="20"/>
-        </w:rPr>
-        <w:t>SYSTEM</w:t>
+        <w:t>Portfolio system</w:t>
       </w:r>
     </w:p>
     <w:p>
@@ -893,13 +825,13 @@
       </w:pPr>
       <w:r>
         <w:rPr>
-          <w:rFonts w:ascii="Arial" w:hAnsi="Arial"/>
+          <w:rFonts w:ascii="Inter" w:hAnsi="Inter"/>
           <w:b w:val="0"/>
           <w:i w:val="0"/>
-          <w:color w:val="0B1020"/>
+          <w:color w:val="171717"/>
           <w:sz w:val="18"/>
         </w:rPr>
-        <w:t>A connected UI, API, CI/CD, cloud-environment, and diagnostics strategy for complex federal software delivery.</w:t>
+        <w:t>A schema-validated React and Vite platform that keeps the website portfolio, browser resume, and generated PDF and DOCX outputs aligned through one validated professional data source.</w:t>
       </w:r>
     </w:p>
     <w:p>
@@ -910,13 +842,13 @@
       </w:pPr>
       <w:r>
         <w:rPr>
-          <w:rFonts w:ascii="Arial" w:hAnsi="Arial"/>
+          <w:rFonts w:ascii="Inter" w:hAnsi="Inter"/>
           <w:b w:val="0"/>
           <w:i w:val="0"/>
-          <w:color w:val="0B1020"/>
+          <w:color w:val="171717"/>
           <w:sz w:val="18"/>
         </w:rPr>
-        <w:t>Multi-layer UI and API automation architecture</w:t>
+        <w:t>Designed one structured content architecture for every career presentation channel.</w:t>
       </w:r>
     </w:p>
     <w:p>
@@ -927,13 +859,13 @@
       </w:pPr>
       <w:r>
         <w:rPr>
-          <w:rFonts w:ascii="Arial" w:hAnsi="Arial"/>
+          <w:rFonts w:ascii="Inter" w:hAnsi="Inter"/>
           <w:b w:val="0"/>
           <w:i w:val="0"/>
-          <w:color w:val="0B1020"/>
+          <w:color w:val="171717"/>
           <w:sz w:val="18"/>
         </w:rPr>
-        <w:t>Parallel CI execution with complete diagnostic artifacts</w:t>
+        <w:t>Redesigned the website with free Untitled UI React components while preserving static content and accessible navigation.</w:t>
       </w:r>
     </w:p>
     <w:p>
@@ -944,13 +876,13 @@
       </w:pPr>
       <w:r>
         <w:rPr>
-          <w:rFonts w:ascii="Arial" w:hAnsi="Arial"/>
+          <w:rFonts w:ascii="Inter" w:hAnsi="Inter"/>
           <w:b w:val="0"/>
           <w:i w:val="0"/>
-          <w:color w:val="0B1020"/>
+          <w:color w:val="171717"/>
           <w:sz w:val="18"/>
         </w:rPr>
-        <w:t>Risk-based failure prioritization and automated defect triage</w:t>
+        <w:t>Added strict diagnostics, production builds, subpath packaging checks, and continuous deployment.</w:t>
       </w:r>
     </w:p>
     <w:p>
@@ -961,42 +893,29 @@
       </w:pPr>
       <w:r>
         <w:rPr>
-          <w:rFonts w:ascii="Arial" w:hAnsi="Arial"/>
+          <w:rFonts w:ascii="Inter" w:hAnsi="Inter"/>
           <w:b w:val="0"/>
           <w:i w:val="0"/>
-          <w:color w:val="0B1020"/>
+          <w:color w:val="171717"/>
           <w:sz w:val="18"/>
         </w:rPr>
-        <w:t>Technical leadership for a five-engineer automation team</w:t>
+        <w:t>Prepared separate PDF and DOCX presentation contracts without duplicating career facts.</w:t>
       </w:r>
     </w:p>
     <w:p>
       <w:pPr>
         <w:keepNext/>
         <w:spacing w:before="200" w:after="80"/>
-        <w:pBdr>
-          <w:bottom w:val="single" w:sz="4" w:space="3" w:color="DFE3EB"/>
-        </w:pBdr>
       </w:pPr>
       <w:r>
         <w:rPr>
-          <w:rFonts w:ascii="Arial" w:hAnsi="Arial"/>
+          <w:rFonts w:ascii="Inter" w:hAnsi="Inter"/>
           <w:b/>
           <w:i w:val="0"/>
-          <w:color w:val="0B1020"/>
-          <w:sz w:val="20"/>
+          <w:color w:val="1447E6"/>
+          <w:sz w:val="24"/>
         </w:rPr>
-        <w:t xml:space="preserve">EDUCATION &amp; </w:t>
-      </w:r>
-      <w:r>
-        <w:rPr>
-          <w:rFonts w:ascii="Arial" w:hAnsi="Arial"/>
-          <w:b/>
-          <w:i w:val="0"/>
-          <w:color w:val="1267E8"/>
-          <w:sz w:val="20"/>
-        </w:rPr>
-        <w:t>CREDENTIALS</w:t>
+        <w:t>Education &amp; credentials</w:t>
       </w:r>
     </w:p>
     <w:p>
@@ -1005,10 +924,10 @@
       </w:pPr>
       <w:r>
         <w:rPr>
-          <w:rFonts w:ascii="Arial" w:hAnsi="Arial"/>
+          <w:rFonts w:ascii="Inter" w:hAnsi="Inter"/>
           <w:b w:val="0"/>
           <w:i w:val="0"/>
-          <w:color w:val="0B1020"/>
+          <w:color w:val="171717"/>
           <w:sz w:val="18"/>
         </w:rPr>
         <w:t>Bachelor's degree in Computer Science | American College of Commerce and Technology | 2014</w:t>
@@ -1022,10 +941,10 @@
       </w:pPr>
       <w:r>
         <w:rPr>
-          <w:rFonts w:ascii="Arial" w:hAnsi="Arial"/>
+          <w:rFonts w:ascii="Inter" w:hAnsi="Inter"/>
           <w:b w:val="0"/>
           <w:i w:val="0"/>
-          <w:color w:val="0B1020"/>
+          <w:color w:val="171717"/>
           <w:sz w:val="18"/>
         </w:rPr>
         <w:t>Cucumber BDD Automation Framework</w:t>
@@ -1039,10 +958,10 @@
       </w:pPr>
       <w:r>
         <w:rPr>
-          <w:rFonts w:ascii="Arial" w:hAnsi="Arial"/>
+          <w:rFonts w:ascii="Inter" w:hAnsi="Inter"/>
           <w:b w:val="0"/>
           <w:i w:val="0"/>
-          <w:color w:val="0B1020"/>
+          <w:color w:val="171717"/>
           <w:sz w:val="18"/>
         </w:rPr>
         <w:t>Implementing SAFe Course (5.1) · Scaled Agile, Inc. · 2021</w:t>
@@ -1056,10 +975,10 @@
       </w:pPr>
       <w:r>
         <w:rPr>
-          <w:rFonts w:ascii="Arial" w:hAnsi="Arial"/>
+          <w:rFonts w:ascii="Inter" w:hAnsi="Inter"/>
           <w:b w:val="0"/>
           <w:i w:val="0"/>
-          <w:color w:val="0B1020"/>
+          <w:color w:val="171717"/>
           <w:sz w:val="18"/>
         </w:rPr>
         <w:t>Leading SAFe 4.0 Course · Scaled Agile, Inc. · 2016</w:t>
@@ -1081,14 +1000,14 @@
   <w:p>
     <w:pPr>
       <w:pStyle w:val="Footer"/>
-      <w:jc w:val="center"/>
+      <w:jc w:val="left"/>
     </w:pPr>
     <w:r>
       <w:rPr>
-        <w:rFonts w:ascii="Arial" w:hAnsi="Arial"/>
+        <w:rFonts w:ascii="Inter" w:hAnsi="Inter"/>
         <w:b w:val="0"/>
         <w:i w:val="0"/>
-        <w:color w:val="4D5568"/>
+        <w:color w:val="525252"/>
         <w:sz w:val="14"/>
       </w:rPr>
       <w:t>Detailed resume | mohamedmoheyeldin.com</w:t>
@@ -1464,8 +1383,8 @@
       <w:spacing w:after="90" w:line="269" w:lineRule="auto"/>
     </w:pPr>
     <w:rPr>
-      <w:rFonts w:ascii="Arial" w:hAnsi="Arial"/>
-      <w:color w:val="0B1020"/>
+      <w:rFonts w:ascii="Inter" w:hAnsi="Inter"/>
+      <w:color w:val="171717"/>
       <w:sz w:val="18"/>
     </w:rPr>
   </w:style>

</xml_diff>

<commit_message>
Refine portfolio layouts and synchronize FDE resume content
</commit_message>
<xml_diff>
--- a/public/resume/mohamed-moheyeldin-resume-detailed.docx
+++ b/public/resume/mohamed-moheyeldin-resume-detailed.docx
@@ -4,6 +4,7 @@
   <w:body>
     <w:p>
       <w:pPr>
+        <w:pStyle w:val="Title"/>
         <w:spacing w:after="20"/>
         <w:jc w:val="left"/>
       </w:pPr>
@@ -31,7 +32,7 @@
           <w:color w:val="1447E6"/>
           <w:sz w:val="22"/>
         </w:rPr>
-        <w:t>Forward Deployed Engineer</w:t>
+        <w:t>Bridging customer needs and technical solutions.</w:t>
       </w:r>
     </w:p>
     <w:p>
@@ -47,7 +48,7 @@
           <w:color w:val="525252"/>
           <w:sz w:val="16"/>
         </w:rPr>
-        <w:t>Reston, VA  |  mohamedmoheyeldin.com  |  mohamedmoheyeldin.jobs@gmail.com  |  linkedin.com/in/moheyeldin  |  github.com/mohamedmoheyeldin</w:t>
+        <w:t>Reston, VA 20191  |  mohamedmoheyeldin.com  |  mohamedmoheyeldin.jobs@gmail.com  |  linkedin.com/in/moheyeldin  |  github.com/mohamedmoheyeldin</w:t>
       </w:r>
     </w:p>
     <w:p>
@@ -78,182 +79,10 @@
           <w:color w:val="171717"/>
           <w:sz w:val="18"/>
         </w:rPr>
-        <w:t>Engineer focused on forward deployed work, bringing 10+ years of hands-on experience across federal, e-commerce, and banking environments. My background spans TypeScript, JavaScript, Java, SQL, API integration, automation architecture, and cloud delivery.</w:t>
+        <w:t>Customer-focused engineer with 11 years of software development and quality engineering experience across federal, banking, and e-commerce environments. Connects business requirements with hands-on implementation, system integration, and technical troubleshooting. Works directly with stakeholders from discovery and acceptance criteria through demonstrations, feedback, and adoption. Contributes React application features and develops tools such as Data Generator &amp; File Processing to simplify complex workflows, combining engineering execution with practical customer delivery.</w:t>
         <w:br/>
         <w:br/>
-        <w:t>I build tools and workflows that connect APIs, data, and infrastructure: Jira integrations, data-provisioning utilities, GitHub Actions pipelines, and AWS environments. I combine implementation and debugging with technical leadership, code review, and mentoring, including experience leading five automation engineers.</w:t>
-      </w:r>
-    </w:p>
-    <w:p>
-      <w:pPr>
-        <w:keepNext/>
-        <w:spacing w:before="200" w:after="80"/>
-      </w:pPr>
-      <w:r>
-        <w:rPr>
-          <w:rFonts w:ascii="Inter" w:hAnsi="Inter"/>
-          <w:b/>
-          <w:i w:val="0"/>
-          <w:color w:val="1447E6"/>
-          <w:sz w:val="24"/>
-        </w:rPr>
-        <w:t>Core expertise</w:t>
-      </w:r>
-    </w:p>
-    <w:p>
-      <w:pPr>
-        <w:spacing w:after="100" w:line="269" w:lineRule="auto"/>
-      </w:pPr>
-      <w:r>
-        <w:rPr>
-          <w:rFonts w:ascii="Inter" w:hAnsi="Inter"/>
-          <w:b w:val="0"/>
-          <w:i w:val="0"/>
-          <w:color w:val="171717"/>
-          <w:sz w:val="18"/>
-        </w:rPr>
-        <w:t>API Integration &amp; Automation  |  Cloud Environments &amp; CI/CD  |  Requirements to Implementation  |  Debugging &amp; Diagnostics  |  Data Provisioning &amp; Validation  |  Technical Leadership &amp; Mentoring</w:t>
-      </w:r>
-    </w:p>
-    <w:p>
-      <w:pPr>
-        <w:keepNext/>
-        <w:spacing w:before="200" w:after="80"/>
-      </w:pPr>
-      <w:r>
-        <w:rPr>
-          <w:rFonts w:ascii="Inter" w:hAnsi="Inter"/>
-          <w:b/>
-          <w:i w:val="0"/>
-          <w:color w:val="1447E6"/>
-          <w:sz w:val="24"/>
-        </w:rPr>
-        <w:t>Technical skills</w:t>
-      </w:r>
-    </w:p>
-    <w:p>
-      <w:pPr>
-        <w:spacing w:after="60"/>
-      </w:pPr>
-      <w:r>
-        <w:rPr>
-          <w:rFonts w:ascii="Inter" w:hAnsi="Inter"/>
-          <w:b/>
-          <w:i w:val="0"/>
-          <w:color w:val="171717"/>
-          <w:sz w:val="18"/>
-        </w:rPr>
-        <w:t xml:space="preserve">Automation: </w:t>
-      </w:r>
-      <w:r>
-        <w:rPr>
-          <w:rFonts w:ascii="Inter" w:hAnsi="Inter"/>
-          <w:b w:val="0"/>
-          <w:i w:val="0"/>
-          <w:color w:val="525252"/>
-          <w:sz w:val="18"/>
-        </w:rPr>
-        <w:t>Playwright, Cypress, Selenium WebDriver, Cucumber BDD, Applitools</w:t>
-      </w:r>
-    </w:p>
-    <w:p>
-      <w:pPr>
-        <w:spacing w:after="60"/>
-      </w:pPr>
-      <w:r>
-        <w:rPr>
-          <w:rFonts w:ascii="Inter" w:hAnsi="Inter"/>
-          <w:b/>
-          <w:i w:val="0"/>
-          <w:color w:val="171717"/>
-          <w:sz w:val="18"/>
-        </w:rPr>
-        <w:t xml:space="preserve">Programming &amp; API: </w:t>
-      </w:r>
-      <w:r>
-        <w:rPr>
-          <w:rFonts w:ascii="Inter" w:hAnsi="Inter"/>
-          <w:b w:val="0"/>
-          <w:i w:val="0"/>
-          <w:color w:val="525252"/>
-          <w:sz w:val="18"/>
-        </w:rPr>
-        <w:t>TypeScript, JavaScript, Java, SQL, Playwright API, REST Assured, Postman, Contract Testing, Schema Validation, Network Mocking</w:t>
-      </w:r>
-    </w:p>
-    <w:p>
-      <w:pPr>
-        <w:spacing w:after="60"/>
-      </w:pPr>
-      <w:r>
-        <w:rPr>
-          <w:rFonts w:ascii="Inter" w:hAnsi="Inter"/>
-          <w:b/>
-          <w:i w:val="0"/>
-          <w:color w:val="171717"/>
-          <w:sz w:val="18"/>
-        </w:rPr>
-        <w:t xml:space="preserve">Delivery: </w:t>
-      </w:r>
-      <w:r>
-        <w:rPr>
-          <w:rFonts w:ascii="Inter" w:hAnsi="Inter"/>
-          <w:b w:val="0"/>
-          <w:i w:val="0"/>
-          <w:color w:val="525252"/>
-          <w:sz w:val="18"/>
-        </w:rPr>
-        <w:t>GitHub Actions, Azure DevOps, Jenkins, Bamboo, Cypress Dashboard, AWS, EC2, S3, Aurora DB</w:t>
-      </w:r>
-    </w:p>
-    <w:p>
-      <w:pPr>
-        <w:spacing w:after="60"/>
-      </w:pPr>
-      <w:r>
-        <w:rPr>
-          <w:rFonts w:ascii="Inter" w:hAnsi="Inter"/>
-          <w:b/>
-          <w:i w:val="0"/>
-          <w:color w:val="171717"/>
-          <w:sz w:val="18"/>
-        </w:rPr>
-        <w:t xml:space="preserve">Data &amp; insight: </w:t>
-      </w:r>
-      <w:r>
-        <w:rPr>
-          <w:rFonts w:ascii="Inter" w:hAnsi="Inter"/>
-          <w:b w:val="0"/>
-          <w:i w:val="0"/>
-          <w:color w:val="525252"/>
-          <w:sz w:val="18"/>
-        </w:rPr>
-        <w:t>Oracle, SQL Server, MongoDB, JMeter, Datadog, Allure, Elastic Stack, Extent Reports</w:t>
-      </w:r>
-    </w:p>
-    <w:p>
-      <w:pPr>
-        <w:spacing w:after="60"/>
-      </w:pPr>
-      <w:r>
-        <w:rPr>
-          <w:rFonts w:ascii="Inter" w:hAnsi="Inter"/>
-          <w:b/>
-          <w:i w:val="0"/>
-          <w:color w:val="171717"/>
-          <w:sz w:val="18"/>
-        </w:rPr>
-        <w:t xml:space="preserve">Test frameworks: </w:t>
-      </w:r>
-      <w:r>
-        <w:rPr>
-          <w:rFonts w:ascii="Inter" w:hAnsi="Inter"/>
-          <w:b w:val="0"/>
-          <w:i w:val="0"/>
-          <w:color w:val="525252"/>
-          <w:sz w:val="18"/>
-        </w:rPr>
-        <w:t>TestNG, JUnit, Mocha, Chai, Jest, Selenium Grid, Applitools Eyes</w:t>
+        <w:t>Works directly with stakeholders to clarify requirements and acceptance criteria, evaluate technical constraints, demonstrate changes, and help teams adopt reusable tools. Hands-on experience spans React, TypeScript, JavaScript, Java, SQL, REST API validation, and CI workflows. Uses AI coding assistants for development, debugging, and refactoring.</w:t>
       </w:r>
     </w:p>
     <w:p>
@@ -285,7 +114,23 @@
           <w:color w:val="171717"/>
           <w:sz w:val="20"/>
         </w:rPr>
-        <w:t>Senior SDET / Test Automation Lead | Booz Allen Hamilton</w:t>
+        <w:t>Booz Allen Hamilton — Washington, DC</w:t>
+      </w:r>
+    </w:p>
+    <w:p>
+      <w:pPr>
+        <w:keepNext/>
+        <w:spacing w:after="20"/>
+      </w:pPr>
+      <w:r>
+        <w:rPr>
+          <w:rFonts w:ascii="Inter" w:hAnsi="Inter"/>
+          <w:b/>
+          <w:i w:val="0"/>
+          <w:color w:val="171717"/>
+          <w:sz w:val="19"/>
+        </w:rPr>
+        <w:t>QA Test Engineer</w:t>
       </w:r>
       <w:r>
         <w:rPr>
@@ -295,7 +140,22 @@
           <w:color w:val="525252"/>
           <w:sz w:val="16"/>
         </w:rPr>
-        <w:t xml:space="preserve">  |  2020-12 - Present</w:t>
+        <w:t xml:space="preserve">  |  Dec 2020 – Present</w:t>
+      </w:r>
+    </w:p>
+    <w:p>
+      <w:pPr>
+        <w:spacing w:after="100" w:line="269" w:lineRule="auto"/>
+      </w:pPr>
+      <w:r>
+        <w:rPr>
+          <w:rFonts w:ascii="Inter" w:hAnsi="Inter"/>
+          <w:b w:val="0"/>
+          <w:i w:val="0"/>
+          <w:color w:val="171717"/>
+          <w:sz w:val="18"/>
+        </w:rPr>
+        <w:t>Customer: U.S. Department of Veterans Affairs (VA)</w:t>
       </w:r>
     </w:p>
     <w:p>
@@ -310,7 +170,7 @@
           <w:color w:val="525252"/>
           <w:sz w:val="18"/>
         </w:rPr>
-        <w:t>Hands-on automation engineering and technical leadership in federal delivery environments, guiding framework direction while improving the quality signals teams use to make release decisions.</w:t>
+        <w:t>Contribute to a VA healthcare claims platform with two frontends sharing a database, supporting claim submission, provider updates, claim progress and status tracking, and payment visibility.</w:t>
       </w:r>
     </w:p>
     <w:p>
@@ -327,7 +187,7 @@
           <w:color w:val="171717"/>
           <w:sz w:val="18"/>
         </w:rPr>
-        <w:t>Led a team of five automation engineers, establishing scalable test strategies, resource planning, and automation standards.</w:t>
+        <w:t>Work directly with VA stakeholders to map healthcare claims workflows, clarify technical and operational constraints, and define requirements and acceptance criteria for application and tooling changes.</w:t>
       </w:r>
     </w:p>
     <w:p>
@@ -344,7 +204,7 @@
           <w:color w:val="171717"/>
           <w:sz w:val="18"/>
         </w:rPr>
-        <w:t>Designed Cypress and Playwright frameworks for UI and API testing with resilient asynchronous handling, retry logic, and robust assertions.</w:t>
+        <w:t>Independently built and continue to enhance Data Generator &amp; File Processing, enabling QA users to generate, edit, and upload hundreds of referrals in minutes to VA lower environments.</w:t>
       </w:r>
     </w:p>
     <w:p>
@@ -361,7 +221,7 @@
           <w:color w:val="171717"/>
           <w:sz w:val="18"/>
         </w:rPr>
-        <w:t>Built GitHub Actions pipelines that distributed Cypress Dashboard and Playwright workloads across multiple virtual machines, managed artifacts, and provisioned environments dynamically for faster, diagnosable feedback.</w:t>
+        <w:t>Contribute frontend features using React, JavaScript, and TypeScript; translate stakeholder feedback into application improvements supporting claim submission, provider updates, and status visibility.</w:t>
       </w:r>
     </w:p>
     <w:p>
@@ -378,7 +238,7 @@
           <w:color w:val="171717"/>
           <w:sz w:val="18"/>
         </w:rPr>
-        <w:t>Used AWS EC2, Aurora DB, and S3 to support on-demand test environments and scalable test execution.</w:t>
+        <w:t>Implement referral-data uploads into VA lower environments and use MySQL to investigate discrepancies between application behavior and stored data across frontend and backend workflows.</w:t>
       </w:r>
     </w:p>
     <w:p>
@@ -395,7 +255,7 @@
           <w:color w:val="171717"/>
           <w:sz w:val="18"/>
         </w:rPr>
-        <w:t>Implemented automated defect triage through Jira API integration and risk-based failure prioritization.</w:t>
+        <w:t>Demonstrate application, file-processing, and automation enhancements to stakeholders, gather feedback on daily workflows, and refine implementations around user needs.</w:t>
       </w:r>
     </w:p>
     <w:p>
@@ -412,7 +272,7 @@
           <w:color w:val="171717"/>
           <w:sz w:val="18"/>
         </w:rPr>
-        <w:t>Created test dashboards with Allure and Elastic Stack for trend analysis, failure-pattern recognition, and anomaly detection.</w:t>
+        <w:t>Evaluated alternatives to legacy automation and helped select Playwright, weighing maintainability, reusable components, authentication requirements, and restricted environment access.</w:t>
       </w:r>
     </w:p>
     <w:p>
@@ -429,7 +289,7 @@
           <w:color w:val="171717"/>
           <w:sz w:val="18"/>
         </w:rPr>
-        <w:t>Balanced parallel workloads using suite composition and observed execution time, then tracked worker timing, retries, failure categories, artifact completeness, and environment health.</w:t>
+        <w:t>Develop a reusable Playwright smoke and regression framework and use GitHub Actions in development and testing workflows; investigate Microsoft Entra ID and environment dependencies affecting execution.</w:t>
       </w:r>
     </w:p>
     <w:p>
@@ -446,7 +306,7 @@
           <w:color w:val="171717"/>
           <w:sz w:val="18"/>
         </w:rPr>
-        <w:t>Developed data-provisioning utilities using JSON, Excel with Apache POI, and SQL-driven injection for mock responses and contract testing.</w:t>
+        <w:t>Maintain Data Generator &amp; File Processing for daily QA use, troubleshoot issues, and adapt functionality as testing needs change; document single and bulk referral uploads and framework usage to help teammates adopt and extend the tools.</w:t>
       </w:r>
     </w:p>
     <w:p>
@@ -463,48 +323,7 @@
           <w:color w:val="171717"/>
           <w:sz w:val="18"/>
         </w:rPr>
-        <w:t>Configured Selenium Grid for parallel cross-browser testing and JMeter performance benchmarks.</w:t>
-      </w:r>
-    </w:p>
-    <w:p>
-      <w:pPr>
-        <w:keepNext/>
-        <w:spacing w:before="140" w:after="0"/>
-      </w:pPr>
-      <w:r>
-        <w:rPr>
-          <w:rFonts w:ascii="Inter" w:hAnsi="Inter"/>
-          <w:b/>
-          <w:i w:val="0"/>
-          <w:color w:val="171717"/>
-          <w:sz w:val="20"/>
-        </w:rPr>
-        <w:t>Software Engineer in Test | Chick-fil-A Corporate</w:t>
-      </w:r>
-      <w:r>
-        <w:rPr>
-          <w:rFonts w:ascii="Inter" w:hAnsi="Inter"/>
-          <w:b w:val="0"/>
-          <w:i w:val="0"/>
-          <w:color w:val="525252"/>
-          <w:sz w:val="16"/>
-        </w:rPr>
-        <w:t xml:space="preserve">  |  2018-11 - 2020-12</w:t>
-      </w:r>
-    </w:p>
-    <w:p>
-      <w:pPr>
-        <w:spacing w:after="100" w:line="269" w:lineRule="auto"/>
-      </w:pPr>
-      <w:r>
-        <w:rPr>
-          <w:rFonts w:ascii="Inter" w:hAnsi="Inter"/>
-          <w:b w:val="0"/>
-          <w:i/>
-          <w:color w:val="525252"/>
-          <w:sz w:val="18"/>
-        </w:rPr>
-        <w:t>Moved quality feedback earlier in the delivery lifecycle by connecting browser, API, visual, authentication, cloud-environment, and CI concerns into maintainable test systems.</w:t>
+        <w:t>Coordinate with VA stakeholders and developers to investigate defects and resolve delivery dependencies; document progress, blockers, and operational impact in Jira.</w:t>
       </w:r>
     </w:p>
     <w:p>
@@ -521,7 +340,85 @@
           <w:color w:val="171717"/>
           <w:sz w:val="18"/>
         </w:rPr>
-        <w:t>Architected GitHub Actions pipelines integrating Cypress Dashboard and AWS for automated execution and rapid feedback.</w:t>
+        <w:t>Use GitHub Copilot in VS Code for application development, debugging, refactoring, and test creation; use Gemini, GPT models, and Claude in broader development work to explore implementation approaches.</w:t>
+      </w:r>
+    </w:p>
+    <w:p>
+      <w:r>
+        <w:br w:type="page"/>
+      </w:r>
+    </w:p>
+    <w:p>
+      <w:pPr>
+        <w:keepNext/>
+        <w:spacing w:before="200" w:after="80"/>
+      </w:pPr>
+      <w:r>
+        <w:rPr>
+          <w:rFonts w:ascii="Inter" w:hAnsi="Inter"/>
+          <w:b/>
+          <w:i w:val="0"/>
+          <w:color w:val="1447E6"/>
+          <w:sz w:val="24"/>
+        </w:rPr>
+        <w:t>Professional experience continued</w:t>
+      </w:r>
+    </w:p>
+    <w:p>
+      <w:pPr>
+        <w:keepNext/>
+        <w:spacing w:before="140" w:after="0"/>
+      </w:pPr>
+      <w:r>
+        <w:rPr>
+          <w:rFonts w:ascii="Inter" w:hAnsi="Inter"/>
+          <w:b/>
+          <w:i w:val="0"/>
+          <w:color w:val="171717"/>
+          <w:sz w:val="20"/>
+        </w:rPr>
+        <w:t>Chick-fil-A Corporate — Atlanta, GA</w:t>
+      </w:r>
+    </w:p>
+    <w:p>
+      <w:pPr>
+        <w:keepNext/>
+        <w:spacing w:after="20"/>
+      </w:pPr>
+      <w:r>
+        <w:rPr>
+          <w:rFonts w:ascii="Inter" w:hAnsi="Inter"/>
+          <w:b/>
+          <w:i w:val="0"/>
+          <w:color w:val="171717"/>
+          <w:sz w:val="19"/>
+        </w:rPr>
+        <w:t>Software Engineer in Test</w:t>
+      </w:r>
+      <w:r>
+        <w:rPr>
+          <w:rFonts w:ascii="Inter" w:hAnsi="Inter"/>
+          <w:b w:val="0"/>
+          <w:i w:val="0"/>
+          <w:color w:val="525252"/>
+          <w:sz w:val="16"/>
+        </w:rPr>
+        <w:t xml:space="preserve">  |  Nov 2018 – Dec 2020</w:t>
+      </w:r>
+    </w:p>
+    <w:p>
+      <w:pPr>
+        <w:spacing w:after="100" w:line="269" w:lineRule="auto"/>
+      </w:pPr>
+      <w:r>
+        <w:rPr>
+          <w:rFonts w:ascii="Inter" w:hAnsi="Inter"/>
+          <w:b w:val="0"/>
+          <w:i/>
+          <w:color w:val="525252"/>
+          <w:sz w:val="18"/>
+        </w:rPr>
+        <w:t>Supported application delivery by connecting user workflows, REST APIs, authentication, and AWS test environments through reusable engineering tools and actionable troubleshooting evidence.</w:t>
       </w:r>
     </w:p>
     <w:p>
@@ -538,7 +435,7 @@
           <w:color w:val="171717"/>
           <w:sz w:val="18"/>
         </w:rPr>
-        <w:t>Designed modular smoke and regression suites with JavaScript, Cypress, and Mocha, including flaky-test mitigation.</w:t>
+        <w:t>Built reusable JavaScript and Cypress tooling around application workflows, translating expected behavior into repeatable checks that supported implementation and release decisions.</w:t>
       </w:r>
     </w:p>
     <w:p>
@@ -555,7 +452,7 @@
           <w:color w:val="171717"/>
           <w:sz w:val="18"/>
         </w:rPr>
-        <w:t>Integrated Applitools Eyes visual regression testing across multiple resolutions, devices, and browsers.</w:t>
+        <w:t>Investigated application-to-service integration through Cypress and Postman REST API checks, validating schemas, service contracts, and data-dependent behavior to surface discrepancies.</w:t>
       </w:r>
     </w:p>
     <w:p>
@@ -572,7 +469,7 @@
           <w:color w:val="171717"/>
           <w:sz w:val="18"/>
         </w:rPr>
-        <w:t>Developed Cypress and Postman API suites with contract testing, schema validation, and dynamic data-driven assertions.</w:t>
+        <w:t>Validated OIDC, Okta MFA, and SSO workflows, troubleshooting authentication behavior across application scenarios and capturing evidence for failure investigation.</w:t>
       </w:r>
     </w:p>
     <w:p>
@@ -589,7 +486,7 @@
           <w:color w:val="171717"/>
           <w:sz w:val="18"/>
         </w:rPr>
-        <w:t>Implemented OIDC and Okta MFA automation in Cypress for SSO-based applications.</w:t>
+        <w:t>Connected GitHub Actions, Cypress Dashboard, and AWS test environments into repeatable delivery workflows, making execution results and diagnostic artifacts available to engineering teams.</w:t>
       </w:r>
     </w:p>
     <w:p>
@@ -606,7 +503,7 @@
           <w:color w:val="171717"/>
           <w:sz w:val="18"/>
         </w:rPr>
-        <w:t>Managed AWS EC2, Aurora DB, and S3 resources with AWS CLI to support scalable test environments.</w:t>
+        <w:t>Used AWS EC2, S3, and Aurora resources to support test environments; combined network stubbing, headless testing, and parallel execution to isolate dependencies and reproduce scenarios.</w:t>
       </w:r>
     </w:p>
     <w:p>
@@ -623,7 +520,64 @@
           <w:color w:val="171717"/>
           <w:sz w:val="18"/>
         </w:rPr>
-        <w:t>Applied parallel execution, network stubbing, and headless testing to reduce test run time while maintaining accuracy.</w:t>
+        <w:t>Investigated user-facing issues across browsers, devices, and resolutions with Applitools Eyes and Cypress evidence, using screenshots, videos, retries, and run durations to trace failures.</w:t>
+      </w:r>
+    </w:p>
+    <w:p>
+      <w:pPr>
+        <w:keepNext/>
+        <w:spacing w:before="140" w:after="0"/>
+      </w:pPr>
+      <w:r>
+        <w:rPr>
+          <w:rFonts w:ascii="Inter" w:hAnsi="Inter"/>
+          <w:b/>
+          <w:i w:val="0"/>
+          <w:color w:val="171717"/>
+          <w:sz w:val="20"/>
+        </w:rPr>
+        <w:t>Ally Bank — Sandy, UT</w:t>
+      </w:r>
+    </w:p>
+    <w:p>
+      <w:pPr>
+        <w:keepNext/>
+        <w:spacing w:after="20"/>
+      </w:pPr>
+      <w:r>
+        <w:rPr>
+          <w:rFonts w:ascii="Inter" w:hAnsi="Inter"/>
+          <w:b/>
+          <w:i w:val="0"/>
+          <w:color w:val="171717"/>
+          <w:sz w:val="19"/>
+        </w:rPr>
+        <w:t>Software QA Engineer</w:t>
+      </w:r>
+      <w:r>
+        <w:rPr>
+          <w:rFonts w:ascii="Inter" w:hAnsi="Inter"/>
+          <w:b w:val="0"/>
+          <w:i w:val="0"/>
+          <w:color w:val="525252"/>
+          <w:sz w:val="16"/>
+        </w:rPr>
+        <w:t xml:space="preserve">  |  Sep 2015 – Nov 2018</w:t>
+      </w:r>
+    </w:p>
+    <w:p>
+      <w:pPr>
+        <w:spacing w:after="100" w:line="269" w:lineRule="auto"/>
+      </w:pPr>
+      <w:r>
+        <w:rPr>
+          <w:rFonts w:ascii="Inter" w:hAnsi="Inter"/>
+          <w:b w:val="0"/>
+          <w:i/>
+          <w:color w:val="525252"/>
+          <w:sz w:val="18"/>
+        </w:rPr>
+        <w:t>Partnered with developers, analysts, and product owners to turn banking requirements into traceable validation and release-readiness evidence.</w:t>
       </w:r>
     </w:p>
     <w:p>
@@ -640,48 +594,7 @@
           <w:color w:val="171717"/>
           <w:sz w:val="18"/>
         </w:rPr>
-        <w:t>Used Cypress Dashboard duration, failure, retry, video, and screenshot evidence to diagnose bottlenecks and tune parallel execution.</w:t>
-      </w:r>
-    </w:p>
-    <w:p>
-      <w:pPr>
-        <w:keepNext/>
-        <w:spacing w:before="140" w:after="0"/>
-      </w:pPr>
-      <w:r>
-        <w:rPr>
-          <w:rFonts w:ascii="Inter" w:hAnsi="Inter"/>
-          <w:b/>
-          <w:i w:val="0"/>
-          <w:color w:val="171717"/>
-          <w:sz w:val="20"/>
-        </w:rPr>
-        <w:t>Software QA Engineer | Ally Bank</w:t>
-      </w:r>
-      <w:r>
-        <w:rPr>
-          <w:rFonts w:ascii="Inter" w:hAnsi="Inter"/>
-          <w:b w:val="0"/>
-          <w:i w:val="0"/>
-          <w:color w:val="525252"/>
-          <w:sz w:val="16"/>
-        </w:rPr>
-        <w:t xml:space="preserve">  |  2015-09 - 2018-11</w:t>
-      </w:r>
-    </w:p>
-    <w:p>
-      <w:pPr>
-        <w:spacing w:after="100" w:line="269" w:lineRule="auto"/>
-      </w:pPr>
-      <w:r>
-        <w:rPr>
-          <w:rFonts w:ascii="Inter" w:hAnsi="Inter"/>
-          <w:b w:val="0"/>
-          <w:i/>
-          <w:color w:val="525252"/>
-          <w:sz w:val="18"/>
-        </w:rPr>
-        <w:t>Built a foundation in risk-based testing, cross-browser investigation, clear defect communication, and release validation across complex banking experiences.</w:t>
+        <w:t>Translated business and functional requirements into test plans, acceptance criteria, and traceable scenarios with developers, analysts, and product owners.</w:t>
       </w:r>
     </w:p>
     <w:p>
@@ -698,7 +611,7 @@
           <w:color w:val="171717"/>
           <w:sz w:val="18"/>
         </w:rPr>
-        <w:t>Performed exploratory, functional, and regression testing of web applications across multiple platforms.</w:t>
+        <w:t>Performed exploratory, functional, and regression testing of banking web applications, investigating behavior across customer workflows and platforms.</w:t>
       </w:r>
     </w:p>
     <w:p>
@@ -715,7 +628,7 @@
           <w:color w:val="171717"/>
           <w:sz w:val="18"/>
         </w:rPr>
-        <w:t>Created test plans, test cases, and acceptance criteria aligned with business and functional requirements.</w:t>
+        <w:t>Validated responsive and cross-browser behavior across Chrome, Firefox, Safari, and Edge to identify inconsistent user experiences.</w:t>
       </w:r>
     </w:p>
     <w:p>
@@ -732,7 +645,7 @@
           <w:color w:val="171717"/>
           <w:sz w:val="18"/>
         </w:rPr>
-        <w:t>Executed cross-browser and responsive UI testing on Chrome, Firefox, Safari, and Edge.</w:t>
+        <w:t>Created reproducible Jira defect reports with environment details and business impact; collaborated with developers to investigate causes and verify fixes.</w:t>
       </w:r>
     </w:p>
     <w:p>
@@ -749,7 +662,7 @@
           <w:color w:val="171717"/>
           <w:sz w:val="18"/>
         </w:rPr>
-        <w:t>Turned defects into decision-ready evidence in Jira by documenting reproduction paths, business impact, environment details, and verified fixes.</w:t>
+        <w:t>Used SQL data checks alongside application validation to investigate discrepancies and verify expected results.</w:t>
       </w:r>
     </w:p>
     <w:p>
@@ -766,41 +679,7 @@
           <w:color w:val="171717"/>
           <w:sz w:val="18"/>
         </w:rPr>
-        <w:t>Ran smoke, regression, and sanity testing across development, QA, UAT, and staging environments.</w:t>
-      </w:r>
-    </w:p>
-    <w:p>
-      <w:pPr>
-        <w:pStyle w:val="ListBullet"/>
-        <w:spacing w:after="64" w:line="259" w:lineRule="auto"/>
-        <w:ind w:left="317" w:hanging="173"/>
-      </w:pPr>
-      <w:r>
-        <w:rPr>
-          <w:rFonts w:ascii="Inter" w:hAnsi="Inter"/>
-          <w:b w:val="0"/>
-          <w:i w:val="0"/>
-          <w:color w:val="171717"/>
-          <w:sz w:val="18"/>
-        </w:rPr>
-        <w:t>Connected UI behavior, SQL data checks, pre- and post-deployment validation, hotfix verification, and production monitoring across the customer path.</w:t>
-      </w:r>
-    </w:p>
-    <w:p>
-      <w:pPr>
-        <w:pStyle w:val="ListBullet"/>
-        <w:spacing w:after="64" w:line="259" w:lineRule="auto"/>
-        <w:ind w:left="317" w:hanging="173"/>
-      </w:pPr>
-      <w:r>
-        <w:rPr>
-          <w:rFonts w:ascii="Inter" w:hAnsi="Inter"/>
-          <w:b w:val="0"/>
-          <w:i w:val="0"/>
-          <w:color w:val="171717"/>
-          <w:sz w:val="18"/>
-        </w:rPr>
-        <w:t>Built traceable coverage across business requirements, platforms, browsers, environments, and high-risk customer scenarios.</w:t>
+        <w:t>Supported smoke, regression, and sanity checks across development, QA, UAT, and staging environments, including deployment checks and hotfix verification.</w:t>
       </w:r>
     </w:p>
     <w:p>
@@ -816,7 +695,7 @@
           <w:color w:val="1447E6"/>
           <w:sz w:val="24"/>
         </w:rPr>
-        <w:t>Portfolio system</w:t>
+        <w:t>Selected project</w:t>
       </w:r>
     </w:p>
     <w:p>
@@ -831,75 +710,7 @@
           <w:color w:val="171717"/>
           <w:sz w:val="18"/>
         </w:rPr>
-        <w:t>A schema-validated React and Vite platform that keeps the website portfolio, browser resume, and generated PDF and DOCX outputs aligned through one validated professional data source.</w:t>
-      </w:r>
-    </w:p>
-    <w:p>
-      <w:pPr>
-        <w:pStyle w:val="ListBullet"/>
-        <w:spacing w:after="64" w:line="259" w:lineRule="auto"/>
-        <w:ind w:left="317" w:hanging="173"/>
-      </w:pPr>
-      <w:r>
-        <w:rPr>
-          <w:rFonts w:ascii="Inter" w:hAnsi="Inter"/>
-          <w:b w:val="0"/>
-          <w:i w:val="0"/>
-          <w:color w:val="171717"/>
-          <w:sz w:val="18"/>
-        </w:rPr>
-        <w:t>Designed one structured content architecture for every career presentation channel.</w:t>
-      </w:r>
-    </w:p>
-    <w:p>
-      <w:pPr>
-        <w:pStyle w:val="ListBullet"/>
-        <w:spacing w:after="64" w:line="259" w:lineRule="auto"/>
-        <w:ind w:left="317" w:hanging="173"/>
-      </w:pPr>
-      <w:r>
-        <w:rPr>
-          <w:rFonts w:ascii="Inter" w:hAnsi="Inter"/>
-          <w:b w:val="0"/>
-          <w:i w:val="0"/>
-          <w:color w:val="171717"/>
-          <w:sz w:val="18"/>
-        </w:rPr>
-        <w:t>Redesigned the website with free Untitled UI React components while preserving static content and accessible navigation.</w:t>
-      </w:r>
-    </w:p>
-    <w:p>
-      <w:pPr>
-        <w:pStyle w:val="ListBullet"/>
-        <w:spacing w:after="64" w:line="259" w:lineRule="auto"/>
-        <w:ind w:left="317" w:hanging="173"/>
-      </w:pPr>
-      <w:r>
-        <w:rPr>
-          <w:rFonts w:ascii="Inter" w:hAnsi="Inter"/>
-          <w:b w:val="0"/>
-          <w:i w:val="0"/>
-          <w:color w:val="171717"/>
-          <w:sz w:val="18"/>
-        </w:rPr>
-        <w:t>Added strict diagnostics, production builds, subpath packaging checks, and continuous deployment.</w:t>
-      </w:r>
-    </w:p>
-    <w:p>
-      <w:pPr>
-        <w:pStyle w:val="ListBullet"/>
-        <w:spacing w:after="64" w:line="259" w:lineRule="auto"/>
-        <w:ind w:left="317" w:hanging="173"/>
-      </w:pPr>
-      <w:r>
-        <w:rPr>
-          <w:rFonts w:ascii="Inter" w:hAnsi="Inter"/>
-          <w:b w:val="0"/>
-          <w:i w:val="0"/>
-          <w:color w:val="171717"/>
-          <w:sz w:val="18"/>
-        </w:rPr>
-        <w:t>Prepared separate PDF and DOCX presentation contracts without duplicating career facts.</w:t>
+        <w:t>Portfolio &amp; Career Content System: Built a React/Untitled UI portfolio from validated JSON, with shared PDF/Word generation and static deployment packaging for Cloudflare. mohamedmoheyeldin.com</w:t>
       </w:r>
     </w:p>
     <w:p>
@@ -915,7 +726,7 @@
           <w:color w:val="1447E6"/>
           <w:sz w:val="24"/>
         </w:rPr>
-        <w:t>Education &amp; credentials</w:t>
+        <w:t>Technical skills</w:t>
       </w:r>
     </w:p>
     <w:p>
@@ -930,14 +741,12 @@
           <w:color w:val="171717"/>
           <w:sz w:val="18"/>
         </w:rPr>
-        <w:t>Bachelor's degree in Computer Science | American College of Commerce and Technology | 2014</w:t>
+        <w:t>Application development: React, TypeScript, JavaScript, Java, Reusable components</w:t>
       </w:r>
     </w:p>
     <w:p>
       <w:pPr>
-        <w:pStyle w:val="ListBullet"/>
-        <w:spacing w:after="64" w:line="259" w:lineRule="auto"/>
-        <w:ind w:left="317" w:hanging="173"/>
+        <w:spacing w:after="100" w:line="269" w:lineRule="auto"/>
       </w:pPr>
       <w:r>
         <w:rPr>
@@ -947,14 +756,12 @@
           <w:color w:val="171717"/>
           <w:sz w:val="18"/>
         </w:rPr>
-        <w:t>Cucumber BDD Automation Framework</w:t>
+        <w:t>Data and integration: SQL, MySQL, JSON, REST APIs, Postman, SQL Server, Oracle, MongoDB</w:t>
       </w:r>
     </w:p>
     <w:p>
       <w:pPr>
-        <w:pStyle w:val="ListBullet"/>
-        <w:spacing w:after="64" w:line="259" w:lineRule="auto"/>
-        <w:ind w:left="317" w:hanging="173"/>
+        <w:spacing w:after="100" w:line="269" w:lineRule="auto"/>
       </w:pPr>
       <w:r>
         <w:rPr>
@@ -964,14 +771,12 @@
           <w:color w:val="171717"/>
           <w:sz w:val="18"/>
         </w:rPr>
-        <w:t>Implementing SAFe Course (5.1) · Scaled Agile, Inc. · 2021</w:t>
+        <w:t>Delivery and quality: Playwright, Cypress, GitHub Actions, Git, Jira, Jenkins, AWS EC2/S3/Aurora test environments</w:t>
       </w:r>
     </w:p>
     <w:p>
       <w:pPr>
-        <w:pStyle w:val="ListBullet"/>
-        <w:spacing w:after="64" w:line="259" w:lineRule="auto"/>
-        <w:ind w:left="317" w:hanging="173"/>
+        <w:spacing w:after="100" w:line="269" w:lineRule="auto"/>
       </w:pPr>
       <w:r>
         <w:rPr>
@@ -981,7 +786,84 @@
           <w:color w:val="171717"/>
           <w:sz w:val="18"/>
         </w:rPr>
-        <w:t>Leading SAFe 4.0 Course · Scaled Agile, Inc. · 2016</w:t>
+        <w:t>AI-assisted engineering: GitHub Copilot, VS Code, GPT models, Claude, Gemini</w:t>
+      </w:r>
+    </w:p>
+    <w:p>
+      <w:pPr>
+        <w:keepNext/>
+        <w:spacing w:before="200" w:after="80"/>
+      </w:pPr>
+      <w:r>
+        <w:rPr>
+          <w:rFonts w:ascii="Inter" w:hAnsi="Inter"/>
+          <w:b/>
+          <w:i w:val="0"/>
+          <w:color w:val="1447E6"/>
+          <w:sz w:val="24"/>
+        </w:rPr>
+        <w:t xml:space="preserve">Education </w:t>
+      </w:r>
+    </w:p>
+    <w:p>
+      <w:pPr>
+        <w:spacing w:after="100" w:line="269" w:lineRule="auto"/>
+      </w:pPr>
+      <w:r>
+        <w:rPr>
+          <w:rFonts w:ascii="Inter" w:hAnsi="Inter"/>
+          <w:b w:val="0"/>
+          <w:i w:val="0"/>
+          <w:color w:val="171717"/>
+          <w:sz w:val="18"/>
+        </w:rPr>
+        <w:t>Bachelor's degree in Computer Science | American College of Commerce and Technology | May 2014</w:t>
+      </w:r>
+    </w:p>
+    <w:p>
+      <w:pPr>
+        <w:keepNext/>
+        <w:spacing w:before="200" w:after="80"/>
+      </w:pPr>
+      <w:r>
+        <w:rPr>
+          <w:rFonts w:ascii="Inter" w:hAnsi="Inter"/>
+          <w:b/>
+          <w:i w:val="0"/>
+          <w:color w:val="1447E6"/>
+          <w:sz w:val="24"/>
+        </w:rPr>
+        <w:t>Professional development</w:t>
+      </w:r>
+    </w:p>
+    <w:p>
+      <w:pPr>
+        <w:spacing w:after="100" w:line="269" w:lineRule="auto"/>
+      </w:pPr>
+      <w:r>
+        <w:rPr>
+          <w:rFonts w:ascii="Inter" w:hAnsi="Inter"/>
+          <w:b w:val="0"/>
+          <w:i w:val="0"/>
+          <w:color w:val="171717"/>
+          <w:sz w:val="18"/>
+        </w:rPr>
+        <w:t>Implementing SAFe 5.1 course completion, 2021 (historical course completion)</w:t>
+      </w:r>
+    </w:p>
+    <w:p>
+      <w:pPr>
+        <w:spacing w:after="100" w:line="269" w:lineRule="auto"/>
+      </w:pPr>
+      <w:r>
+        <w:rPr>
+          <w:rFonts w:ascii="Inter" w:hAnsi="Inter"/>
+          <w:b w:val="0"/>
+          <w:i w:val="0"/>
+          <w:color w:val="171717"/>
+          <w:sz w:val="18"/>
+        </w:rPr>
+        <w:t>Leading SAFe 4.0 course completion, 2016 (historical course completion)</w:t>
       </w:r>
     </w:p>
     <w:sectPr>

</xml_diff>

<commit_message>
Finalize portfolio presentation and synchronized resume downloads
</commit_message>
<xml_diff>
--- a/public/resume/mohamed-moheyeldin-resume-detailed.docx
+++ b/public/resume/mohamed-moheyeldin-resume-detailed.docx
@@ -6,7 +6,7 @@
       <w:pPr>
         <w:pStyle w:val="Title"/>
         <w:spacing w:after="20"/>
-        <w:jc w:val="left"/>
+        <w:jc w:val="center"/>
       </w:pPr>
       <w:r>
         <w:rPr>
@@ -22,7 +22,7 @@
     <w:p>
       <w:pPr>
         <w:spacing w:after="100"/>
-        <w:jc w:val="left"/>
+        <w:jc w:val="center"/>
       </w:pPr>
       <w:r>
         <w:rPr>
@@ -435,7 +435,7 @@
           <w:color w:val="171717"/>
           <w:sz w:val="18"/>
         </w:rPr>
-        <w:t>Built reusable JavaScript and Cypress tooling around application workflows, translating expected behavior into repeatable checks that supported implementation and release decisions.</w:t>
+        <w:t>Built reusable JavaScript browser automation around application workflows, translating expected behavior into repeatable checks that supported implementation and release decisions.</w:t>
       </w:r>
     </w:p>
     <w:p>
@@ -452,7 +452,7 @@
           <w:color w:val="171717"/>
           <w:sz w:val="18"/>
         </w:rPr>
-        <w:t>Investigated application-to-service integration through Cypress and Postman REST API checks, validating schemas, service contracts, and data-dependent behavior to surface discrepancies.</w:t>
+        <w:t>Investigated application-to-service integration through browser automation and Postman REST API checks, validating schemas, service contracts, and data-dependent behavior to surface discrepancies.</w:t>
       </w:r>
     </w:p>
     <w:p>
@@ -486,7 +486,7 @@
           <w:color w:val="171717"/>
           <w:sz w:val="18"/>
         </w:rPr>
-        <w:t>Connected GitHub Actions, Cypress Dashboard, and AWS test environments into repeatable delivery workflows, making execution results and diagnostic artifacts available to engineering teams.</w:t>
+        <w:t>Connected GitHub Actions and AWS test environments into repeatable delivery workflows, making execution results and diagnostic artifacts available to engineering teams.</w:t>
       </w:r>
     </w:p>
     <w:p>
@@ -520,7 +520,7 @@
           <w:color w:val="171717"/>
           <w:sz w:val="18"/>
         </w:rPr>
-        <w:t>Investigated user-facing issues across browsers, devices, and resolutions with Applitools Eyes and Cypress evidence, using screenshots, videos, retries, and run durations to trace failures.</w:t>
+        <w:t>Investigated user-facing issues across browsers, devices, and resolutions with Applitools Eyes and browser automation evidence, using screenshots, videos, retries, and run durations to trace failures.</w:t>
       </w:r>
     </w:p>
     <w:p>
@@ -771,7 +771,7 @@
           <w:color w:val="171717"/>
           <w:sz w:val="18"/>
         </w:rPr>
-        <w:t>Delivery and quality: Playwright, Cypress, GitHub Actions, Git, Jira, Jenkins, AWS EC2/S3/Aurora test environments</w:t>
+        <w:t>Delivery and quality: Playwright, GitHub Actions, Git, Jira, Jenkins, AWS EC2/S3/Aurora test environments</w:t>
       </w:r>
     </w:p>
     <w:p>

</xml_diff>

<commit_message>
Correct Booz Allen FDE title and add OpenAI Academy credential
</commit_message>
<xml_diff>
--- a/public/resume/mohamed-moheyeldin-resume-detailed.docx
+++ b/public/resume/mohamed-moheyeldin-resume-detailed.docx
@@ -130,7 +130,7 @@
           <w:color w:val="171717"/>
           <w:sz w:val="19"/>
         </w:rPr>
-        <w:t>QA Test Engineer</w:t>
+        <w:t>Forward Deployed Engineer (FDE)</w:t>
       </w:r>
       <w:r>
         <w:rPr>
@@ -848,6 +848,21 @@
           <w:color w:val="171717"/>
           <w:sz w:val="18"/>
         </w:rPr>
+        <w:t>AI Foundations | OpenAI Academy | Issued October 2, 2026</w:t>
+      </w:r>
+    </w:p>
+    <w:p>
+      <w:pPr>
+        <w:spacing w:after="100" w:line="269" w:lineRule="auto"/>
+      </w:pPr>
+      <w:r>
+        <w:rPr>
+          <w:rFonts w:ascii="Inter" w:hAnsi="Inter"/>
+          <w:b w:val="0"/>
+          <w:i w:val="0"/>
+          <w:color w:val="171717"/>
+          <w:sz w:val="18"/>
+        </w:rPr>
         <w:t>Implementing SAFe 5.1 course completion, 2021 (historical course completion)</w:t>
       </w:r>
     </w:p>

</xml_diff>

<commit_message>
Add all five OpenAI Academy credentials and linked resume exports
</commit_message>
<xml_diff>
--- a/public/resume/mohamed-moheyeldin-resume-detailed.docx
+++ b/public/resume/mohamed-moheyeldin-resume-detailed.docx
@@ -848,13 +848,131 @@
           <w:color w:val="171717"/>
           <w:sz w:val="18"/>
         </w:rPr>
-        <w:t>AI Foundations | OpenAI Academy | Issued October 2, 2026</w:t>
       </w:r>
+      <w:r>
+        <w:rPr>
+          <w:rFonts w:ascii="Inter" w:hAnsi="Inter"/>
+          <w:b w:val="0"/>
+          <w:i w:val="0"/>
+          <w:color w:val="171717"/>
+          <w:sz w:val="18"/>
+        </w:rPr>
+        <w:t xml:space="preserve">OpenAI Academy | Issued October 2, 2026 | Expires April 2, 2027: </w:t>
+      </w:r>
+      <w:hyperlink r:id="rId9">
+        <w:r>
+          <w:rPr>
+            <w:rFonts w:ascii="Inter" w:hAnsi="Inter"/>
+            <w:b w:val="0"/>
+            <w:i w:val="0"/>
+            <w:color w:val="1447E6"/>
+            <w:sz w:val="18"/>
+          </w:rPr>
+          <w:t>AI Foundations</w:t>
+        </w:r>
+      </w:hyperlink>
+      <w:r>
+        <w:rPr>
+          <w:rFonts w:ascii="Inter" w:hAnsi="Inter"/>
+          <w:b w:val="0"/>
+          <w:i w:val="0"/>
+          <w:color w:val="171717"/>
+          <w:sz w:val="18"/>
+        </w:rPr>
+        <w:t xml:space="preserve">; </w:t>
+      </w:r>
+      <w:hyperlink r:id="rId10">
+        <w:r>
+          <w:rPr>
+            <w:rFonts w:ascii="Inter" w:hAnsi="Inter"/>
+            <w:b w:val="0"/>
+            <w:i w:val="0"/>
+            <w:color w:val="1447E6"/>
+            <w:sz w:val="18"/>
+          </w:rPr>
+          <w:t>Agents and Workflows</w:t>
+        </w:r>
+      </w:hyperlink>
+      <w:r>
+        <w:rPr>
+          <w:rFonts w:ascii="Inter" w:hAnsi="Inter"/>
+          <w:b w:val="0"/>
+          <w:i w:val="0"/>
+          <w:color w:val="171717"/>
+          <w:sz w:val="18"/>
+        </w:rPr>
+        <w:t xml:space="preserve">; </w:t>
+      </w:r>
+      <w:hyperlink r:id="rId11">
+        <w:r>
+          <w:rPr>
+            <w:rFonts w:ascii="Inter" w:hAnsi="Inter"/>
+            <w:b w:val="0"/>
+            <w:i w:val="0"/>
+            <w:color w:val="1447E6"/>
+            <w:sz w:val="18"/>
+          </w:rPr>
+          <w:t>Applied AI Foundations</w:t>
+        </w:r>
+      </w:hyperlink>
+      <w:r>
+        <w:rPr>
+          <w:rFonts w:ascii="Inter" w:hAnsi="Inter"/>
+          <w:b w:val="0"/>
+          <w:i w:val="0"/>
+          <w:color w:val="171717"/>
+          <w:sz w:val="18"/>
+        </w:rPr>
+        <w:t xml:space="preserve">; </w:t>
+      </w:r>
+      <w:hyperlink r:id="rId12">
+        <w:r>
+          <w:rPr>
+            <w:rFonts w:ascii="Inter" w:hAnsi="Inter"/>
+            <w:b w:val="0"/>
+            <w:i w:val="0"/>
+            <w:color w:val="1447E6"/>
+            <w:sz w:val="18"/>
+          </w:rPr>
+          <w:t>AI Leadership</w:t>
+        </w:r>
+      </w:hyperlink>
+      <w:r>
+        <w:rPr>
+          <w:rFonts w:ascii="Inter" w:hAnsi="Inter"/>
+          <w:b w:val="0"/>
+          <w:i w:val="0"/>
+          <w:color w:val="171717"/>
+          <w:sz w:val="18"/>
+        </w:rPr>
+        <w:t xml:space="preserve">; </w:t>
+      </w:r>
+      <w:hyperlink r:id="rId13">
+        <w:r>
+          <w:rPr>
+            <w:rFonts w:ascii="Inter" w:hAnsi="Inter"/>
+            <w:b w:val="0"/>
+            <w:i w:val="0"/>
+            <w:color w:val="1447E6"/>
+            <w:sz w:val="18"/>
+          </w:rPr>
+          <w:t>Apply AI at Work Pathway Completion</w:t>
+        </w:r>
+      </w:hyperlink>
     </w:p>
     <w:p>
       <w:pPr>
         <w:spacing w:after="100" w:line="269" w:lineRule="auto"/>
       </w:pPr>
+      <w:r>
+        <w:rPr>
+          <w:rFonts w:ascii="Inter" w:hAnsi="Inter"/>
+          <w:b w:val="0"/>
+          <w:i w:val="0"/>
+          <w:color w:val="171717"/>
+          <w:sz w:val="18"/>
+        </w:rPr>
+      </w:r>
       <w:r>
         <w:rPr>
           <w:rFonts w:ascii="Inter" w:hAnsi="Inter"/>
@@ -878,11 +996,20 @@
           <w:color w:val="171717"/>
           <w:sz w:val="18"/>
         </w:rPr>
+      </w:r>
+      <w:r>
+        <w:rPr>
+          <w:rFonts w:ascii="Inter" w:hAnsi="Inter"/>
+          <w:b w:val="0"/>
+          <w:i w:val="0"/>
+          <w:color w:val="171717"/>
+          <w:sz w:val="18"/>
+        </w:rPr>
         <w:t>Leading SAFe 4.0 course completion, 2016 (historical course completion)</w:t>
       </w:r>
     </w:p>
     <w:sectPr>
-      <w:footerReference w:type="default" r:id="rId9"/>
+      <w:footerReference w:type="default" r:id="rId14"/>
       <w:pgSz w:w="12240" w:h="15840"/>
       <w:pgMar w:top="893" w:right="893" w:bottom="893" w:left="893" w:header="360" w:footer="360" w:gutter="0"/>
       <w:cols w:space="720"/>

</xml_diff>

<commit_message>
Update experience content, credentials, and learning section
- Add Palantir and Scaled Agile certificates with local certificate images; remove Leading SAFe 4.0
- Redesign the Education and Courses & certifications section as centered full-width cards grouped by issuer
- Add user-reported impact details and stakeholder-leadership wording for VA and Data Generator projects
- Number implementation points 1, 2, 3 and fix list alignment
- Describe the Excel processing workflow without naming LEIE
- Regenerate all resume formats; one-page resume omits unlinked credentials to stay on one page
- Extend content validation for local credential images
</commit_message>
<xml_diff>
--- a/public/resume/mohamed-moheyeldin-resume-detailed.docx
+++ b/public/resume/mohamed-moheyeldin-resume-detailed.docx
@@ -79,7 +79,7 @@
           <w:color w:val="171717"/>
           <w:sz w:val="18"/>
         </w:rPr>
-        <w:t>Customer-focused engineer with 11 years of software development and quality engineering experience across federal, banking, and e-commerce environments. Connects business requirements with hands-on implementation, system integration, and technical troubleshooting. Works directly with stakeholders from discovery and acceptance criteria through demonstrations, feedback, and adoption. Contributes React application features and develops tools such as Data Generator &amp; File Processing to simplify complex workflows, combining engineering execution with practical customer delivery.</w:t>
+        <w:t>Customer-focused engineer with 11 years of software development and quality engineering experience across federal, banking, and e-commerce environments. Connects business requirements with hands-on implementation, system integration, and technical troubleshooting. Works directly with stakeholders from discovery and acceptance criteria through demonstrations, feedback, and adoption. Contributes React application features and develops tools such as Data Generator &amp; File Processing, which lets developers and QA build realistic data where production data can't be used, combining engineering execution with practical customer delivery.</w:t>
         <w:br/>
         <w:br/>
         <w:t>Works directly with stakeholders to clarify requirements and acceptance criteria, evaluate technical constraints, demonstrate changes, and help teams adopt reusable tools. Hands-on experience spans React, TypeScript, JavaScript, Java, SQL, REST API validation, and CI workflows. Uses AI coding assistants for development, debugging, and refactoring.</w:t>
@@ -187,6 +187,23 @@
           <w:color w:val="171717"/>
           <w:sz w:val="18"/>
         </w:rPr>
+        <w:t>Built and continue to enhance Data Generator &amp; File Processing because production data can't be used in VA lower environments. The team used to spend hours each day preparing data and keeping a database in every environment; now anyone can generate a full development database or up to 10,000 custom records in under 5 minutes, and the whole team uses it daily.</w:t>
+      </w:r>
+    </w:p>
+    <w:p>
+      <w:pPr>
+        <w:pStyle w:val="ListBullet"/>
+        <w:spacing w:after="64" w:line="259" w:lineRule="auto"/>
+        <w:ind w:left="317" w:hanging="173"/>
+      </w:pPr>
+      <w:r>
+        <w:rPr>
+          <w:rFonts w:ascii="Inter" w:hAnsi="Inter"/>
+          <w:b w:val="0"/>
+          <w:i w:val="0"/>
+          <w:color w:val="171717"/>
+          <w:sz w:val="18"/>
+        </w:rPr>
         <w:t>Work directly with VA stakeholders to map healthcare claims workflows, clarify technical and operational constraints, and define requirements and acceptance criteria for application and tooling changes.</w:t>
       </w:r>
     </w:p>
@@ -204,7 +221,7 @@
           <w:color w:val="171717"/>
           <w:sz w:val="18"/>
         </w:rPr>
-        <w:t>Independently built and continue to enhance Data Generator &amp; File Processing, enabling QA users to generate, edit, and upload hundreds of referrals in minutes to VA lower environments.</w:t>
+        <w:t>Run the tool like a product: versioned Windows releases built through GitHub Actions, in-app release notes, a user guide, a stakeholder overview, and release updates for the team; added Excel file processing with duplicate detection as a second workflow when team needs grew.</w:t>
       </w:r>
     </w:p>
     <w:p>
@@ -255,7 +272,7 @@
           <w:color w:val="171717"/>
           <w:sz w:val="18"/>
         </w:rPr>
-        <w:t>Demonstrate application, file-processing, and automation enhancements to stakeholders, gather feedback on daily workflows, and refine implementations around user needs.</w:t>
+        <w:t>Lead demonstrations of application, file-processing, and automation enhancements and all discussions with VA stakeholders, gather feedback on daily workflows, and refine implementations around user needs.</w:t>
       </w:r>
     </w:p>
     <w:p>
@@ -289,24 +306,7 @@
           <w:color w:val="171717"/>
           <w:sz w:val="18"/>
         </w:rPr>
-        <w:t>Develop a reusable Playwright smoke and regression framework and use GitHub Actions in development and testing workflows; investigate Microsoft Entra ID and environment dependencies affecting execution.</w:t>
-      </w:r>
-    </w:p>
-    <w:p>
-      <w:pPr>
-        <w:pStyle w:val="ListBullet"/>
-        <w:spacing w:after="64" w:line="259" w:lineRule="auto"/>
-        <w:ind w:left="317" w:hanging="173"/>
-      </w:pPr>
-      <w:r>
-        <w:rPr>
-          <w:rFonts w:ascii="Inter" w:hAnsi="Inter"/>
-          <w:b w:val="0"/>
-          <w:i w:val="0"/>
-          <w:color w:val="171717"/>
-          <w:sz w:val="18"/>
-        </w:rPr>
-        <w:t>Maintain Data Generator &amp; File Processing for daily QA use, troubleshoot issues, and adapt functionality as testing needs change; document single and bulk referral uploads and framework usage to help teammates adopt and extend the tools.</w:t>
+        <w:t>Develop a reusable Playwright smoke and regression framework that helps QA and developers reduce production bugs and deliver stakeholder requests faster; use GitHub Actions in development and testing workflows and investigate Microsoft Entra ID and environment dependencies affecting execution.</w:t>
       </w:r>
     </w:p>
     <w:p>
@@ -981,8 +981,42 @@
           <w:color w:val="171717"/>
           <w:sz w:val="18"/>
         </w:rPr>
-        <w:t>Implementing SAFe 5.1 course completion, 2021 (historical course completion)</w:t>
+        <w:t xml:space="preserve">Palantir | Issued 2026: </w:t>
       </w:r>
+      <w:hyperlink r:id="rId14">
+        <w:r>
+          <w:rPr>
+            <w:rFonts w:ascii="Inter" w:hAnsi="Inter"/>
+            <w:b w:val="0"/>
+            <w:i w:val="0"/>
+            <w:color w:val="1447E6"/>
+            <w:sz w:val="18"/>
+          </w:rPr>
+          <w:t>Speedrun: Your First End-to-End Workflow</w:t>
+        </w:r>
+      </w:hyperlink>
+      <w:r>
+        <w:rPr>
+          <w:rFonts w:ascii="Inter" w:hAnsi="Inter"/>
+          <w:b w:val="0"/>
+          <w:i w:val="0"/>
+          <w:color w:val="171717"/>
+          <w:sz w:val="18"/>
+        </w:rPr>
+        <w:t xml:space="preserve">; </w:t>
+      </w:r>
+      <w:hyperlink r:id="rId15">
+        <w:r>
+          <w:rPr>
+            <w:rFonts w:ascii="Inter" w:hAnsi="Inter"/>
+            <w:b w:val="0"/>
+            <w:i w:val="0"/>
+            <w:color w:val="1447E6"/>
+            <w:sz w:val="18"/>
+          </w:rPr>
+          <w:t>Foundry &amp; AIP Builder Foundations Quiz</w:t>
+        </w:r>
+      </w:hyperlink>
     </w:p>
     <w:p>
       <w:pPr>
@@ -1005,11 +1039,21 @@
           <w:color w:val="171717"/>
           <w:sz w:val="18"/>
         </w:rPr>
-        <w:t>Leading SAFe 4.0 course completion, 2016 (historical course completion)</w:t>
+        <w:t xml:space="preserve">Scaled Agile | Issued 2021: </w:t>
+      </w:r>
+      <w:r>
+        <w:rPr>
+          <w:rFonts w:ascii="Inter" w:hAnsi="Inter"/>
+          <w:b w:val="0"/>
+          <w:i w:val="0"/>
+          <w:color w:val="171717"/>
+          <w:sz w:val="18"/>
+        </w:rPr>
+        <w:t>Implementing SAFe Course (5.1)</w:t>
       </w:r>
     </w:p>
     <w:sectPr>
-      <w:footerReference w:type="default" r:id="rId14"/>
+      <w:footerReference w:type="default" r:id="rId16"/>
       <w:pgSz w:w="12240" w:h="15840"/>
       <w:pgMar w:top="893" w:right="893" w:bottom="893" w:left="893" w:header="360" w:footer="360" w:gutter="0"/>
       <w:cols w:space="720"/>

</xml_diff>

<commit_message>
Reframe Booz Allen role and VA project for FDE roles
- Lead with VA stakeholder work: requirements, demos each release cycle and program increment, working sessions with claims processors and VA users
- Add provider API integration for live claim status, the claims-tracking framework, and Tableau dashboards for system and server health
- Add Tableau to skills and toolkit lists; open the profile summary with the FDE role
- Condense highlights so the one-page and detailed resumes keep their page counts
- Regenerate all resume formats and record the user-reported details in provenance
</commit_message>
<xml_diff>
--- a/public/resume/mohamed-moheyeldin-resume-detailed.docx
+++ b/public/resume/mohamed-moheyeldin-resume-detailed.docx
@@ -79,10 +79,10 @@
           <w:color w:val="171717"/>
           <w:sz w:val="18"/>
         </w:rPr>
-        <w:t>Customer-focused engineer with 11 years of software development and quality engineering experience across federal, banking, and e-commerce environments. Connects business requirements with hands-on implementation, system integration, and technical troubleshooting. Works directly with stakeholders from discovery and acceptance criteria through demonstrations, feedback, and adoption. Contributes React application features and develops tools such as Data Generator &amp; File Processing, which lets developers and QA build realistic data where production data can't be used, combining engineering execution with practical customer delivery.</w:t>
+        <w:t>Forward Deployed Engineer on a VA healthcare claims platform, with 11 years of software development and quality engineering experience across federal, banking, and e-commerce environments. Works directly with stakeholders from discovery and acceptance criteria through demonstrations, feedback, and adoption. Contributes React application features and builds tools such as Data Generator &amp; File Processing, giving developers and QA realistic data where production data can't be used.</w:t>
         <w:br/>
         <w:br/>
-        <w:t>Works directly with stakeholders to clarify requirements and acceptance criteria, evaluate technical constraints, demonstrate changes, and help teams adopt reusable tools. Hands-on experience spans React, TypeScript, JavaScript, Java, SQL, REST API validation, and CI workflows. Uses AI coding assistants for development, debugging, and refactoring.</w:t>
+        <w:t>Works directly with stakeholders to clarify requirements and acceptance criteria, evaluate technical constraints, demonstrate changes, and help teams adopt reusable tools. Hands-on experience spans React, TypeScript, JavaScript, Java, SQL, REST API validation, Tableau dashboards, and CI workflows. Uses AI coding assistants for development, debugging, and refactoring.</w:t>
       </w:r>
     </w:p>
     <w:p>
@@ -170,7 +170,143 @@
           <w:color w:val="525252"/>
           <w:sz w:val="18"/>
         </w:rPr>
-        <w:t>Contribute to a VA healthcare claims platform with two frontends sharing a database, supporting claim submission, provider updates, claim progress and status tracking, and payment visibility.</w:t>
+        <w:t>Work directly with VA stakeholders on a healthcare claims platform with two frontends sharing a database, supporting claim submission, provider updates, claim progress and status tracking, and payment visibility.</w:t>
+      </w:r>
+    </w:p>
+    <w:p>
+      <w:pPr>
+        <w:pStyle w:val="ListBullet"/>
+        <w:spacing w:after="64" w:line="259" w:lineRule="auto"/>
+        <w:ind w:left="317" w:hanging="173"/>
+      </w:pPr>
+      <w:r>
+        <w:rPr>
+          <w:rFonts w:ascii="Inter" w:hAnsi="Inter"/>
+          <w:b w:val="0"/>
+          <w:i w:val="0"/>
+          <w:color w:val="171717"/>
+          <w:sz w:val="18"/>
+        </w:rPr>
+        <w:t>Work directly with VA stakeholders to map healthcare claims workflows, clarify technical and operational constraints, and define requirements and acceptance criteria for claim submission, provider updates, status tracking, and payment visibility.</w:t>
+      </w:r>
+    </w:p>
+    <w:p>
+      <w:pPr>
+        <w:pStyle w:val="ListBullet"/>
+        <w:spacing w:after="64" w:line="259" w:lineRule="auto"/>
+        <w:ind w:left="317" w:hanging="173"/>
+      </w:pPr>
+      <w:r>
+        <w:rPr>
+          <w:rFonts w:ascii="Inter" w:hAnsi="Inter"/>
+          <w:b w:val="0"/>
+          <w:i w:val="0"/>
+          <w:color w:val="171717"/>
+          <w:sz w:val="18"/>
+        </w:rPr>
+        <w:t>Lead the stakeholder demonstrations at the end of each release cycle and program increment (since 2022) and all discussions with VA stakeholders; gather feedback on daily workflows and refine implementations around user needs.</w:t>
+      </w:r>
+    </w:p>
+    <w:p>
+      <w:pPr>
+        <w:pStyle w:val="ListBullet"/>
+        <w:spacing w:after="64" w:line="259" w:lineRule="auto"/>
+        <w:ind w:left="317" w:hanging="173"/>
+      </w:pPr>
+      <w:r>
+        <w:rPr>
+          <w:rFonts w:ascii="Inter" w:hAnsi="Inter"/>
+          <w:b w:val="0"/>
+          <w:i w:val="0"/>
+          <w:color w:val="171717"/>
+          <w:sz w:val="18"/>
+        </w:rPr>
+        <w:t>Join working sessions with health-provider claims processors and, at times, VA end users on issues reported in production, to see the full picture and keep future work pointed in the right direction.</w:t>
+      </w:r>
+    </w:p>
+    <w:p>
+      <w:pPr>
+        <w:pStyle w:val="ListBullet"/>
+        <w:spacing w:after="64" w:line="259" w:lineRule="auto"/>
+        <w:ind w:left="317" w:hanging="173"/>
+      </w:pPr>
+      <w:r>
+        <w:rPr>
+          <w:rFonts w:ascii="Inter" w:hAnsi="Inter"/>
+          <w:b w:val="0"/>
+          <w:i w:val="0"/>
+          <w:color w:val="171717"/>
+          <w:sz w:val="18"/>
+        </w:rPr>
+        <w:t>Work with health providers to integrate APIs with the VA system so live claim statuses display for VA staff, providers, and veterans based on their role; the VA side previously had no continuously updated claim status.</w:t>
+      </w:r>
+    </w:p>
+    <w:p>
+      <w:pPr>
+        <w:pStyle w:val="ListBullet"/>
+        <w:spacing w:after="64" w:line="259" w:lineRule="auto"/>
+        <w:ind w:left="317" w:hanging="173"/>
+      </w:pPr>
+      <w:r>
+        <w:rPr>
+          <w:rFonts w:ascii="Inter" w:hAnsi="Inter"/>
+          <w:b w:val="0"/>
+          <w:i w:val="0"/>
+          <w:color w:val="171717"/>
+          <w:sz w:val="18"/>
+        </w:rPr>
+        <w:t>Responded to stakeholder questions about stalled claims and process gaps by creating a claims framework that notifies the right party when a claim needs extra work, keeping claims moving and giving better tracking of every claim.</w:t>
+      </w:r>
+    </w:p>
+    <w:p>
+      <w:pPr>
+        <w:pStyle w:val="ListBullet"/>
+        <w:spacing w:after="64" w:line="259" w:lineRule="auto"/>
+        <w:ind w:left="317" w:hanging="173"/>
+      </w:pPr>
+      <w:r>
+        <w:rPr>
+          <w:rFonts w:ascii="Inter" w:hAnsi="Inter"/>
+          <w:b w:val="0"/>
+          <w:i w:val="0"/>
+          <w:color w:val="171717"/>
+          <w:sz w:val="18"/>
+        </w:rPr>
+        <w:t>Enabled the team to use Tableau for requests and system information so any user can build their own dashboard; built custom dashboards for VA and internal users and, through repeated VA stakeholder discussions, expanded Tableau into the main way to monitor server health and system status.</w:t>
+      </w:r>
+    </w:p>
+    <w:p>
+      <w:pPr>
+        <w:pStyle w:val="ListBullet"/>
+        <w:spacing w:after="64" w:line="259" w:lineRule="auto"/>
+        <w:ind w:left="317" w:hanging="173"/>
+      </w:pPr>
+      <w:r>
+        <w:rPr>
+          <w:rFonts w:ascii="Inter" w:hAnsi="Inter"/>
+          <w:b w:val="0"/>
+          <w:i w:val="0"/>
+          <w:color w:val="171717"/>
+          <w:sz w:val="18"/>
+        </w:rPr>
+        <w:t>Contribute React, TypeScript, and JavaScript features that turn stakeholder feedback into improvements to the claims application.</w:t>
+      </w:r>
+    </w:p>
+    <w:p>
+      <w:pPr>
+        <w:pStyle w:val="ListBullet"/>
+        <w:spacing w:after="64" w:line="259" w:lineRule="auto"/>
+        <w:ind w:left="317" w:hanging="173"/>
+      </w:pPr>
+      <w:r>
+        <w:rPr>
+          <w:rFonts w:ascii="Inter" w:hAnsi="Inter"/>
+          <w:b w:val="0"/>
+          <w:i w:val="0"/>
+          <w:color w:val="171717"/>
+          <w:sz w:val="18"/>
+        </w:rPr>
+        <w:t>Investigate defects and data discrepancies across frontend, backend, and MySQL data; coordinate with developers and stakeholders to resolve delivery dependencies, and document progress, blockers, and operational impact in Jira.</w:t>
       </w:r>
     </w:p>
     <w:p>
@@ -204,23 +340,6 @@
           <w:color w:val="171717"/>
           <w:sz w:val="18"/>
         </w:rPr>
-        <w:t>Work directly with VA stakeholders to map healthcare claims workflows, clarify technical and operational constraints, and define requirements and acceptance criteria for application and tooling changes.</w:t>
-      </w:r>
-    </w:p>
-    <w:p>
-      <w:pPr>
-        <w:pStyle w:val="ListBullet"/>
-        <w:spacing w:after="64" w:line="259" w:lineRule="auto"/>
-        <w:ind w:left="317" w:hanging="173"/>
-      </w:pPr>
-      <w:r>
-        <w:rPr>
-          <w:rFonts w:ascii="Inter" w:hAnsi="Inter"/>
-          <w:b w:val="0"/>
-          <w:i w:val="0"/>
-          <w:color w:val="171717"/>
-          <w:sz w:val="18"/>
-        </w:rPr>
         <w:t>Run the tool like a product: versioned Windows releases built through GitHub Actions, in-app release notes, a user guide, a stakeholder overview, and release updates for the team; added Excel file processing with duplicate detection as a second workflow when team needs grew.</w:t>
       </w:r>
     </w:p>
@@ -238,7 +357,7 @@
           <w:color w:val="171717"/>
           <w:sz w:val="18"/>
         </w:rPr>
-        <w:t>Contribute frontend features using React, JavaScript, and TypeScript; translate stakeholder feedback into application improvements supporting claim submission, provider updates, and status visibility.</w:t>
+        <w:t>Evaluated alternatives to legacy automation and helped select Playwright, weighing maintainability, reuse, authentication, and restricted environment access; developed a reusable smoke and regression framework that helps QA and developers reduce production bugs and deliver stakeholder requests faster.</w:t>
       </w:r>
     </w:p>
     <w:p>
@@ -255,92 +374,7 @@
           <w:color w:val="171717"/>
           <w:sz w:val="18"/>
         </w:rPr>
-        <w:t>Implement referral-data uploads into VA lower environments and use MySQL to investigate discrepancies between application behavior and stored data across frontend and backend workflows.</w:t>
-      </w:r>
-    </w:p>
-    <w:p>
-      <w:pPr>
-        <w:pStyle w:val="ListBullet"/>
-        <w:spacing w:after="64" w:line="259" w:lineRule="auto"/>
-        <w:ind w:left="317" w:hanging="173"/>
-      </w:pPr>
-      <w:r>
-        <w:rPr>
-          <w:rFonts w:ascii="Inter" w:hAnsi="Inter"/>
-          <w:b w:val="0"/>
-          <w:i w:val="0"/>
-          <w:color w:val="171717"/>
-          <w:sz w:val="18"/>
-        </w:rPr>
-        <w:t>Lead demonstrations of application, file-processing, and automation enhancements and all discussions with VA stakeholders, gather feedback on daily workflows, and refine implementations around user needs.</w:t>
-      </w:r>
-    </w:p>
-    <w:p>
-      <w:pPr>
-        <w:pStyle w:val="ListBullet"/>
-        <w:spacing w:after="64" w:line="259" w:lineRule="auto"/>
-        <w:ind w:left="317" w:hanging="173"/>
-      </w:pPr>
-      <w:r>
-        <w:rPr>
-          <w:rFonts w:ascii="Inter" w:hAnsi="Inter"/>
-          <w:b w:val="0"/>
-          <w:i w:val="0"/>
-          <w:color w:val="171717"/>
-          <w:sz w:val="18"/>
-        </w:rPr>
-        <w:t>Evaluated alternatives to legacy automation and helped select Playwright, weighing maintainability, reusable components, authentication requirements, and restricted environment access.</w:t>
-      </w:r>
-    </w:p>
-    <w:p>
-      <w:pPr>
-        <w:pStyle w:val="ListBullet"/>
-        <w:spacing w:after="64" w:line="259" w:lineRule="auto"/>
-        <w:ind w:left="317" w:hanging="173"/>
-      </w:pPr>
-      <w:r>
-        <w:rPr>
-          <w:rFonts w:ascii="Inter" w:hAnsi="Inter"/>
-          <w:b w:val="0"/>
-          <w:i w:val="0"/>
-          <w:color w:val="171717"/>
-          <w:sz w:val="18"/>
-        </w:rPr>
-        <w:t>Develop a reusable Playwright smoke and regression framework that helps QA and developers reduce production bugs and deliver stakeholder requests faster; use GitHub Actions in development and testing workflows and investigate Microsoft Entra ID and environment dependencies affecting execution.</w:t>
-      </w:r>
-    </w:p>
-    <w:p>
-      <w:pPr>
-        <w:pStyle w:val="ListBullet"/>
-        <w:spacing w:after="64" w:line="259" w:lineRule="auto"/>
-        <w:ind w:left="317" w:hanging="173"/>
-      </w:pPr>
-      <w:r>
-        <w:rPr>
-          <w:rFonts w:ascii="Inter" w:hAnsi="Inter"/>
-          <w:b w:val="0"/>
-          <w:i w:val="0"/>
-          <w:color w:val="171717"/>
-          <w:sz w:val="18"/>
-        </w:rPr>
-        <w:t>Coordinate with VA stakeholders and developers to investigate defects and resolve delivery dependencies; document progress, blockers, and operational impact in Jira.</w:t>
-      </w:r>
-    </w:p>
-    <w:p>
-      <w:pPr>
-        <w:pStyle w:val="ListBullet"/>
-        <w:spacing w:after="64" w:line="259" w:lineRule="auto"/>
-        <w:ind w:left="317" w:hanging="173"/>
-      </w:pPr>
-      <w:r>
-        <w:rPr>
-          <w:rFonts w:ascii="Inter" w:hAnsi="Inter"/>
-          <w:b w:val="0"/>
-          <w:i w:val="0"/>
-          <w:color w:val="171717"/>
-          <w:sz w:val="18"/>
-        </w:rPr>
-        <w:t>Use GitHub Copilot in VS Code for application development, debugging, refactoring, and test creation; use Gemini, GPT models, and Claude in broader development work to explore implementation approaches.</w:t>
+        <w:t>Use GitHub Copilot in VS Code for development, debugging, refactoring, and test creation; use Gemini, GPT models, and Claude to explore implementation approaches.</w:t>
       </w:r>
     </w:p>
     <w:p>
@@ -756,7 +790,7 @@
           <w:color w:val="171717"/>
           <w:sz w:val="18"/>
         </w:rPr>
-        <w:t>Data and integration: SQL, MySQL, JSON, REST APIs, Postman, SQL Server, Oracle, MongoDB</w:t>
+        <w:t>Data and integration: SQL, MySQL, JSON, REST APIs, Postman, Tableau, SQL Server, Oracle, MongoDB</w:t>
       </w:r>
     </w:p>
     <w:p>

</xml_diff>

<commit_message>
Rewrite site and resume copy in plain first-person language
- Replace slogan headings and marketing phrasing across the homepage, experience, resume, contact, and 404 pages
- Simplify toolkit descriptions and project section headings
- Rewrite the profile summary, role summaries, and project descriptions, challenges, outcomes, and relevance text
- Change the tagline to Forward Deployed Engineer
- Regenerate all resume formats; page counts unchanged
</commit_message>
<xml_diff>
--- a/public/resume/mohamed-moheyeldin-resume-detailed.docx
+++ b/public/resume/mohamed-moheyeldin-resume-detailed.docx
@@ -32,7 +32,7 @@
           <w:color w:val="1447E6"/>
           <w:sz w:val="22"/>
         </w:rPr>
-        <w:t>Bridging customer needs and technical solutions.</w:t>
+        <w:t>Forward Deployed Engineer</w:t>
       </w:r>
     </w:p>
     <w:p>
@@ -79,10 +79,10 @@
           <w:color w:val="171717"/>
           <w:sz w:val="18"/>
         </w:rPr>
-        <w:t>Forward Deployed Engineer on a VA healthcare claims platform, with 11 years of software development and quality engineering experience across federal, banking, and e-commerce environments. Works directly with stakeholders from discovery and acceptance criteria through demonstrations, feedback, and adoption. Contributes React application features and builds tools such as Data Generator &amp; File Processing, giving developers and QA realistic data where production data can't be used.</w:t>
+        <w:t>Forward Deployed Engineer on a VA healthcare claims platform, with 11 years in software development and quality engineering across federal, banking, and e-commerce. Work directly with stakeholders from first requirements conversations through demos and feedback. Write React features and built Data Generator &amp; File Processing, which gives developers and QA realistic data where production data can't be used.</w:t>
         <w:br/>
         <w:br/>
-        <w:t>Works directly with stakeholders to clarify requirements and acceptance criteria, evaluate technical constraints, demonstrate changes, and help teams adopt reusable tools. Hands-on experience spans React, TypeScript, JavaScript, Java, SQL, REST API validation, Tableau dashboards, and CI workflows. Uses AI coding assistants for development, debugging, and refactoring.</w:t>
+        <w:t>Work with stakeholders to clarify requirements and acceptance criteria, weigh technical constraints, demo changes, and help teams adopt the tools I build. Hands-on with React, TypeScript, JavaScript, Java, SQL, REST API validation, Tableau dashboards, and CI workflows. Use AI coding assistants for development, debugging, and refactoring.</w:t>
       </w:r>
     </w:p>
     <w:p>
@@ -452,7 +452,7 @@
           <w:color w:val="525252"/>
           <w:sz w:val="18"/>
         </w:rPr>
-        <w:t>Supported application delivery by connecting user workflows, REST APIs, authentication, and AWS test environments through reusable engineering tools and actionable troubleshooting evidence.</w:t>
+        <w:t>Built reusable test tooling and used it to investigate REST APIs, authentication, and AWS test environments, giving engineers the evidence to track down failures.</w:t>
       </w:r>
     </w:p>
     <w:p>
@@ -611,7 +611,7 @@
           <w:color w:val="525252"/>
           <w:sz w:val="18"/>
         </w:rPr>
-        <w:t>Partnered with developers, analysts, and product owners to turn banking requirements into traceable validation and release-readiness evidence.</w:t>
+        <w:t>Worked with developers, analysts, and product owners to turn banking requirements into traceable tests and release checks.</w:t>
       </w:r>
     </w:p>
     <w:p>

</xml_diff>

<commit_message>
Add the Claude Academy Building with the Claude API credential
Adds the October 12, 2026 Claude Academy course completion badge to the
canonical career record, the Experience credential strip and Learning
list, and all seven resume formats. The Learning issuer grid now fits
four issuer columns on wide screens.

Co-Authored-By: Claude Opus 5.5 (1M context) <noreply@anthropic.com>
Claude-Session: https://claude.ai/code/session_01AP8rJjBNSTXPvVRJsoJsah
</commit_message>
<xml_diff>
--- a/public/resume/mohamed-moheyeldin-resume-detailed.docx
+++ b/public/resume/mohamed-moheyeldin-resume-detailed.docx
@@ -891,9 +891,45 @@
           <w:color w:val="171717"/>
           <w:sz w:val="18"/>
         </w:rPr>
+        <w:t xml:space="preserve">Claude Academy | Issued 2026: </w:t>
+      </w:r>
+      <w:hyperlink r:id="rId9">
+        <w:r>
+          <w:rPr>
+            <w:rFonts w:ascii="Inter" w:hAnsi="Inter"/>
+            <w:b w:val="0"/>
+            <w:i w:val="0"/>
+            <w:color w:val="1447E6"/>
+            <w:sz w:val="18"/>
+          </w:rPr>
+          <w:t>Building with the Claude API</w:t>
+        </w:r>
+      </w:hyperlink>
+    </w:p>
+    <w:p>
+      <w:pPr>
+        <w:spacing w:after="100" w:line="269" w:lineRule="auto"/>
+      </w:pPr>
+      <w:r>
+        <w:rPr>
+          <w:rFonts w:ascii="Inter" w:hAnsi="Inter"/>
+          <w:b w:val="0"/>
+          <w:i w:val="0"/>
+          <w:color w:val="171717"/>
+          <w:sz w:val="18"/>
+        </w:rPr>
+      </w:r>
+      <w:r>
+        <w:rPr>
+          <w:rFonts w:ascii="Inter" w:hAnsi="Inter"/>
+          <w:b w:val="0"/>
+          <w:i w:val="0"/>
+          <w:color w:val="171717"/>
+          <w:sz w:val="18"/>
+        </w:rPr>
         <w:t xml:space="preserve">OpenAI Academy | Issued 2026: </w:t>
       </w:r>
-      <w:hyperlink r:id="rId9">
+      <w:hyperlink r:id="rId10">
         <w:r>
           <w:rPr>
             <w:rFonts w:ascii="Inter" w:hAnsi="Inter"/>
@@ -915,7 +951,7 @@
         </w:rPr>
         <w:t xml:space="preserve">; </w:t>
       </w:r>
-      <w:hyperlink r:id="rId10">
+      <w:hyperlink r:id="rId11">
         <w:r>
           <w:rPr>
             <w:rFonts w:ascii="Inter" w:hAnsi="Inter"/>
@@ -937,7 +973,7 @@
         </w:rPr>
         <w:t xml:space="preserve">; </w:t>
       </w:r>
-      <w:hyperlink r:id="rId11">
+      <w:hyperlink r:id="rId12">
         <w:r>
           <w:rPr>
             <w:rFonts w:ascii="Inter" w:hAnsi="Inter"/>
@@ -959,7 +995,7 @@
         </w:rPr>
         <w:t xml:space="preserve">; </w:t>
       </w:r>
-      <w:hyperlink r:id="rId12">
+      <w:hyperlink r:id="rId13">
         <w:r>
           <w:rPr>
             <w:rFonts w:ascii="Inter" w:hAnsi="Inter"/>
@@ -981,7 +1017,7 @@
         </w:rPr>
         <w:t xml:space="preserve">; </w:t>
       </w:r>
-      <w:hyperlink r:id="rId13">
+      <w:hyperlink r:id="rId14">
         <w:r>
           <w:rPr>
             <w:rFonts w:ascii="Inter" w:hAnsi="Inter"/>
@@ -1017,7 +1053,7 @@
         </w:rPr>
         <w:t xml:space="preserve">Palantir | Issued 2026: </w:t>
       </w:r>
-      <w:hyperlink r:id="rId14">
+      <w:hyperlink r:id="rId15">
         <w:r>
           <w:rPr>
             <w:rFonts w:ascii="Inter" w:hAnsi="Inter"/>
@@ -1039,7 +1075,7 @@
         </w:rPr>
         <w:t xml:space="preserve">; </w:t>
       </w:r>
-      <w:hyperlink r:id="rId15">
+      <w:hyperlink r:id="rId16">
         <w:r>
           <w:rPr>
             <w:rFonts w:ascii="Inter" w:hAnsi="Inter"/>
@@ -1087,7 +1123,7 @@
       </w:r>
     </w:p>
     <w:sectPr>
-      <w:footerReference w:type="default" r:id="rId16"/>
+      <w:footerReference w:type="default" r:id="rId17"/>
       <w:pgSz w:w="12240" w:h="15840"/>
       <w:pgMar w:top="893" w:right="893" w:bottom="893" w:left="893" w:header="360" w:footer="360" w:gutter="0"/>
       <w:cols w:space="720"/>

</xml_diff>

<commit_message>
Add the Claude Academy Claude Code in Action credential
Adds the Claude Code in Action course completion credential to the
canonical career record, the Experience Learning list, and all seven
resume formats. Print formats now group credentials by issuer and issue
year, the only date they show, so the one-page resume stays on one page.
The credential has no badge image yet, so it stays out of the credential
strip and content validation warns until one is added.

Co-Authored-By: Claude Opus 5.5 (1M context) <noreply@anthropic.com>
Claude-Session: https://claude.ai/code/session_01VSa93TzBRX2c8V8AQzL89L
</commit_message>
<xml_diff>
--- a/public/resume/mohamed-moheyeldin-resume-detailed.docx
+++ b/public/resume/mohamed-moheyeldin-resume-detailed.docx
@@ -902,6 +902,28 @@
             <w:color w:val="1447E6"/>
             <w:sz w:val="18"/>
           </w:rPr>
+          <w:t>Claude Code in Action</w:t>
+        </w:r>
+      </w:hyperlink>
+      <w:r>
+        <w:rPr>
+          <w:rFonts w:ascii="Inter" w:hAnsi="Inter"/>
+          <w:b w:val="0"/>
+          <w:i w:val="0"/>
+          <w:color w:val="171717"/>
+          <w:sz w:val="18"/>
+        </w:rPr>
+        <w:t xml:space="preserve">; </w:t>
+      </w:r>
+      <w:hyperlink r:id="rId10">
+        <w:r>
+          <w:rPr>
+            <w:rFonts w:ascii="Inter" w:hAnsi="Inter"/>
+            <w:b w:val="0"/>
+            <w:i w:val="0"/>
+            <w:color w:val="1447E6"/>
+            <w:sz w:val="18"/>
+          </w:rPr>
           <w:t>Building with the Claude API</w:t>
         </w:r>
       </w:hyperlink>
@@ -929,7 +951,7 @@
         </w:rPr>
         <w:t xml:space="preserve">OpenAI Academy | Issued 2026: </w:t>
       </w:r>
-      <w:hyperlink r:id="rId10">
+      <w:hyperlink r:id="rId11">
         <w:r>
           <w:rPr>
             <w:rFonts w:ascii="Inter" w:hAnsi="Inter"/>
@@ -951,7 +973,7 @@
         </w:rPr>
         <w:t xml:space="preserve">; </w:t>
       </w:r>
-      <w:hyperlink r:id="rId11">
+      <w:hyperlink r:id="rId12">
         <w:r>
           <w:rPr>
             <w:rFonts w:ascii="Inter" w:hAnsi="Inter"/>
@@ -973,7 +995,7 @@
         </w:rPr>
         <w:t xml:space="preserve">; </w:t>
       </w:r>
-      <w:hyperlink r:id="rId12">
+      <w:hyperlink r:id="rId13">
         <w:r>
           <w:rPr>
             <w:rFonts w:ascii="Inter" w:hAnsi="Inter"/>
@@ -995,7 +1017,7 @@
         </w:rPr>
         <w:t xml:space="preserve">; </w:t>
       </w:r>
-      <w:hyperlink r:id="rId13">
+      <w:hyperlink r:id="rId14">
         <w:r>
           <w:rPr>
             <w:rFonts w:ascii="Inter" w:hAnsi="Inter"/>
@@ -1017,7 +1039,7 @@
         </w:rPr>
         <w:t xml:space="preserve">; </w:t>
       </w:r>
-      <w:hyperlink r:id="rId14">
+      <w:hyperlink r:id="rId15">
         <w:r>
           <w:rPr>
             <w:rFonts w:ascii="Inter" w:hAnsi="Inter"/>
@@ -1053,7 +1075,7 @@
         </w:rPr>
         <w:t xml:space="preserve">Palantir | Issued 2026: </w:t>
       </w:r>
-      <w:hyperlink r:id="rId15">
+      <w:hyperlink r:id="rId16">
         <w:r>
           <w:rPr>
             <w:rFonts w:ascii="Inter" w:hAnsi="Inter"/>
@@ -1075,7 +1097,7 @@
         </w:rPr>
         <w:t xml:space="preserve">; </w:t>
       </w:r>
-      <w:hyperlink r:id="rId16">
+      <w:hyperlink r:id="rId17">
         <w:r>
           <w:rPr>
             <w:rFonts w:ascii="Inter" w:hAnsi="Inter"/>
@@ -1123,7 +1145,7 @@
       </w:r>
     </w:p>
     <w:sectPr>
-      <w:footerReference w:type="default" r:id="rId17"/>
+      <w:footerReference w:type="default" r:id="rId18"/>
       <w:pgSz w:w="12240" w:h="15840"/>
       <w:pgMar w:top="893" w:right="893" w:bottom="893" w:left="893" w:header="360" w:footer="360" w:gutter="0"/>
       <w:cols w:space="720"/>

</xml_diff>

<commit_message>
Add the Claude Academy Introduction to Model Context Protocol credential
Adds the October 13, 2026 course completion badge to the canonical career
record, the Experience credential strip and Learning list, and all seven
resume formats. PDF resumes use slightly smaller top and bottom margins so
the one-page resume stays on one page and the detailed one on two.

Co-Authored-By: Claude Opus 5.5 (1M context) <noreply@anthropic.com>
Claude-Session: https://claude.ai/code/session_01VSa93TzBRX2c8V8AQzL89L
</commit_message>
<xml_diff>
--- a/public/resume/mohamed-moheyeldin-resume-detailed.docx
+++ b/public/resume/mohamed-moheyeldin-resume-detailed.docx
@@ -902,6 +902,28 @@
             <w:color w:val="1447E6"/>
             <w:sz w:val="18"/>
           </w:rPr>
+          <w:t>Introduction to Model Context Protocol</w:t>
+        </w:r>
+      </w:hyperlink>
+      <w:r>
+        <w:rPr>
+          <w:rFonts w:ascii="Inter" w:hAnsi="Inter"/>
+          <w:b w:val="0"/>
+          <w:i w:val="0"/>
+          <w:color w:val="171717"/>
+          <w:sz w:val="18"/>
+        </w:rPr>
+        <w:t xml:space="preserve">; </w:t>
+      </w:r>
+      <w:hyperlink r:id="rId10">
+        <w:r>
+          <w:rPr>
+            <w:rFonts w:ascii="Inter" w:hAnsi="Inter"/>
+            <w:b w:val="0"/>
+            <w:i w:val="0"/>
+            <w:color w:val="1447E6"/>
+            <w:sz w:val="18"/>
+          </w:rPr>
           <w:t>Claude Code in Action</w:t>
         </w:r>
       </w:hyperlink>
@@ -915,7 +937,7 @@
         </w:rPr>
         <w:t xml:space="preserve">; </w:t>
       </w:r>
-      <w:hyperlink r:id="rId10">
+      <w:hyperlink r:id="rId11">
         <w:r>
           <w:rPr>
             <w:rFonts w:ascii="Inter" w:hAnsi="Inter"/>
@@ -951,7 +973,7 @@
         </w:rPr>
         <w:t xml:space="preserve">OpenAI Academy | Issued 2026: </w:t>
       </w:r>
-      <w:hyperlink r:id="rId11">
+      <w:hyperlink r:id="rId12">
         <w:r>
           <w:rPr>
             <w:rFonts w:ascii="Inter" w:hAnsi="Inter"/>
@@ -973,7 +995,7 @@
         </w:rPr>
         <w:t xml:space="preserve">; </w:t>
       </w:r>
-      <w:hyperlink r:id="rId12">
+      <w:hyperlink r:id="rId13">
         <w:r>
           <w:rPr>
             <w:rFonts w:ascii="Inter" w:hAnsi="Inter"/>
@@ -995,7 +1017,7 @@
         </w:rPr>
         <w:t xml:space="preserve">; </w:t>
       </w:r>
-      <w:hyperlink r:id="rId13">
+      <w:hyperlink r:id="rId14">
         <w:r>
           <w:rPr>
             <w:rFonts w:ascii="Inter" w:hAnsi="Inter"/>
@@ -1017,7 +1039,7 @@
         </w:rPr>
         <w:t xml:space="preserve">; </w:t>
       </w:r>
-      <w:hyperlink r:id="rId14">
+      <w:hyperlink r:id="rId15">
         <w:r>
           <w:rPr>
             <w:rFonts w:ascii="Inter" w:hAnsi="Inter"/>
@@ -1039,7 +1061,7 @@
         </w:rPr>
         <w:t xml:space="preserve">; </w:t>
       </w:r>
-      <w:hyperlink r:id="rId15">
+      <w:hyperlink r:id="rId16">
         <w:r>
           <w:rPr>
             <w:rFonts w:ascii="Inter" w:hAnsi="Inter"/>
@@ -1075,7 +1097,7 @@
         </w:rPr>
         <w:t xml:space="preserve">Palantir | Issued 2026: </w:t>
       </w:r>
-      <w:hyperlink r:id="rId16">
+      <w:hyperlink r:id="rId17">
         <w:r>
           <w:rPr>
             <w:rFonts w:ascii="Inter" w:hAnsi="Inter"/>
@@ -1097,7 +1119,7 @@
         </w:rPr>
         <w:t xml:space="preserve">; </w:t>
       </w:r>
-      <w:hyperlink r:id="rId17">
+      <w:hyperlink r:id="rId18">
         <w:r>
           <w:rPr>
             <w:rFonts w:ascii="Inter" w:hAnsi="Inter"/>
@@ -1145,7 +1167,7 @@
       </w:r>
     </w:p>
     <w:sectPr>
-      <w:footerReference w:type="default" r:id="rId18"/>
+      <w:footerReference w:type="default" r:id="rId19"/>
       <w:pgSz w:w="12240" w:h="15840"/>
       <w:pgMar w:top="893" w:right="893" w:bottom="893" w:left="893" w:header="360" w:footer="360" w:gutter="0"/>
       <w:cols w:space="720"/>

</xml_diff>

<commit_message>
Add Claude Academy AI Capabilities and Limitations credential
Adds the October 14, 2026 Claude Academy course completion badge to the
canonical career record, the Experience badge strip (rendered from the
supplied PDF at 120 dpi) and all seven resume formats. Also records that
the user confirmed the Claude Code in Action title and date.

Co-Authored-By: Claude Opus 5.5 (1M context) <noreply@anthropic.com>
Claude-Session: https://claude.ai/code/session_01US8fTWnE6Xz7gv54MDcfGm
</commit_message>
<xml_diff>
--- a/public/resume/mohamed-moheyeldin-resume-detailed.docx
+++ b/public/resume/mohamed-moheyeldin-resume-detailed.docx
@@ -902,7 +902,7 @@
             <w:color w:val="1447E6"/>
             <w:sz w:val="18"/>
           </w:rPr>
-          <w:t>Introduction to Model Context Protocol</w:t>
+          <w:t>AI Capabilities and Limitations</w:t>
         </w:r>
       </w:hyperlink>
       <w:r>
@@ -924,6 +924,28 @@
             <w:color w:val="1447E6"/>
             <w:sz w:val="18"/>
           </w:rPr>
+          <w:t>Introduction to Model Context Protocol</w:t>
+        </w:r>
+      </w:hyperlink>
+      <w:r>
+        <w:rPr>
+          <w:rFonts w:ascii="Inter" w:hAnsi="Inter"/>
+          <w:b w:val="0"/>
+          <w:i w:val="0"/>
+          <w:color w:val="171717"/>
+          <w:sz w:val="18"/>
+        </w:rPr>
+        <w:t xml:space="preserve">; </w:t>
+      </w:r>
+      <w:hyperlink r:id="rId11">
+        <w:r>
+          <w:rPr>
+            <w:rFonts w:ascii="Inter" w:hAnsi="Inter"/>
+            <w:b w:val="0"/>
+            <w:i w:val="0"/>
+            <w:color w:val="1447E6"/>
+            <w:sz w:val="18"/>
+          </w:rPr>
           <w:t>Claude Code in Action</w:t>
         </w:r>
       </w:hyperlink>
@@ -937,7 +959,7 @@
         </w:rPr>
         <w:t xml:space="preserve">; </w:t>
       </w:r>
-      <w:hyperlink r:id="rId11">
+      <w:hyperlink r:id="rId12">
         <w:r>
           <w:rPr>
             <w:rFonts w:ascii="Inter" w:hAnsi="Inter"/>
@@ -973,7 +995,7 @@
         </w:rPr>
         <w:t xml:space="preserve">OpenAI Academy | Issued 2026: </w:t>
       </w:r>
-      <w:hyperlink r:id="rId12">
+      <w:hyperlink r:id="rId13">
         <w:r>
           <w:rPr>
             <w:rFonts w:ascii="Inter" w:hAnsi="Inter"/>
@@ -995,7 +1017,7 @@
         </w:rPr>
         <w:t xml:space="preserve">; </w:t>
       </w:r>
-      <w:hyperlink r:id="rId13">
+      <w:hyperlink r:id="rId14">
         <w:r>
           <w:rPr>
             <w:rFonts w:ascii="Inter" w:hAnsi="Inter"/>
@@ -1017,7 +1039,7 @@
         </w:rPr>
         <w:t xml:space="preserve">; </w:t>
       </w:r>
-      <w:hyperlink r:id="rId14">
+      <w:hyperlink r:id="rId15">
         <w:r>
           <w:rPr>
             <w:rFonts w:ascii="Inter" w:hAnsi="Inter"/>
@@ -1039,7 +1061,7 @@
         </w:rPr>
         <w:t xml:space="preserve">; </w:t>
       </w:r>
-      <w:hyperlink r:id="rId15">
+      <w:hyperlink r:id="rId16">
         <w:r>
           <w:rPr>
             <w:rFonts w:ascii="Inter" w:hAnsi="Inter"/>
@@ -1061,7 +1083,7 @@
         </w:rPr>
         <w:t xml:space="preserve">; </w:t>
       </w:r>
-      <w:hyperlink r:id="rId16">
+      <w:hyperlink r:id="rId17">
         <w:r>
           <w:rPr>
             <w:rFonts w:ascii="Inter" w:hAnsi="Inter"/>
@@ -1097,7 +1119,7 @@
         </w:rPr>
         <w:t xml:space="preserve">Palantir | Issued 2026: </w:t>
       </w:r>
-      <w:hyperlink r:id="rId17">
+      <w:hyperlink r:id="rId18">
         <w:r>
           <w:rPr>
             <w:rFonts w:ascii="Inter" w:hAnsi="Inter"/>
@@ -1119,7 +1141,7 @@
         </w:rPr>
         <w:t xml:space="preserve">; </w:t>
       </w:r>
-      <w:hyperlink r:id="rId18">
+      <w:hyperlink r:id="rId19">
         <w:r>
           <w:rPr>
             <w:rFonts w:ascii="Inter" w:hAnsi="Inter"/>
@@ -1167,7 +1189,7 @@
       </w:r>
     </w:p>
     <w:sectPr>
-      <w:footerReference w:type="default" r:id="rId19"/>
+      <w:footerReference w:type="default" r:id="rId20"/>
       <w:pgSz w:w="12240" w:h="15840"/>
       <w:pgMar w:top="893" w:right="893" w:bottom="893" w:left="893" w:header="360" w:footer="360" w:gutter="0"/>
       <w:cols w:space="720"/>

</xml_diff>

<commit_message>
Add Claude Academy Introduction to Claude Tag credential
Adds the October 14, 2026 Claude Academy course completion badge to the
canonical career record, the Experience badge strip (rendered from the
supplied PDF at 120 dpi) and all seven resume formats.

Co-Authored-By: Claude Opus 5.5 (1M context) <noreply@anthropic.com>
Claude-Session: https://claude.ai/code/session_01US8fTWnE6Xz7gv54MDcfGm
</commit_message>
<xml_diff>
--- a/public/resume/mohamed-moheyeldin-resume-detailed.docx
+++ b/public/resume/mohamed-moheyeldin-resume-detailed.docx
@@ -902,7 +902,7 @@
             <w:color w:val="1447E6"/>
             <w:sz w:val="18"/>
           </w:rPr>
-          <w:t>AI Capabilities and Limitations</w:t>
+          <w:t>Introduction to Claude Tag</w:t>
         </w:r>
       </w:hyperlink>
       <w:r>
@@ -924,7 +924,7 @@
             <w:color w:val="1447E6"/>
             <w:sz w:val="18"/>
           </w:rPr>
-          <w:t>Introduction to Model Context Protocol</w:t>
+          <w:t>AI Capabilities and Limitations</w:t>
         </w:r>
       </w:hyperlink>
       <w:r>
@@ -946,6 +946,28 @@
             <w:color w:val="1447E6"/>
             <w:sz w:val="18"/>
           </w:rPr>
+          <w:t>Introduction to Model Context Protocol</w:t>
+        </w:r>
+      </w:hyperlink>
+      <w:r>
+        <w:rPr>
+          <w:rFonts w:ascii="Inter" w:hAnsi="Inter"/>
+          <w:b w:val="0"/>
+          <w:i w:val="0"/>
+          <w:color w:val="171717"/>
+          <w:sz w:val="18"/>
+        </w:rPr>
+        <w:t xml:space="preserve">; </w:t>
+      </w:r>
+      <w:hyperlink r:id="rId12">
+        <w:r>
+          <w:rPr>
+            <w:rFonts w:ascii="Inter" w:hAnsi="Inter"/>
+            <w:b w:val="0"/>
+            <w:i w:val="0"/>
+            <w:color w:val="1447E6"/>
+            <w:sz w:val="18"/>
+          </w:rPr>
           <w:t>Claude Code in Action</w:t>
         </w:r>
       </w:hyperlink>
@@ -959,7 +981,7 @@
         </w:rPr>
         <w:t xml:space="preserve">; </w:t>
       </w:r>
-      <w:hyperlink r:id="rId12">
+      <w:hyperlink r:id="rId13">
         <w:r>
           <w:rPr>
             <w:rFonts w:ascii="Inter" w:hAnsi="Inter"/>
@@ -995,7 +1017,7 @@
         </w:rPr>
         <w:t xml:space="preserve">OpenAI Academy | Issued 2026: </w:t>
       </w:r>
-      <w:hyperlink r:id="rId13">
+      <w:hyperlink r:id="rId14">
         <w:r>
           <w:rPr>
             <w:rFonts w:ascii="Inter" w:hAnsi="Inter"/>
@@ -1017,7 +1039,7 @@
         </w:rPr>
         <w:t xml:space="preserve">; </w:t>
       </w:r>
-      <w:hyperlink r:id="rId14">
+      <w:hyperlink r:id="rId15">
         <w:r>
           <w:rPr>
             <w:rFonts w:ascii="Inter" w:hAnsi="Inter"/>
@@ -1039,7 +1061,7 @@
         </w:rPr>
         <w:t xml:space="preserve">; </w:t>
       </w:r>
-      <w:hyperlink r:id="rId15">
+      <w:hyperlink r:id="rId16">
         <w:r>
           <w:rPr>
             <w:rFonts w:ascii="Inter" w:hAnsi="Inter"/>
@@ -1061,7 +1083,7 @@
         </w:rPr>
         <w:t xml:space="preserve">; </w:t>
       </w:r>
-      <w:hyperlink r:id="rId16">
+      <w:hyperlink r:id="rId17">
         <w:r>
           <w:rPr>
             <w:rFonts w:ascii="Inter" w:hAnsi="Inter"/>
@@ -1083,7 +1105,7 @@
         </w:rPr>
         <w:t xml:space="preserve">; </w:t>
       </w:r>
-      <w:hyperlink r:id="rId17">
+      <w:hyperlink r:id="rId18">
         <w:r>
           <w:rPr>
             <w:rFonts w:ascii="Inter" w:hAnsi="Inter"/>
@@ -1119,7 +1141,7 @@
         </w:rPr>
         <w:t xml:space="preserve">Palantir | Issued 2026: </w:t>
       </w:r>
-      <w:hyperlink r:id="rId18">
+      <w:hyperlink r:id="rId19">
         <w:r>
           <w:rPr>
             <w:rFonts w:ascii="Inter" w:hAnsi="Inter"/>
@@ -1141,7 +1163,7 @@
         </w:rPr>
         <w:t xml:space="preserve">; </w:t>
       </w:r>
-      <w:hyperlink r:id="rId19">
+      <w:hyperlink r:id="rId20">
         <w:r>
           <w:rPr>
             <w:rFonts w:ascii="Inter" w:hAnsi="Inter"/>
@@ -1189,7 +1211,7 @@
       </w:r>
     </w:p>
     <w:sectPr>
-      <w:footerReference w:type="default" r:id="rId20"/>
+      <w:footerReference w:type="default" r:id="rId21"/>
       <w:pgSz w:w="12240" w:h="15840"/>
       <w:pgMar w:top="893" w:right="893" w:bottom="893" w:left="893" w:header="360" w:footer="360" w:gutter="0"/>
       <w:cols w:space="720"/>

</xml_diff>

<commit_message>
Add Claude Academy Introduction to Claude Cowork credential
Adds the October 14, 2026 Claude Academy course completion badge to the
canonical career record, the Experience badge strip (rendered from the
supplied PDF at 120 dpi) and all seven resume formats.

Co-Authored-By: Claude Opus 5.5 (1M context) <noreply@anthropic.com>
Claude-Session: https://claude.ai/code/session_01US8fTWnE6Xz7gv54MDcfGm
</commit_message>
<xml_diff>
--- a/public/resume/mohamed-moheyeldin-resume-detailed.docx
+++ b/public/resume/mohamed-moheyeldin-resume-detailed.docx
@@ -902,7 +902,7 @@
             <w:color w:val="1447E6"/>
             <w:sz w:val="18"/>
           </w:rPr>
-          <w:t>Introduction to Claude Tag</w:t>
+          <w:t>Introduction to Claude Cowork</w:t>
         </w:r>
       </w:hyperlink>
       <w:r>
@@ -924,7 +924,7 @@
             <w:color w:val="1447E6"/>
             <w:sz w:val="18"/>
           </w:rPr>
-          <w:t>AI Capabilities and Limitations</w:t>
+          <w:t>Introduction to Claude Tag</w:t>
         </w:r>
       </w:hyperlink>
       <w:r>
@@ -946,7 +946,7 @@
             <w:color w:val="1447E6"/>
             <w:sz w:val="18"/>
           </w:rPr>
-          <w:t>Introduction to Model Context Protocol</w:t>
+          <w:t>AI Capabilities and Limitations</w:t>
         </w:r>
       </w:hyperlink>
       <w:r>
@@ -968,6 +968,28 @@
             <w:color w:val="1447E6"/>
             <w:sz w:val="18"/>
           </w:rPr>
+          <w:t>Introduction to Model Context Protocol</w:t>
+        </w:r>
+      </w:hyperlink>
+      <w:r>
+        <w:rPr>
+          <w:rFonts w:ascii="Inter" w:hAnsi="Inter"/>
+          <w:b w:val="0"/>
+          <w:i w:val="0"/>
+          <w:color w:val="171717"/>
+          <w:sz w:val="18"/>
+        </w:rPr>
+        <w:t xml:space="preserve">; </w:t>
+      </w:r>
+      <w:hyperlink r:id="rId13">
+        <w:r>
+          <w:rPr>
+            <w:rFonts w:ascii="Inter" w:hAnsi="Inter"/>
+            <w:b w:val="0"/>
+            <w:i w:val="0"/>
+            <w:color w:val="1447E6"/>
+            <w:sz w:val="18"/>
+          </w:rPr>
           <w:t>Claude Code in Action</w:t>
         </w:r>
       </w:hyperlink>
@@ -981,7 +1003,7 @@
         </w:rPr>
         <w:t xml:space="preserve">; </w:t>
       </w:r>
-      <w:hyperlink r:id="rId13">
+      <w:hyperlink r:id="rId14">
         <w:r>
           <w:rPr>
             <w:rFonts w:ascii="Inter" w:hAnsi="Inter"/>
@@ -1017,7 +1039,7 @@
         </w:rPr>
         <w:t xml:space="preserve">OpenAI Academy | Issued 2026: </w:t>
       </w:r>
-      <w:hyperlink r:id="rId14">
+      <w:hyperlink r:id="rId15">
         <w:r>
           <w:rPr>
             <w:rFonts w:ascii="Inter" w:hAnsi="Inter"/>
@@ -1039,7 +1061,7 @@
         </w:rPr>
         <w:t xml:space="preserve">; </w:t>
       </w:r>
-      <w:hyperlink r:id="rId15">
+      <w:hyperlink r:id="rId16">
         <w:r>
           <w:rPr>
             <w:rFonts w:ascii="Inter" w:hAnsi="Inter"/>
@@ -1061,7 +1083,7 @@
         </w:rPr>
         <w:t xml:space="preserve">; </w:t>
       </w:r>
-      <w:hyperlink r:id="rId16">
+      <w:hyperlink r:id="rId17">
         <w:r>
           <w:rPr>
             <w:rFonts w:ascii="Inter" w:hAnsi="Inter"/>
@@ -1083,7 +1105,7 @@
         </w:rPr>
         <w:t xml:space="preserve">; </w:t>
       </w:r>
-      <w:hyperlink r:id="rId17">
+      <w:hyperlink r:id="rId18">
         <w:r>
           <w:rPr>
             <w:rFonts w:ascii="Inter" w:hAnsi="Inter"/>
@@ -1105,7 +1127,7 @@
         </w:rPr>
         <w:t xml:space="preserve">; </w:t>
       </w:r>
-      <w:hyperlink r:id="rId18">
+      <w:hyperlink r:id="rId19">
         <w:r>
           <w:rPr>
             <w:rFonts w:ascii="Inter" w:hAnsi="Inter"/>
@@ -1141,7 +1163,7 @@
         </w:rPr>
         <w:t xml:space="preserve">Palantir | Issued 2026: </w:t>
       </w:r>
-      <w:hyperlink r:id="rId19">
+      <w:hyperlink r:id="rId20">
         <w:r>
           <w:rPr>
             <w:rFonts w:ascii="Inter" w:hAnsi="Inter"/>
@@ -1163,7 +1185,7 @@
         </w:rPr>
         <w:t xml:space="preserve">; </w:t>
       </w:r>
-      <w:hyperlink r:id="rId20">
+      <w:hyperlink r:id="rId21">
         <w:r>
           <w:rPr>
             <w:rFonts w:ascii="Inter" w:hAnsi="Inter"/>
@@ -1211,7 +1233,7 @@
       </w:r>
     </w:p>
     <w:sectPr>
-      <w:footerReference w:type="default" r:id="rId21"/>
+      <w:footerReference w:type="default" r:id="rId22"/>
       <w:pgSz w:w="12240" w:h="15840"/>
       <w:pgMar w:top="893" w:right="893" w:bottom="893" w:left="893" w:header="360" w:footer="360" w:gutter="0"/>
       <w:cols w:space="720"/>

</xml_diff>

<commit_message>
Lead with built work, add project metrics and a Work with me section
Reorder projects so integration and tooling work comes before testing,
add an optional metric per project (documented or user-reported figures
only), position the profile around federal and healthcare work, and add
a home page section with the AI workflow audit offer and FDE role fit.
Regenerate all seven resume formats (one-page stays 1 page, full stays 2).

Co-Authored-By: Claude Opus 5.5 (1M context) <noreply@anthropic.com>
Claude-Session: https://claude.ai/code/session_01PduS8BZMNx82gDXaL9XAfc
</commit_message>
<xml_diff>
--- a/public/resume/mohamed-moheyeldin-resume-detailed.docx
+++ b/public/resume/mohamed-moheyeldin-resume-detailed.docx
@@ -79,10 +79,10 @@
           <w:color w:val="171717"/>
           <w:sz w:val="18"/>
         </w:rPr>
-        <w:t>Forward Deployed Engineer on a VA healthcare claims platform, with 11 years in software development and quality engineering across federal, banking, and e-commerce. Work directly with stakeholders from first requirements conversations through demos and feedback. Write React features and built Data Generator &amp; File Processing, which gives developers and QA realistic data where production data can't be used.</w:t>
+        <w:t>Forward Deployed Engineer on a VA healthcare claims platform, with 11 years in software development and quality engineering across federal healthcare, banking, and e-commerce. Integrate health-provider claim-status APIs, write React features, and built Data Generator &amp; File Processing, which replaced hours of daily test-data prep with a 5-minute run. Work directly with stakeholders from first requirements conversations through demos and adoption.</w:t>
         <w:br/>
         <w:br/>
-        <w:t>Work with stakeholders to clarify requirements and acceptance criteria, weigh technical constraints, demo changes, and help teams adopt the tools I build. Hands-on with React, TypeScript, JavaScript, Java, SQL, REST API validation, Tableau dashboards, and CI workflows. Use AI coding assistants for development, debugging, and refactoring.</w:t>
+        <w:t>Most at home in federal and healthcare programs, where production data is off-limits, environments are restricted, and the people using the system need to be in the room. Work with stakeholders to clarify requirements and acceptance criteria, weigh technical constraints, demo changes, and help teams adopt the tools I build. Hands-on with React, TypeScript, JavaScript, Java, SQL, REST APIs, Tableau dashboards, and CI workflows. Use AI coding assistants for development, debugging, and refactoring.</w:t>
       </w:r>
     </w:p>
     <w:p>
@@ -187,6 +187,108 @@
           <w:color w:val="171717"/>
           <w:sz w:val="18"/>
         </w:rPr>
+        <w:t>Work with health providers to integrate APIs with the VA system so live claim statuses display for VA staff, providers, and veterans based on their role; the VA side previously had no continuously updated claim status.</w:t>
+      </w:r>
+    </w:p>
+    <w:p>
+      <w:pPr>
+        <w:pStyle w:val="ListBullet"/>
+        <w:spacing w:after="64" w:line="259" w:lineRule="auto"/>
+        <w:ind w:left="317" w:hanging="173"/>
+      </w:pPr>
+      <w:r>
+        <w:rPr>
+          <w:rFonts w:ascii="Inter" w:hAnsi="Inter"/>
+          <w:b w:val="0"/>
+          <w:i w:val="0"/>
+          <w:color w:val="171717"/>
+          <w:sz w:val="18"/>
+        </w:rPr>
+        <w:t>Responded to stakeholder questions about stalled claims and process gaps by creating a claims framework that notifies the right party when a claim needs extra work, keeping claims moving and giving better tracking of every claim.</w:t>
+      </w:r>
+    </w:p>
+    <w:p>
+      <w:pPr>
+        <w:pStyle w:val="ListBullet"/>
+        <w:spacing w:after="64" w:line="259" w:lineRule="auto"/>
+        <w:ind w:left="317" w:hanging="173"/>
+      </w:pPr>
+      <w:r>
+        <w:rPr>
+          <w:rFonts w:ascii="Inter" w:hAnsi="Inter"/>
+          <w:b w:val="0"/>
+          <w:i w:val="0"/>
+          <w:color w:val="171717"/>
+          <w:sz w:val="18"/>
+        </w:rPr>
+        <w:t>Built and continue to enhance Data Generator &amp; File Processing because production data can't be used in VA lower environments. The team used to spend hours each day preparing data and keeping a database in every environment; now anyone can generate a full development database or up to 10,000 custom records in under 5 minutes, and the whole team uses it daily.</w:t>
+      </w:r>
+    </w:p>
+    <w:p>
+      <w:pPr>
+        <w:pStyle w:val="ListBullet"/>
+        <w:spacing w:after="64" w:line="259" w:lineRule="auto"/>
+        <w:ind w:left="317" w:hanging="173"/>
+      </w:pPr>
+      <w:r>
+        <w:rPr>
+          <w:rFonts w:ascii="Inter" w:hAnsi="Inter"/>
+          <w:b w:val="0"/>
+          <w:i w:val="0"/>
+          <w:color w:val="171717"/>
+          <w:sz w:val="18"/>
+        </w:rPr>
+        <w:t>Run the tool like a product: versioned Windows releases built through GitHub Actions, in-app release notes, a user guide, a stakeholder overview, and release updates for the team; added Excel file processing with duplicate detection as a second workflow when team needs grew.</w:t>
+      </w:r>
+    </w:p>
+    <w:p>
+      <w:pPr>
+        <w:pStyle w:val="ListBullet"/>
+        <w:spacing w:after="64" w:line="259" w:lineRule="auto"/>
+        <w:ind w:left="317" w:hanging="173"/>
+      </w:pPr>
+      <w:r>
+        <w:rPr>
+          <w:rFonts w:ascii="Inter" w:hAnsi="Inter"/>
+          <w:b w:val="0"/>
+          <w:i w:val="0"/>
+          <w:color w:val="171717"/>
+          <w:sz w:val="18"/>
+        </w:rPr>
+        <w:t>Enabled the team to use Tableau for requests and system information so any user can build their own dashboard; built custom dashboards for VA and internal users and, through repeated VA stakeholder discussions, expanded Tableau into the main way to monitor server health and system status.</w:t>
+      </w:r>
+    </w:p>
+    <w:p>
+      <w:pPr>
+        <w:pStyle w:val="ListBullet"/>
+        <w:spacing w:after="64" w:line="259" w:lineRule="auto"/>
+        <w:ind w:left="317" w:hanging="173"/>
+      </w:pPr>
+      <w:r>
+        <w:rPr>
+          <w:rFonts w:ascii="Inter" w:hAnsi="Inter"/>
+          <w:b w:val="0"/>
+          <w:i w:val="0"/>
+          <w:color w:val="171717"/>
+          <w:sz w:val="18"/>
+        </w:rPr>
+        <w:t>Contribute React, TypeScript, and JavaScript features that turn stakeholder feedback into improvements to the claims application.</w:t>
+      </w:r>
+    </w:p>
+    <w:p>
+      <w:pPr>
+        <w:pStyle w:val="ListBullet"/>
+        <w:spacing w:after="64" w:line="259" w:lineRule="auto"/>
+        <w:ind w:left="317" w:hanging="173"/>
+      </w:pPr>
+      <w:r>
+        <w:rPr>
+          <w:rFonts w:ascii="Inter" w:hAnsi="Inter"/>
+          <w:b w:val="0"/>
+          <w:i w:val="0"/>
+          <w:color w:val="171717"/>
+          <w:sz w:val="18"/>
+        </w:rPr>
         <w:t>Work directly with VA stakeholders to map healthcare claims workflows, clarify technical and operational constraints, and define requirements and acceptance criteria for claim submission, provider updates, status tracking, and payment visibility.</w:t>
       </w:r>
     </w:p>
@@ -238,109 +340,7 @@
           <w:color w:val="171717"/>
           <w:sz w:val="18"/>
         </w:rPr>
-        <w:t>Work with health providers to integrate APIs with the VA system so live claim statuses display for VA staff, providers, and veterans based on their role; the VA side previously had no continuously updated claim status.</w:t>
-      </w:r>
-    </w:p>
-    <w:p>
-      <w:pPr>
-        <w:pStyle w:val="ListBullet"/>
-        <w:spacing w:after="64" w:line="259" w:lineRule="auto"/>
-        <w:ind w:left="317" w:hanging="173"/>
-      </w:pPr>
-      <w:r>
-        <w:rPr>
-          <w:rFonts w:ascii="Inter" w:hAnsi="Inter"/>
-          <w:b w:val="0"/>
-          <w:i w:val="0"/>
-          <w:color w:val="171717"/>
-          <w:sz w:val="18"/>
-        </w:rPr>
-        <w:t>Responded to stakeholder questions about stalled claims and process gaps by creating a claims framework that notifies the right party when a claim needs extra work, keeping claims moving and giving better tracking of every claim.</w:t>
-      </w:r>
-    </w:p>
-    <w:p>
-      <w:pPr>
-        <w:pStyle w:val="ListBullet"/>
-        <w:spacing w:after="64" w:line="259" w:lineRule="auto"/>
-        <w:ind w:left="317" w:hanging="173"/>
-      </w:pPr>
-      <w:r>
-        <w:rPr>
-          <w:rFonts w:ascii="Inter" w:hAnsi="Inter"/>
-          <w:b w:val="0"/>
-          <w:i w:val="0"/>
-          <w:color w:val="171717"/>
-          <w:sz w:val="18"/>
-        </w:rPr>
-        <w:t>Enabled the team to use Tableau for requests and system information so any user can build their own dashboard; built custom dashboards for VA and internal users and, through repeated VA stakeholder discussions, expanded Tableau into the main way to monitor server health and system status.</w:t>
-      </w:r>
-    </w:p>
-    <w:p>
-      <w:pPr>
-        <w:pStyle w:val="ListBullet"/>
-        <w:spacing w:after="64" w:line="259" w:lineRule="auto"/>
-        <w:ind w:left="317" w:hanging="173"/>
-      </w:pPr>
-      <w:r>
-        <w:rPr>
-          <w:rFonts w:ascii="Inter" w:hAnsi="Inter"/>
-          <w:b w:val="0"/>
-          <w:i w:val="0"/>
-          <w:color w:val="171717"/>
-          <w:sz w:val="18"/>
-        </w:rPr>
-        <w:t>Contribute React, TypeScript, and JavaScript features that turn stakeholder feedback into improvements to the claims application.</w:t>
-      </w:r>
-    </w:p>
-    <w:p>
-      <w:pPr>
-        <w:pStyle w:val="ListBullet"/>
-        <w:spacing w:after="64" w:line="259" w:lineRule="auto"/>
-        <w:ind w:left="317" w:hanging="173"/>
-      </w:pPr>
-      <w:r>
-        <w:rPr>
-          <w:rFonts w:ascii="Inter" w:hAnsi="Inter"/>
-          <w:b w:val="0"/>
-          <w:i w:val="0"/>
-          <w:color w:val="171717"/>
-          <w:sz w:val="18"/>
-        </w:rPr>
         <w:t>Investigate defects and data discrepancies across frontend, backend, and MySQL data; coordinate with developers and stakeholders to resolve delivery dependencies, and document progress, blockers, and operational impact in Jira.</w:t>
-      </w:r>
-    </w:p>
-    <w:p>
-      <w:pPr>
-        <w:pStyle w:val="ListBullet"/>
-        <w:spacing w:after="64" w:line="259" w:lineRule="auto"/>
-        <w:ind w:left="317" w:hanging="173"/>
-      </w:pPr>
-      <w:r>
-        <w:rPr>
-          <w:rFonts w:ascii="Inter" w:hAnsi="Inter"/>
-          <w:b w:val="0"/>
-          <w:i w:val="0"/>
-          <w:color w:val="171717"/>
-          <w:sz w:val="18"/>
-        </w:rPr>
-        <w:t>Built and continue to enhance Data Generator &amp; File Processing because production data can't be used in VA lower environments. The team used to spend hours each day preparing data and keeping a database in every environment; now anyone can generate a full development database or up to 10,000 custom records in under 5 minutes, and the whole team uses it daily.</w:t>
-      </w:r>
-    </w:p>
-    <w:p>
-      <w:pPr>
-        <w:pStyle w:val="ListBullet"/>
-        <w:spacing w:after="64" w:line="259" w:lineRule="auto"/>
-        <w:ind w:left="317" w:hanging="173"/>
-      </w:pPr>
-      <w:r>
-        <w:rPr>
-          <w:rFonts w:ascii="Inter" w:hAnsi="Inter"/>
-          <w:b w:val="0"/>
-          <w:i w:val="0"/>
-          <w:color w:val="171717"/>
-          <w:sz w:val="18"/>
-        </w:rPr>
-        <w:t>Run the tool like a product: versioned Windows releases built through GitHub Actions, in-app release notes, a user guide, a stakeholder overview, and release updates for the team; added Excel file processing with duplicate detection as a second workflow when team needs grew.</w:t>
       </w:r>
     </w:p>
     <w:p>

</xml_diff>

<commit_message>
Lead with built work, add project metrics and a Work with me section (#17)
Reorder projects so integration and tooling work comes before testing,
add an optional metric per project (documented or user-reported figures
only), position the profile around federal and healthcare work, and add
a home page section with the AI workflow audit offer and FDE role fit.
Regenerate all seven resume formats (one-page stays 1 page, full stays 2).


Claude-Session: https://claude.ai/code/session_01PduS8BZMNx82gDXaL9XAfc

Co-authored-by: Claude <noreply@anthropic.com>
</commit_message>
<xml_diff>
--- a/public/resume/mohamed-moheyeldin-resume-detailed.docx
+++ b/public/resume/mohamed-moheyeldin-resume-detailed.docx
@@ -79,10 +79,10 @@
           <w:color w:val="171717"/>
           <w:sz w:val="18"/>
         </w:rPr>
-        <w:t>Forward Deployed Engineer on a VA healthcare claims platform, with 11 years in software development and quality engineering across federal, banking, and e-commerce. Work directly with stakeholders from first requirements conversations through demos and feedback. Write React features and built Data Generator &amp; File Processing, which gives developers and QA realistic data where production data can't be used.</w:t>
+        <w:t>Forward Deployed Engineer on a VA healthcare claims platform, with 11 years in software development and quality engineering across federal healthcare, banking, and e-commerce. Integrate health-provider claim-status APIs, write React features, and built Data Generator &amp; File Processing, which replaced hours of daily test-data prep with a 5-minute run. Work directly with stakeholders from first requirements conversations through demos and adoption.</w:t>
         <w:br/>
         <w:br/>
-        <w:t>Work with stakeholders to clarify requirements and acceptance criteria, weigh technical constraints, demo changes, and help teams adopt the tools I build. Hands-on with React, TypeScript, JavaScript, Java, SQL, REST API validation, Tableau dashboards, and CI workflows. Use AI coding assistants for development, debugging, and refactoring.</w:t>
+        <w:t>Most at home in federal and healthcare programs, where production data is off-limits, environments are restricted, and the people using the system need to be in the room. Work with stakeholders to clarify requirements and acceptance criteria, weigh technical constraints, demo changes, and help teams adopt the tools I build. Hands-on with React, TypeScript, JavaScript, Java, SQL, REST APIs, Tableau dashboards, and CI workflows. Use AI coding assistants for development, debugging, and refactoring.</w:t>
       </w:r>
     </w:p>
     <w:p>
@@ -187,6 +187,108 @@
           <w:color w:val="171717"/>
           <w:sz w:val="18"/>
         </w:rPr>
+        <w:t>Work with health providers to integrate APIs with the VA system so live claim statuses display for VA staff, providers, and veterans based on their role; the VA side previously had no continuously updated claim status.</w:t>
+      </w:r>
+    </w:p>
+    <w:p>
+      <w:pPr>
+        <w:pStyle w:val="ListBullet"/>
+        <w:spacing w:after="64" w:line="259" w:lineRule="auto"/>
+        <w:ind w:left="317" w:hanging="173"/>
+      </w:pPr>
+      <w:r>
+        <w:rPr>
+          <w:rFonts w:ascii="Inter" w:hAnsi="Inter"/>
+          <w:b w:val="0"/>
+          <w:i w:val="0"/>
+          <w:color w:val="171717"/>
+          <w:sz w:val="18"/>
+        </w:rPr>
+        <w:t>Responded to stakeholder questions about stalled claims and process gaps by creating a claims framework that notifies the right party when a claim needs extra work, keeping claims moving and giving better tracking of every claim.</w:t>
+      </w:r>
+    </w:p>
+    <w:p>
+      <w:pPr>
+        <w:pStyle w:val="ListBullet"/>
+        <w:spacing w:after="64" w:line="259" w:lineRule="auto"/>
+        <w:ind w:left="317" w:hanging="173"/>
+      </w:pPr>
+      <w:r>
+        <w:rPr>
+          <w:rFonts w:ascii="Inter" w:hAnsi="Inter"/>
+          <w:b w:val="0"/>
+          <w:i w:val="0"/>
+          <w:color w:val="171717"/>
+          <w:sz w:val="18"/>
+        </w:rPr>
+        <w:t>Built and continue to enhance Data Generator &amp; File Processing because production data can't be used in VA lower environments. The team used to spend hours each day preparing data and keeping a database in every environment; now anyone can generate a full development database or up to 10,000 custom records in under 5 minutes, and the whole team uses it daily.</w:t>
+      </w:r>
+    </w:p>
+    <w:p>
+      <w:pPr>
+        <w:pStyle w:val="ListBullet"/>
+        <w:spacing w:after="64" w:line="259" w:lineRule="auto"/>
+        <w:ind w:left="317" w:hanging="173"/>
+      </w:pPr>
+      <w:r>
+        <w:rPr>
+          <w:rFonts w:ascii="Inter" w:hAnsi="Inter"/>
+          <w:b w:val="0"/>
+          <w:i w:val="0"/>
+          <w:color w:val="171717"/>
+          <w:sz w:val="18"/>
+        </w:rPr>
+        <w:t>Run the tool like a product: versioned Windows releases built through GitHub Actions, in-app release notes, a user guide, a stakeholder overview, and release updates for the team; added Excel file processing with duplicate detection as a second workflow when team needs grew.</w:t>
+      </w:r>
+    </w:p>
+    <w:p>
+      <w:pPr>
+        <w:pStyle w:val="ListBullet"/>
+        <w:spacing w:after="64" w:line="259" w:lineRule="auto"/>
+        <w:ind w:left="317" w:hanging="173"/>
+      </w:pPr>
+      <w:r>
+        <w:rPr>
+          <w:rFonts w:ascii="Inter" w:hAnsi="Inter"/>
+          <w:b w:val="0"/>
+          <w:i w:val="0"/>
+          <w:color w:val="171717"/>
+          <w:sz w:val="18"/>
+        </w:rPr>
+        <w:t>Enabled the team to use Tableau for requests and system information so any user can build their own dashboard; built custom dashboards for VA and internal users and, through repeated VA stakeholder discussions, expanded Tableau into the main way to monitor server health and system status.</w:t>
+      </w:r>
+    </w:p>
+    <w:p>
+      <w:pPr>
+        <w:pStyle w:val="ListBullet"/>
+        <w:spacing w:after="64" w:line="259" w:lineRule="auto"/>
+        <w:ind w:left="317" w:hanging="173"/>
+      </w:pPr>
+      <w:r>
+        <w:rPr>
+          <w:rFonts w:ascii="Inter" w:hAnsi="Inter"/>
+          <w:b w:val="0"/>
+          <w:i w:val="0"/>
+          <w:color w:val="171717"/>
+          <w:sz w:val="18"/>
+        </w:rPr>
+        <w:t>Contribute React, TypeScript, and JavaScript features that turn stakeholder feedback into improvements to the claims application.</w:t>
+      </w:r>
+    </w:p>
+    <w:p>
+      <w:pPr>
+        <w:pStyle w:val="ListBullet"/>
+        <w:spacing w:after="64" w:line="259" w:lineRule="auto"/>
+        <w:ind w:left="317" w:hanging="173"/>
+      </w:pPr>
+      <w:r>
+        <w:rPr>
+          <w:rFonts w:ascii="Inter" w:hAnsi="Inter"/>
+          <w:b w:val="0"/>
+          <w:i w:val="0"/>
+          <w:color w:val="171717"/>
+          <w:sz w:val="18"/>
+        </w:rPr>
         <w:t>Work directly with VA stakeholders to map healthcare claims workflows, clarify technical and operational constraints, and define requirements and acceptance criteria for claim submission, provider updates, status tracking, and payment visibility.</w:t>
       </w:r>
     </w:p>
@@ -238,109 +340,7 @@
           <w:color w:val="171717"/>
           <w:sz w:val="18"/>
         </w:rPr>
-        <w:t>Work with health providers to integrate APIs with the VA system so live claim statuses display for VA staff, providers, and veterans based on their role; the VA side previously had no continuously updated claim status.</w:t>
-      </w:r>
-    </w:p>
-    <w:p>
-      <w:pPr>
-        <w:pStyle w:val="ListBullet"/>
-        <w:spacing w:after="64" w:line="259" w:lineRule="auto"/>
-        <w:ind w:left="317" w:hanging="173"/>
-      </w:pPr>
-      <w:r>
-        <w:rPr>
-          <w:rFonts w:ascii="Inter" w:hAnsi="Inter"/>
-          <w:b w:val="0"/>
-          <w:i w:val="0"/>
-          <w:color w:val="171717"/>
-          <w:sz w:val="18"/>
-        </w:rPr>
-        <w:t>Responded to stakeholder questions about stalled claims and process gaps by creating a claims framework that notifies the right party when a claim needs extra work, keeping claims moving and giving better tracking of every claim.</w:t>
-      </w:r>
-    </w:p>
-    <w:p>
-      <w:pPr>
-        <w:pStyle w:val="ListBullet"/>
-        <w:spacing w:after="64" w:line="259" w:lineRule="auto"/>
-        <w:ind w:left="317" w:hanging="173"/>
-      </w:pPr>
-      <w:r>
-        <w:rPr>
-          <w:rFonts w:ascii="Inter" w:hAnsi="Inter"/>
-          <w:b w:val="0"/>
-          <w:i w:val="0"/>
-          <w:color w:val="171717"/>
-          <w:sz w:val="18"/>
-        </w:rPr>
-        <w:t>Enabled the team to use Tableau for requests and system information so any user can build their own dashboard; built custom dashboards for VA and internal users and, through repeated VA stakeholder discussions, expanded Tableau into the main way to monitor server health and system status.</w:t>
-      </w:r>
-    </w:p>
-    <w:p>
-      <w:pPr>
-        <w:pStyle w:val="ListBullet"/>
-        <w:spacing w:after="64" w:line="259" w:lineRule="auto"/>
-        <w:ind w:left="317" w:hanging="173"/>
-      </w:pPr>
-      <w:r>
-        <w:rPr>
-          <w:rFonts w:ascii="Inter" w:hAnsi="Inter"/>
-          <w:b w:val="0"/>
-          <w:i w:val="0"/>
-          <w:color w:val="171717"/>
-          <w:sz w:val="18"/>
-        </w:rPr>
-        <w:t>Contribute React, TypeScript, and JavaScript features that turn stakeholder feedback into improvements to the claims application.</w:t>
-      </w:r>
-    </w:p>
-    <w:p>
-      <w:pPr>
-        <w:pStyle w:val="ListBullet"/>
-        <w:spacing w:after="64" w:line="259" w:lineRule="auto"/>
-        <w:ind w:left="317" w:hanging="173"/>
-      </w:pPr>
-      <w:r>
-        <w:rPr>
-          <w:rFonts w:ascii="Inter" w:hAnsi="Inter"/>
-          <w:b w:val="0"/>
-          <w:i w:val="0"/>
-          <w:color w:val="171717"/>
-          <w:sz w:val="18"/>
-        </w:rPr>
         <w:t>Investigate defects and data discrepancies across frontend, backend, and MySQL data; coordinate with developers and stakeholders to resolve delivery dependencies, and document progress, blockers, and operational impact in Jira.</w:t>
-      </w:r>
-    </w:p>
-    <w:p>
-      <w:pPr>
-        <w:pStyle w:val="ListBullet"/>
-        <w:spacing w:after="64" w:line="259" w:lineRule="auto"/>
-        <w:ind w:left="317" w:hanging="173"/>
-      </w:pPr>
-      <w:r>
-        <w:rPr>
-          <w:rFonts w:ascii="Inter" w:hAnsi="Inter"/>
-          <w:b w:val="0"/>
-          <w:i w:val="0"/>
-          <w:color w:val="171717"/>
-          <w:sz w:val="18"/>
-        </w:rPr>
-        <w:t>Built and continue to enhance Data Generator &amp; File Processing because production data can't be used in VA lower environments. The team used to spend hours each day preparing data and keeping a database in every environment; now anyone can generate a full development database or up to 10,000 custom records in under 5 minutes, and the whole team uses it daily.</w:t>
-      </w:r>
-    </w:p>
-    <w:p>
-      <w:pPr>
-        <w:pStyle w:val="ListBullet"/>
-        <w:spacing w:after="64" w:line="259" w:lineRule="auto"/>
-        <w:ind w:left="317" w:hanging="173"/>
-      </w:pPr>
-      <w:r>
-        <w:rPr>
-          <w:rFonts w:ascii="Inter" w:hAnsi="Inter"/>
-          <w:b w:val="0"/>
-          <w:i w:val="0"/>
-          <w:color w:val="171717"/>
-          <w:sz w:val="18"/>
-        </w:rPr>
-        <w:t>Run the tool like a product: versioned Windows releases built through GitHub Actions, in-app release notes, a user guide, a stakeholder overview, and release updates for the team; added Excel file processing with duplicate detection as a second workflow when team needs grew.</w:t>
       </w:r>
     </w:p>
     <w:p>

</xml_diff>

<commit_message>
Add the Claims Document Assistant case study and resume entry
Add the Claude-based claims document assistant as an independent project
ahead of the testing work, with its 17-field metric and no unmeasured AI
accuracy figures. Resumes list it as the selected project (one-page) and
before the portfolio project (detailed); one-page stays 1 page and full
stays 2.

Co-Authored-By: Claude Opus 5.5 (1M context) <noreply@anthropic.com>
Claude-Session: https://claude.ai/code/session_01PduS8BZMNx82gDXaL9XAfc
</commit_message>
<xml_diff>
--- a/public/resume/mohamed-moheyeldin-resume-detailed.docx
+++ b/public/resume/mohamed-moheyeldin-resume-detailed.docx
@@ -82,7 +82,7 @@
         <w:t>Forward Deployed Engineer on a VA healthcare claims platform, with 11 years in software development and quality engineering across federal healthcare, banking, and e-commerce. Integrate health-provider claim-status APIs, write React features, and built Data Generator &amp; File Processing, which replaced hours of daily test-data prep with a 5-minute run. Work directly with stakeholders from first requirements conversations through demos and adoption.</w:t>
         <w:br/>
         <w:br/>
-        <w:t>Most at home in federal and healthcare programs, where production data is off-limits, environments are restricted, and the people using the system need to be in the room. Work with stakeholders to clarify requirements and acceptance criteria, weigh technical constraints, demo changes, and help teams adopt the tools I build. Hands-on with React, TypeScript, JavaScript, Java, SQL, REST APIs, Tableau dashboards, and CI workflows. Use AI coding assistants for development, debugging, and refactoring.</w:t>
+        <w:t>Most at home in federal and healthcare programs, where production data is off-limits, environments are restricted, and the people using the system need to be in the room. Work with stakeholders to clarify requirements and acceptance criteria, weigh technical constraints, demo changes, and help teams adopt the tools I build. Hands-on with React, TypeScript, JavaScript, Java, SQL, REST APIs, Tableau dashboards, and CI workflows. Built a Claude-based claims document assistant with human review, and use AI coding assistants for development, debugging, and refactoring.</w:t>
       </w:r>
     </w:p>
     <w:p>
@@ -542,23 +542,6 @@
     </w:p>
     <w:p>
       <w:pPr>
-        <w:pStyle w:val="ListBullet"/>
-        <w:spacing w:after="64" w:line="259" w:lineRule="auto"/>
-        <w:ind w:left="317" w:hanging="173"/>
-      </w:pPr>
-      <w:r>
-        <w:rPr>
-          <w:rFonts w:ascii="Inter" w:hAnsi="Inter"/>
-          <w:b w:val="0"/>
-          <w:i w:val="0"/>
-          <w:color w:val="171717"/>
-          <w:sz w:val="18"/>
-        </w:rPr>
-        <w:t>Investigated user-facing issues across browsers, devices, and resolutions with Applitools Eyes and browser automation evidence, using screenshots, videos, retries, and run durations to trace failures.</w:t>
-      </w:r>
-    </w:p>
-    <w:p>
-      <w:pPr>
         <w:keepNext/>
         <w:spacing w:before="140" w:after="0"/>
       </w:pPr>
@@ -662,23 +645,6 @@
           <w:color w:val="171717"/>
           <w:sz w:val="18"/>
         </w:rPr>
-        <w:t>Validated responsive and cross-browser behavior across Chrome, Firefox, Safari, and Edge to identify inconsistent user experiences.</w:t>
-      </w:r>
-    </w:p>
-    <w:p>
-      <w:pPr>
-        <w:pStyle w:val="ListBullet"/>
-        <w:spacing w:after="64" w:line="259" w:lineRule="auto"/>
-        <w:ind w:left="317" w:hanging="173"/>
-      </w:pPr>
-      <w:r>
-        <w:rPr>
-          <w:rFonts w:ascii="Inter" w:hAnsi="Inter"/>
-          <w:b w:val="0"/>
-          <w:i w:val="0"/>
-          <w:color w:val="171717"/>
-          <w:sz w:val="18"/>
-        </w:rPr>
         <w:t>Created reproducible Jira defect reports with environment details and business impact; collaborated with developers to investigate causes and verify fixes.</w:t>
       </w:r>
     </w:p>
@@ -729,7 +695,22 @@
           <w:color w:val="1447E6"/>
           <w:sz w:val="24"/>
         </w:rPr>
-        <w:t>Selected project</w:t>
+        <w:t>Selected projects</w:t>
+      </w:r>
+    </w:p>
+    <w:p>
+      <w:pPr>
+        <w:spacing w:after="100" w:line="269" w:lineRule="auto"/>
+      </w:pPr>
+      <w:r>
+        <w:rPr>
+          <w:rFonts w:ascii="Inter" w:hAnsi="Inter"/>
+          <w:b w:val="0"/>
+          <w:i w:val="0"/>
+          <w:color w:val="171717"/>
+          <w:sz w:val="18"/>
+        </w:rPr>
+        <w:t>Claims Document Assistant: Claude API assistant that extracts 17 fields from claim PDFs, flags gaps with fixed rules, and drafts replies a reviewer approves; 26 tests. github.com/mohamedmoheyeldin/claims-document-assistant</w:t>
       </w:r>
     </w:p>
     <w:p>
@@ -820,7 +801,7 @@
           <w:color w:val="171717"/>
           <w:sz w:val="18"/>
         </w:rPr>
-        <w:t>AI-assisted engineering: GitHub Copilot, VS Code, GPT models, Claude, Gemini</w:t>
+        <w:t>AI-assisted engineering: Claude API, GitHub Copilot, VS Code, GPT models, Claude, Gemini</w:t>
       </w:r>
     </w:p>
     <w:p>

</xml_diff>

<commit_message>
Add the Claims Document Assistant case study and resume entry (#19)
Add the Claude-based claims document assistant as an independent project
ahead of the testing work, with its 17-field metric and no unmeasured AI
accuracy figures. Resumes list it as the selected project (one-page) and
before the portfolio project (detailed); one-page stays 1 page and full
stays 2.


Claude-Session: https://claude.ai/code/session_01PduS8BZMNx82gDXaL9XAfc

Co-authored-by: Claude <noreply@anthropic.com>
</commit_message>
<xml_diff>
--- a/public/resume/mohamed-moheyeldin-resume-detailed.docx
+++ b/public/resume/mohamed-moheyeldin-resume-detailed.docx
@@ -82,7 +82,7 @@
         <w:t>Forward Deployed Engineer on a VA healthcare claims platform, with 11 years in software development and quality engineering across federal healthcare, banking, and e-commerce. Integrate health-provider claim-status APIs, write React features, and built Data Generator &amp; File Processing, which replaced hours of daily test-data prep with a 5-minute run. Work directly with stakeholders from first requirements conversations through demos and adoption.</w:t>
         <w:br/>
         <w:br/>
-        <w:t>Most at home in federal and healthcare programs, where production data is off-limits, environments are restricted, and the people using the system need to be in the room. Work with stakeholders to clarify requirements and acceptance criteria, weigh technical constraints, demo changes, and help teams adopt the tools I build. Hands-on with React, TypeScript, JavaScript, Java, SQL, REST APIs, Tableau dashboards, and CI workflows. Use AI coding assistants for development, debugging, and refactoring.</w:t>
+        <w:t>Most at home in federal and healthcare programs, where production data is off-limits, environments are restricted, and the people using the system need to be in the room. Work with stakeholders to clarify requirements and acceptance criteria, weigh technical constraints, demo changes, and help teams adopt the tools I build. Hands-on with React, TypeScript, JavaScript, Java, SQL, REST APIs, Tableau dashboards, and CI workflows. Built a Claude-based claims document assistant with human review, and use AI coding assistants for development, debugging, and refactoring.</w:t>
       </w:r>
     </w:p>
     <w:p>
@@ -542,23 +542,6 @@
     </w:p>
     <w:p>
       <w:pPr>
-        <w:pStyle w:val="ListBullet"/>
-        <w:spacing w:after="64" w:line="259" w:lineRule="auto"/>
-        <w:ind w:left="317" w:hanging="173"/>
-      </w:pPr>
-      <w:r>
-        <w:rPr>
-          <w:rFonts w:ascii="Inter" w:hAnsi="Inter"/>
-          <w:b w:val="0"/>
-          <w:i w:val="0"/>
-          <w:color w:val="171717"/>
-          <w:sz w:val="18"/>
-        </w:rPr>
-        <w:t>Investigated user-facing issues across browsers, devices, and resolutions with Applitools Eyes and browser automation evidence, using screenshots, videos, retries, and run durations to trace failures.</w:t>
-      </w:r>
-    </w:p>
-    <w:p>
-      <w:pPr>
         <w:keepNext/>
         <w:spacing w:before="140" w:after="0"/>
       </w:pPr>
@@ -662,23 +645,6 @@
           <w:color w:val="171717"/>
           <w:sz w:val="18"/>
         </w:rPr>
-        <w:t>Validated responsive and cross-browser behavior across Chrome, Firefox, Safari, and Edge to identify inconsistent user experiences.</w:t>
-      </w:r>
-    </w:p>
-    <w:p>
-      <w:pPr>
-        <w:pStyle w:val="ListBullet"/>
-        <w:spacing w:after="64" w:line="259" w:lineRule="auto"/>
-        <w:ind w:left="317" w:hanging="173"/>
-      </w:pPr>
-      <w:r>
-        <w:rPr>
-          <w:rFonts w:ascii="Inter" w:hAnsi="Inter"/>
-          <w:b w:val="0"/>
-          <w:i w:val="0"/>
-          <w:color w:val="171717"/>
-          <w:sz w:val="18"/>
-        </w:rPr>
         <w:t>Created reproducible Jira defect reports with environment details and business impact; collaborated with developers to investigate causes and verify fixes.</w:t>
       </w:r>
     </w:p>
@@ -729,7 +695,22 @@
           <w:color w:val="1447E6"/>
           <w:sz w:val="24"/>
         </w:rPr>
-        <w:t>Selected project</w:t>
+        <w:t>Selected projects</w:t>
+      </w:r>
+    </w:p>
+    <w:p>
+      <w:pPr>
+        <w:spacing w:after="100" w:line="269" w:lineRule="auto"/>
+      </w:pPr>
+      <w:r>
+        <w:rPr>
+          <w:rFonts w:ascii="Inter" w:hAnsi="Inter"/>
+          <w:b w:val="0"/>
+          <w:i w:val="0"/>
+          <w:color w:val="171717"/>
+          <w:sz w:val="18"/>
+        </w:rPr>
+        <w:t>Claims Document Assistant: Claude API assistant that extracts 17 fields from claim PDFs, flags gaps with fixed rules, and drafts replies a reviewer approves; 26 tests. github.com/mohamedmoheyeldin/claims-document-assistant</w:t>
       </w:r>
     </w:p>
     <w:p>
@@ -820,7 +801,7 @@
           <w:color w:val="171717"/>
           <w:sz w:val="18"/>
         </w:rPr>
-        <w:t>AI-assisted engineering: GitHub Copilot, VS Code, GPT models, Claude, Gemini</w:t>
+        <w:t>AI-assisted engineering: Claude API, GitHub Copilot, VS Code, GPT models, Claude, Gemini</w:t>
       </w:r>
     </w:p>
     <w:p>

</xml_diff>

<commit_message>
Add the Claude palette, a signature intro and a page-long string with a knot close
Switch the tokens to the Claude palette (cream, near-black, coral signal, clay
text accent) and regenerate the PDF and Word resumes. Open the home page on a
signature that writes itself, once per visit. Draw one coral string down the
whole page with a ring on its tip, wrapping headings and swinging through the
scene words, ending in a knot that pulls into a check mark. Put the
capabilities on an arc and rework the system section's motion and tabs.

Co-Authored-By: Claude Opus 5.5 <noreply@anthropic.com>
</commit_message>
<xml_diff>
--- a/public/resume/mohamed-moheyeldin-resume-detailed.docx
+++ b/public/resume/mohamed-moheyeldin-resume-detailed.docx
@@ -13,7 +13,7 @@
           <w:rFonts w:ascii="Inter" w:hAnsi="Inter"/>
           <w:b/>
           <w:i w:val="0"/>
-          <w:color w:val="0D1117"/>
+          <w:color w:val="141413"/>
           <w:sz w:val="46"/>
         </w:rPr>
         <w:t>Mohamed Moheyeldin</w:t>
@@ -29,7 +29,7 @@
           <w:rFonts w:ascii="Inter" w:hAnsi="Inter"/>
           <w:b/>
           <w:i w:val="0"/>
-          <w:color w:val="0A6B5D"/>
+          <w:color w:val="9C4128"/>
           <w:sz w:val="22"/>
         </w:rPr>
         <w:t>Forward Deployed Engineer</w:t>
@@ -45,7 +45,7 @@
           <w:rFonts w:ascii="Inter" w:hAnsi="Inter"/>
           <w:b w:val="0"/>
           <w:i w:val="0"/>
-          <w:color w:val="56606C"/>
+          <w:color w:val="5E5D59"/>
           <w:sz w:val="16"/>
         </w:rPr>
         <w:t>Reston, VA 20191  |  mohamedmoheyeldin.com  |  mohamedmoheyeldin.jobs@gmail.com  |  linkedin.com/in/moheyeldin  |  github.com/mohamedmoheyeldin</w:t>
@@ -61,7 +61,7 @@
           <w:rFonts w:ascii="Inter" w:hAnsi="Inter"/>
           <w:b/>
           <w:i w:val="0"/>
-          <w:color w:val="0A6B5D"/>
+          <w:color w:val="9C4128"/>
           <w:sz w:val="24"/>
         </w:rPr>
         <w:t>Professional profile</w:t>
@@ -76,7 +76,7 @@
           <w:rFonts w:ascii="Inter" w:hAnsi="Inter"/>
           <w:b w:val="0"/>
           <w:i w:val="0"/>
-          <w:color w:val="0D1117"/>
+          <w:color w:val="141413"/>
           <w:sz w:val="18"/>
         </w:rPr>
         <w:t>Forward Deployed Engineer on a VA healthcare claims platform, with 11 years in software development and quality engineering across federal healthcare, banking, and e-commerce. Integrate health-provider claim-status APIs, write React features, and built Data Generator &amp; File Processing, which replaced hours of daily test-data prep with a 5-minute run. Work directly with stakeholders from first requirements conversations through demos and adoption.</w:t>
@@ -95,7 +95,7 @@
           <w:rFonts w:ascii="Inter" w:hAnsi="Inter"/>
           <w:b/>
           <w:i w:val="0"/>
-          <w:color w:val="0A6B5D"/>
+          <w:color w:val="9C4128"/>
           <w:sz w:val="24"/>
         </w:rPr>
         <w:t>Professional experience</w:t>
@@ -111,7 +111,7 @@
           <w:rFonts w:ascii="Inter" w:hAnsi="Inter"/>
           <w:b/>
           <w:i w:val="0"/>
-          <w:color w:val="0D1117"/>
+          <w:color w:val="141413"/>
           <w:sz w:val="20"/>
         </w:rPr>
         <w:t>Booz Allen Hamilton — Washington, DC</w:t>
@@ -127,7 +127,7 @@
           <w:rFonts w:ascii="Inter" w:hAnsi="Inter"/>
           <w:b/>
           <w:i w:val="0"/>
-          <w:color w:val="0D1117"/>
+          <w:color w:val="141413"/>
           <w:sz w:val="19"/>
         </w:rPr>
         <w:t>Forward Deployed Engineer (FDE)</w:t>
@@ -137,7 +137,7 @@
           <w:rFonts w:ascii="Inter" w:hAnsi="Inter"/>
           <w:b w:val="0"/>
           <w:i w:val="0"/>
-          <w:color w:val="56606C"/>
+          <w:color w:val="5E5D59"/>
           <w:sz w:val="16"/>
         </w:rPr>
         <w:t xml:space="preserve">  |  Dec 2020 – Present</w:t>
@@ -152,7 +152,7 @@
           <w:rFonts w:ascii="Inter" w:hAnsi="Inter"/>
           <w:b w:val="0"/>
           <w:i w:val="0"/>
-          <w:color w:val="0D1117"/>
+          <w:color w:val="141413"/>
           <w:sz w:val="18"/>
         </w:rPr>
         <w:t>Customer: U.S. Department of Veterans Affairs (VA)</w:t>
@@ -167,7 +167,7 @@
           <w:rFonts w:ascii="Inter" w:hAnsi="Inter"/>
           <w:b w:val="0"/>
           <w:i/>
-          <w:color w:val="56606C"/>
+          <w:color w:val="5E5D59"/>
           <w:sz w:val="18"/>
         </w:rPr>
         <w:t>Work directly with VA stakeholders on a healthcare claims platform with two frontends sharing a database, supporting claim submission, provider updates, claim progress and status tracking, and payment visibility.</w:t>
@@ -184,7 +184,7 @@
           <w:rFonts w:ascii="Inter" w:hAnsi="Inter"/>
           <w:b w:val="0"/>
           <w:i w:val="0"/>
-          <w:color w:val="0D1117"/>
+          <w:color w:val="141413"/>
           <w:sz w:val="18"/>
         </w:rPr>
         <w:t>Work with health providers to integrate APIs with the VA system so live claim statuses display for VA staff, providers, and veterans based on their role; the VA side previously had no continuously updated claim status.</w:t>
@@ -201,7 +201,7 @@
           <w:rFonts w:ascii="Inter" w:hAnsi="Inter"/>
           <w:b w:val="0"/>
           <w:i w:val="0"/>
-          <w:color w:val="0D1117"/>
+          <w:color w:val="141413"/>
           <w:sz w:val="18"/>
         </w:rPr>
         <w:t>Responded to stakeholder questions about stalled claims and process gaps by creating a claims framework that notifies the right party when a claim needs extra work, keeping claims moving and giving better tracking of every claim.</w:t>
@@ -218,7 +218,7 @@
           <w:rFonts w:ascii="Inter" w:hAnsi="Inter"/>
           <w:b w:val="0"/>
           <w:i w:val="0"/>
-          <w:color w:val="0D1117"/>
+          <w:color w:val="141413"/>
           <w:sz w:val="18"/>
         </w:rPr>
         <w:t>Built and continue to enhance Data Generator &amp; File Processing because production data can't be used in VA lower environments. The team used to spend hours each day preparing data and keeping a database in every environment; now anyone can generate a full development database or up to 10,000 custom records in under 5 minutes, and the whole team uses it daily.</w:t>
@@ -235,7 +235,7 @@
           <w:rFonts w:ascii="Inter" w:hAnsi="Inter"/>
           <w:b w:val="0"/>
           <w:i w:val="0"/>
-          <w:color w:val="0D1117"/>
+          <w:color w:val="141413"/>
           <w:sz w:val="18"/>
         </w:rPr>
         <w:t>Run the tool like a product: versioned Windows releases built through GitHub Actions, in-app release notes, a user guide, a stakeholder overview, and release updates for the team; added Excel file processing with duplicate detection as a second workflow when team needs grew.</w:t>
@@ -252,7 +252,7 @@
           <w:rFonts w:ascii="Inter" w:hAnsi="Inter"/>
           <w:b w:val="0"/>
           <w:i w:val="0"/>
-          <w:color w:val="0D1117"/>
+          <w:color w:val="141413"/>
           <w:sz w:val="18"/>
         </w:rPr>
         <w:t>Enabled the team to use Tableau for requests and system information so any user can build their own dashboard; built custom dashboards for VA and internal users and, through repeated VA stakeholder discussions, expanded Tableau into the main way to monitor server health and system status.</w:t>
@@ -269,7 +269,7 @@
           <w:rFonts w:ascii="Inter" w:hAnsi="Inter"/>
           <w:b w:val="0"/>
           <w:i w:val="0"/>
-          <w:color w:val="0D1117"/>
+          <w:color w:val="141413"/>
           <w:sz w:val="18"/>
         </w:rPr>
         <w:t>Contribute React, TypeScript, and JavaScript features that turn stakeholder feedback into improvements to the claims application.</w:t>
@@ -286,7 +286,7 @@
           <w:rFonts w:ascii="Inter" w:hAnsi="Inter"/>
           <w:b w:val="0"/>
           <w:i w:val="0"/>
-          <w:color w:val="0D1117"/>
+          <w:color w:val="141413"/>
           <w:sz w:val="18"/>
         </w:rPr>
         <w:t>Work directly with VA stakeholders to map healthcare claims workflows, clarify technical and operational constraints, and define requirements and acceptance criteria for claim submission, provider updates, status tracking, and payment visibility.</w:t>
@@ -303,7 +303,7 @@
           <w:rFonts w:ascii="Inter" w:hAnsi="Inter"/>
           <w:b w:val="0"/>
           <w:i w:val="0"/>
-          <w:color w:val="0D1117"/>
+          <w:color w:val="141413"/>
           <w:sz w:val="18"/>
         </w:rPr>
         <w:t>Lead the stakeholder demonstrations at the end of each release cycle and program increment (since 2022) and all discussions with VA stakeholders; gather feedback on daily workflows and refine implementations around user needs.</w:t>
@@ -320,7 +320,7 @@
           <w:rFonts w:ascii="Inter" w:hAnsi="Inter"/>
           <w:b w:val="0"/>
           <w:i w:val="0"/>
-          <w:color w:val="0D1117"/>
+          <w:color w:val="141413"/>
           <w:sz w:val="18"/>
         </w:rPr>
         <w:t>Join working sessions with health-provider claims processors and, at times, VA end users on issues reported in production, to see the full picture and keep future work pointed in the right direction.</w:t>
@@ -337,7 +337,7 @@
           <w:rFonts w:ascii="Inter" w:hAnsi="Inter"/>
           <w:b w:val="0"/>
           <w:i w:val="0"/>
-          <w:color w:val="0D1117"/>
+          <w:color w:val="141413"/>
           <w:sz w:val="18"/>
         </w:rPr>
         <w:t>Investigate defects and data discrepancies across frontend, backend, and MySQL data; coordinate with developers and stakeholders to resolve delivery dependencies, and document progress, blockers, and operational impact in Jira.</w:t>
@@ -354,7 +354,7 @@
           <w:rFonts w:ascii="Inter" w:hAnsi="Inter"/>
           <w:b w:val="0"/>
           <w:i w:val="0"/>
-          <w:color w:val="0D1117"/>
+          <w:color w:val="141413"/>
           <w:sz w:val="18"/>
         </w:rPr>
         <w:t>Evaluated alternatives to legacy automation and helped select Playwright, weighing maintainability, reuse, authentication, and restricted environment access; developed a reusable smoke and regression framework that helps QA and developers reduce production bugs and deliver stakeholder requests faster.</w:t>
@@ -371,7 +371,7 @@
           <w:rFonts w:ascii="Inter" w:hAnsi="Inter"/>
           <w:b w:val="0"/>
           <w:i w:val="0"/>
-          <w:color w:val="0D1117"/>
+          <w:color w:val="141413"/>
           <w:sz w:val="18"/>
         </w:rPr>
         <w:t>Use GitHub Copilot in VS Code for development, debugging, refactoring, and test creation; use Gemini, GPT models, and Claude to explore implementation approaches.</w:t>
@@ -392,7 +392,7 @@
           <w:rFonts w:ascii="Inter" w:hAnsi="Inter"/>
           <w:b/>
           <w:i w:val="0"/>
-          <w:color w:val="0A6B5D"/>
+          <w:color w:val="9C4128"/>
           <w:sz w:val="24"/>
         </w:rPr>
         <w:t>Professional experience continued</w:t>
@@ -408,7 +408,7 @@
           <w:rFonts w:ascii="Inter" w:hAnsi="Inter"/>
           <w:b/>
           <w:i w:val="0"/>
-          <w:color w:val="0D1117"/>
+          <w:color w:val="141413"/>
           <w:sz w:val="20"/>
         </w:rPr>
         <w:t>Chick-fil-A Corporate — Atlanta, GA</w:t>
@@ -424,7 +424,7 @@
           <w:rFonts w:ascii="Inter" w:hAnsi="Inter"/>
           <w:b/>
           <w:i w:val="0"/>
-          <w:color w:val="0D1117"/>
+          <w:color w:val="141413"/>
           <w:sz w:val="19"/>
         </w:rPr>
         <w:t>Software Engineer in Test</w:t>
@@ -434,7 +434,7 @@
           <w:rFonts w:ascii="Inter" w:hAnsi="Inter"/>
           <w:b w:val="0"/>
           <w:i w:val="0"/>
-          <w:color w:val="56606C"/>
+          <w:color w:val="5E5D59"/>
           <w:sz w:val="16"/>
         </w:rPr>
         <w:t xml:space="preserve">  |  Nov 2018 – Dec 2020</w:t>
@@ -449,7 +449,7 @@
           <w:rFonts w:ascii="Inter" w:hAnsi="Inter"/>
           <w:b w:val="0"/>
           <w:i/>
-          <w:color w:val="56606C"/>
+          <w:color w:val="5E5D59"/>
           <w:sz w:val="18"/>
         </w:rPr>
         <w:t>Built reusable test tooling and used it to investigate REST APIs, authentication, and AWS test environments, giving engineers the evidence to track down failures.</w:t>
@@ -466,7 +466,7 @@
           <w:rFonts w:ascii="Inter" w:hAnsi="Inter"/>
           <w:b w:val="0"/>
           <w:i w:val="0"/>
-          <w:color w:val="0D1117"/>
+          <w:color w:val="141413"/>
           <w:sz w:val="18"/>
         </w:rPr>
         <w:t>Built reusable JavaScript browser automation around application workflows, translating expected behavior into repeatable checks that supported implementation and release decisions.</w:t>
@@ -483,7 +483,7 @@
           <w:rFonts w:ascii="Inter" w:hAnsi="Inter"/>
           <w:b w:val="0"/>
           <w:i w:val="0"/>
-          <w:color w:val="0D1117"/>
+          <w:color w:val="141413"/>
           <w:sz w:val="18"/>
         </w:rPr>
         <w:t>Investigated application-to-service integration through browser automation and Postman REST API checks, validating schemas, service contracts, and data-dependent behavior to surface discrepancies.</w:t>
@@ -500,7 +500,7 @@
           <w:rFonts w:ascii="Inter" w:hAnsi="Inter"/>
           <w:b w:val="0"/>
           <w:i w:val="0"/>
-          <w:color w:val="0D1117"/>
+          <w:color w:val="141413"/>
           <w:sz w:val="18"/>
         </w:rPr>
         <w:t>Validated OIDC, Okta MFA, and SSO workflows, troubleshooting authentication behavior across application scenarios and capturing evidence for failure investigation.</w:t>
@@ -517,7 +517,7 @@
           <w:rFonts w:ascii="Inter" w:hAnsi="Inter"/>
           <w:b w:val="0"/>
           <w:i w:val="0"/>
-          <w:color w:val="0D1117"/>
+          <w:color w:val="141413"/>
           <w:sz w:val="18"/>
         </w:rPr>
         <w:t>Connected GitHub Actions and AWS test environments into repeatable delivery workflows, making execution results and diagnostic artifacts available to engineering teams.</w:t>
@@ -534,7 +534,7 @@
           <w:rFonts w:ascii="Inter" w:hAnsi="Inter"/>
           <w:b w:val="0"/>
           <w:i w:val="0"/>
-          <w:color w:val="0D1117"/>
+          <w:color w:val="141413"/>
           <w:sz w:val="18"/>
         </w:rPr>
         <w:t>Used AWS EC2, S3, and Aurora resources to support test environments; combined network stubbing, headless testing, and parallel execution to isolate dependencies and reproduce scenarios.</w:t>
@@ -550,7 +550,7 @@
           <w:rFonts w:ascii="Inter" w:hAnsi="Inter"/>
           <w:b/>
           <w:i w:val="0"/>
-          <w:color w:val="0D1117"/>
+          <w:color w:val="141413"/>
           <w:sz w:val="20"/>
         </w:rPr>
         <w:t>Ally Bank — Sandy, UT</w:t>
@@ -566,7 +566,7 @@
           <w:rFonts w:ascii="Inter" w:hAnsi="Inter"/>
           <w:b/>
           <w:i w:val="0"/>
-          <w:color w:val="0D1117"/>
+          <w:color w:val="141413"/>
           <w:sz w:val="19"/>
         </w:rPr>
         <w:t>Software QA Engineer</w:t>
@@ -576,7 +576,7 @@
           <w:rFonts w:ascii="Inter" w:hAnsi="Inter"/>
           <w:b w:val="0"/>
           <w:i w:val="0"/>
-          <w:color w:val="56606C"/>
+          <w:color w:val="5E5D59"/>
           <w:sz w:val="16"/>
         </w:rPr>
         <w:t xml:space="preserve">  |  Sep 2015 – Nov 2018</w:t>
@@ -591,7 +591,7 @@
           <w:rFonts w:ascii="Inter" w:hAnsi="Inter"/>
           <w:b w:val="0"/>
           <w:i/>
-          <w:color w:val="56606C"/>
+          <w:color w:val="5E5D59"/>
           <w:sz w:val="18"/>
         </w:rPr>
         <w:t>Worked with developers, analysts, and product owners to turn banking requirements into traceable tests and release checks.</w:t>
@@ -608,7 +608,7 @@
           <w:rFonts w:ascii="Inter" w:hAnsi="Inter"/>
           <w:b w:val="0"/>
           <w:i w:val="0"/>
-          <w:color w:val="0D1117"/>
+          <w:color w:val="141413"/>
           <w:sz w:val="18"/>
         </w:rPr>
         <w:t>Translated business and functional requirements into test plans, acceptance criteria, and traceable scenarios with developers, analysts, and product owners.</w:t>
@@ -625,7 +625,7 @@
           <w:rFonts w:ascii="Inter" w:hAnsi="Inter"/>
           <w:b w:val="0"/>
           <w:i w:val="0"/>
-          <w:color w:val="0D1117"/>
+          <w:color w:val="141413"/>
           <w:sz w:val="18"/>
         </w:rPr>
         <w:t>Performed exploratory, functional, and regression testing of banking web applications, investigating behavior across customer workflows and platforms.</w:t>
@@ -642,7 +642,7 @@
           <w:rFonts w:ascii="Inter" w:hAnsi="Inter"/>
           <w:b w:val="0"/>
           <w:i w:val="0"/>
-          <w:color w:val="0D1117"/>
+          <w:color w:val="141413"/>
           <w:sz w:val="18"/>
         </w:rPr>
         <w:t>Created reproducible Jira defect reports with environment details and business impact; collaborated with developers to investigate causes and verify fixes.</w:t>
@@ -659,7 +659,7 @@
           <w:rFonts w:ascii="Inter" w:hAnsi="Inter"/>
           <w:b w:val="0"/>
           <w:i w:val="0"/>
-          <w:color w:val="0D1117"/>
+          <w:color w:val="141413"/>
           <w:sz w:val="18"/>
         </w:rPr>
         <w:t>Used SQL data checks alongside application validation to investigate discrepancies and verify expected results.</w:t>
@@ -676,7 +676,7 @@
           <w:rFonts w:ascii="Inter" w:hAnsi="Inter"/>
           <w:b w:val="0"/>
           <w:i w:val="0"/>
-          <w:color w:val="0D1117"/>
+          <w:color w:val="141413"/>
           <w:sz w:val="18"/>
         </w:rPr>
         <w:t>Supported smoke, regression, and sanity checks across development, QA, UAT, and staging environments, including deployment checks and hotfix verification.</w:t>
@@ -692,7 +692,7 @@
           <w:rFonts w:ascii="Inter" w:hAnsi="Inter"/>
           <w:b/>
           <w:i w:val="0"/>
-          <w:color w:val="0A6B5D"/>
+          <w:color w:val="9C4128"/>
           <w:sz w:val="24"/>
         </w:rPr>
         <w:t>Selected projects</w:t>
@@ -707,7 +707,7 @@
           <w:rFonts w:ascii="Inter" w:hAnsi="Inter"/>
           <w:b w:val="0"/>
           <w:i w:val="0"/>
-          <w:color w:val="0D1117"/>
+          <w:color w:val="141413"/>
           <w:sz w:val="18"/>
         </w:rPr>
         <w:t>Claims Document Assistant: Claude API assistant that extracts 17 fields from claim PDFs, flags gaps with fixed rules, and drafts replies a reviewer approves; 26 tests. github.com/mohamedmoheyeldin/claims-document-assistant</w:t>
@@ -722,7 +722,7 @@
           <w:rFonts w:ascii="Inter" w:hAnsi="Inter"/>
           <w:b w:val="0"/>
           <w:i w:val="0"/>
-          <w:color w:val="0D1117"/>
+          <w:color w:val="141413"/>
           <w:sz w:val="18"/>
         </w:rPr>
         <w:t>Portfolio &amp; Career Content System: Built a statically rendered React portfolio from validated JSON, with shared PDF/Word generation and static deployment packaging for Cloudflare. mohamedmoheyeldin.com</w:t>
@@ -738,7 +738,7 @@
           <w:rFonts w:ascii="Inter" w:hAnsi="Inter"/>
           <w:b/>
           <w:i w:val="0"/>
-          <w:color w:val="0A6B5D"/>
+          <w:color w:val="9C4128"/>
           <w:sz w:val="24"/>
         </w:rPr>
         <w:t>Technical skills</w:t>
@@ -753,7 +753,7 @@
           <w:rFonts w:ascii="Inter" w:hAnsi="Inter"/>
           <w:b w:val="0"/>
           <w:i w:val="0"/>
-          <w:color w:val="0D1117"/>
+          <w:color w:val="141413"/>
           <w:sz w:val="18"/>
         </w:rPr>
         <w:t>Application development: React, TypeScript, JavaScript, Java, Reusable components</w:t>
@@ -768,7 +768,7 @@
           <w:rFonts w:ascii="Inter" w:hAnsi="Inter"/>
           <w:b w:val="0"/>
           <w:i w:val="0"/>
-          <w:color w:val="0D1117"/>
+          <w:color w:val="141413"/>
           <w:sz w:val="18"/>
         </w:rPr>
         <w:t>Data and integration: SQL, MySQL, JSON, REST APIs, Postman, Tableau, SQL Server, Oracle, MongoDB</w:t>
@@ -783,7 +783,7 @@
           <w:rFonts w:ascii="Inter" w:hAnsi="Inter"/>
           <w:b w:val="0"/>
           <w:i w:val="0"/>
-          <w:color w:val="0D1117"/>
+          <w:color w:val="141413"/>
           <w:sz w:val="18"/>
         </w:rPr>
         <w:t>Delivery and quality: Playwright, GitHub Actions, Git, Jira, Jenkins, AWS EC2/S3/Aurora test environments</w:t>
@@ -798,7 +798,7 @@
           <w:rFonts w:ascii="Inter" w:hAnsi="Inter"/>
           <w:b w:val="0"/>
           <w:i w:val="0"/>
-          <w:color w:val="0D1117"/>
+          <w:color w:val="141413"/>
           <w:sz w:val="18"/>
         </w:rPr>
         <w:t>AI-assisted engineering: Claude API, GitHub Copilot, VS Code, GPT models, Claude, Gemini</w:t>
@@ -814,7 +814,7 @@
           <w:rFonts w:ascii="Inter" w:hAnsi="Inter"/>
           <w:b/>
           <w:i w:val="0"/>
-          <w:color w:val="0A6B5D"/>
+          <w:color w:val="9C4128"/>
           <w:sz w:val="24"/>
         </w:rPr>
         <w:t xml:space="preserve">Education </w:t>
@@ -829,7 +829,7 @@
           <w:rFonts w:ascii="Inter" w:hAnsi="Inter"/>
           <w:b w:val="0"/>
           <w:i w:val="0"/>
-          <w:color w:val="0D1117"/>
+          <w:color w:val="141413"/>
           <w:sz w:val="18"/>
         </w:rPr>
         <w:t>Bachelor's degree in Computer Science | American College of Commerce and Technology | May 2014</w:t>
@@ -845,7 +845,7 @@
           <w:rFonts w:ascii="Inter" w:hAnsi="Inter"/>
           <w:b/>
           <w:i w:val="0"/>
-          <w:color w:val="0A6B5D"/>
+          <w:color w:val="9C4128"/>
           <w:sz w:val="24"/>
         </w:rPr>
         <w:t>Professional development</w:t>
@@ -860,7 +860,7 @@
           <w:rFonts w:ascii="Inter" w:hAnsi="Inter"/>
           <w:b w:val="0"/>
           <w:i w:val="0"/>
-          <w:color w:val="0D1117"/>
+          <w:color w:val="141413"/>
           <w:sz w:val="18"/>
         </w:rPr>
       </w:r>
@@ -869,7 +869,7 @@
           <w:rFonts w:ascii="Inter" w:hAnsi="Inter"/>
           <w:b w:val="0"/>
           <w:i w:val="0"/>
-          <w:color w:val="0D1117"/>
+          <w:color w:val="141413"/>
           <w:sz w:val="18"/>
         </w:rPr>
         <w:t xml:space="preserve">Claude Academy | Issued 2026: </w:t>
@@ -880,7 +880,7 @@
             <w:rFonts w:ascii="Inter" w:hAnsi="Inter"/>
             <w:b w:val="0"/>
             <w:i w:val="0"/>
-            <w:color w:val="0A6B5D"/>
+            <w:color w:val="9C4128"/>
             <w:sz w:val="18"/>
           </w:rPr>
           <w:t>Introduction to Claude Cowork</w:t>
@@ -891,7 +891,7 @@
           <w:rFonts w:ascii="Inter" w:hAnsi="Inter"/>
           <w:b w:val="0"/>
           <w:i w:val="0"/>
-          <w:color w:val="0D1117"/>
+          <w:color w:val="141413"/>
           <w:sz w:val="18"/>
         </w:rPr>
         <w:t xml:space="preserve">; </w:t>
@@ -902,7 +902,7 @@
             <w:rFonts w:ascii="Inter" w:hAnsi="Inter"/>
             <w:b w:val="0"/>
             <w:i w:val="0"/>
-            <w:color w:val="0A6B5D"/>
+            <w:color w:val="9C4128"/>
             <w:sz w:val="18"/>
           </w:rPr>
           <w:t>Introduction to Claude Tag</w:t>
@@ -913,7 +913,7 @@
           <w:rFonts w:ascii="Inter" w:hAnsi="Inter"/>
           <w:b w:val="0"/>
           <w:i w:val="0"/>
-          <w:color w:val="0D1117"/>
+          <w:color w:val="141413"/>
           <w:sz w:val="18"/>
         </w:rPr>
         <w:t xml:space="preserve">; </w:t>
@@ -924,7 +924,7 @@
             <w:rFonts w:ascii="Inter" w:hAnsi="Inter"/>
             <w:b w:val="0"/>
             <w:i w:val="0"/>
-            <w:color w:val="0A6B5D"/>
+            <w:color w:val="9C4128"/>
             <w:sz w:val="18"/>
           </w:rPr>
           <w:t>AI Capabilities and Limitations</w:t>
@@ -935,7 +935,7 @@
           <w:rFonts w:ascii="Inter" w:hAnsi="Inter"/>
           <w:b w:val="0"/>
           <w:i w:val="0"/>
-          <w:color w:val="0D1117"/>
+          <w:color w:val="141413"/>
           <w:sz w:val="18"/>
         </w:rPr>
         <w:t xml:space="preserve">; </w:t>
@@ -946,7 +946,7 @@
             <w:rFonts w:ascii="Inter" w:hAnsi="Inter"/>
             <w:b w:val="0"/>
             <w:i w:val="0"/>
-            <w:color w:val="0A6B5D"/>
+            <w:color w:val="9C4128"/>
             <w:sz w:val="18"/>
           </w:rPr>
           <w:t>Introduction to Model Context Protocol</w:t>
@@ -957,7 +957,7 @@
           <w:rFonts w:ascii="Inter" w:hAnsi="Inter"/>
           <w:b w:val="0"/>
           <w:i w:val="0"/>
-          <w:color w:val="0D1117"/>
+          <w:color w:val="141413"/>
           <w:sz w:val="18"/>
         </w:rPr>
         <w:t xml:space="preserve">; </w:t>
@@ -968,7 +968,7 @@
             <w:rFonts w:ascii="Inter" w:hAnsi="Inter"/>
             <w:b w:val="0"/>
             <w:i w:val="0"/>
-            <w:color w:val="0A6B5D"/>
+            <w:color w:val="9C4128"/>
             <w:sz w:val="18"/>
           </w:rPr>
           <w:t>Claude Code in Action</w:t>
@@ -979,7 +979,7 @@
           <w:rFonts w:ascii="Inter" w:hAnsi="Inter"/>
           <w:b w:val="0"/>
           <w:i w:val="0"/>
-          <w:color w:val="0D1117"/>
+          <w:color w:val="141413"/>
           <w:sz w:val="18"/>
         </w:rPr>
         <w:t xml:space="preserve">; </w:t>
@@ -990,7 +990,7 @@
             <w:rFonts w:ascii="Inter" w:hAnsi="Inter"/>
             <w:b w:val="0"/>
             <w:i w:val="0"/>
-            <w:color w:val="0A6B5D"/>
+            <w:color w:val="9C4128"/>
             <w:sz w:val="18"/>
           </w:rPr>
           <w:t>Building with the Claude API</w:t>
@@ -1006,7 +1006,7 @@
           <w:rFonts w:ascii="Inter" w:hAnsi="Inter"/>
           <w:b w:val="0"/>
           <w:i w:val="0"/>
-          <w:color w:val="0D1117"/>
+          <w:color w:val="141413"/>
           <w:sz w:val="18"/>
         </w:rPr>
       </w:r>
@@ -1015,7 +1015,7 @@
           <w:rFonts w:ascii="Inter" w:hAnsi="Inter"/>
           <w:b w:val="0"/>
           <w:i w:val="0"/>
-          <w:color w:val="0D1117"/>
+          <w:color w:val="141413"/>
           <w:sz w:val="18"/>
         </w:rPr>
         <w:t xml:space="preserve">OpenAI Academy | Issued 2026: </w:t>
@@ -1026,7 +1026,7 @@
             <w:rFonts w:ascii="Inter" w:hAnsi="Inter"/>
             <w:b w:val="0"/>
             <w:i w:val="0"/>
-            <w:color w:val="0A6B5D"/>
+            <w:color w:val="9C4128"/>
             <w:sz w:val="18"/>
           </w:rPr>
           <w:t>AI Foundations</w:t>
@@ -1037,7 +1037,7 @@
           <w:rFonts w:ascii="Inter" w:hAnsi="Inter"/>
           <w:b w:val="0"/>
           <w:i w:val="0"/>
-          <w:color w:val="0D1117"/>
+          <w:color w:val="141413"/>
           <w:sz w:val="18"/>
         </w:rPr>
         <w:t xml:space="preserve">; </w:t>
@@ -1048,7 +1048,7 @@
             <w:rFonts w:ascii="Inter" w:hAnsi="Inter"/>
             <w:b w:val="0"/>
             <w:i w:val="0"/>
-            <w:color w:val="0A6B5D"/>
+            <w:color w:val="9C4128"/>
             <w:sz w:val="18"/>
           </w:rPr>
           <w:t>Agents and Workflows</w:t>
@@ -1059,7 +1059,7 @@
           <w:rFonts w:ascii="Inter" w:hAnsi="Inter"/>
           <w:b w:val="0"/>
           <w:i w:val="0"/>
-          <w:color w:val="0D1117"/>
+          <w:color w:val="141413"/>
           <w:sz w:val="18"/>
         </w:rPr>
         <w:t xml:space="preserve">; </w:t>
@@ -1070,7 +1070,7 @@
             <w:rFonts w:ascii="Inter" w:hAnsi="Inter"/>
             <w:b w:val="0"/>
             <w:i w:val="0"/>
-            <w:color w:val="0A6B5D"/>
+            <w:color w:val="9C4128"/>
             <w:sz w:val="18"/>
           </w:rPr>
           <w:t>Applied AI Foundations</w:t>
@@ -1081,7 +1081,7 @@
           <w:rFonts w:ascii="Inter" w:hAnsi="Inter"/>
           <w:b w:val="0"/>
           <w:i w:val="0"/>
-          <w:color w:val="0D1117"/>
+          <w:color w:val="141413"/>
           <w:sz w:val="18"/>
         </w:rPr>
         <w:t xml:space="preserve">; </w:t>
@@ -1092,7 +1092,7 @@
             <w:rFonts w:ascii="Inter" w:hAnsi="Inter"/>
             <w:b w:val="0"/>
             <w:i w:val="0"/>
-            <w:color w:val="0A6B5D"/>
+            <w:color w:val="9C4128"/>
             <w:sz w:val="18"/>
           </w:rPr>
           <w:t>AI Leadership</w:t>
@@ -1103,7 +1103,7 @@
           <w:rFonts w:ascii="Inter" w:hAnsi="Inter"/>
           <w:b w:val="0"/>
           <w:i w:val="0"/>
-          <w:color w:val="0D1117"/>
+          <w:color w:val="141413"/>
           <w:sz w:val="18"/>
         </w:rPr>
         <w:t xml:space="preserve">; </w:t>
@@ -1114,7 +1114,7 @@
             <w:rFonts w:ascii="Inter" w:hAnsi="Inter"/>
             <w:b w:val="0"/>
             <w:i w:val="0"/>
-            <w:color w:val="0A6B5D"/>
+            <w:color w:val="9C4128"/>
             <w:sz w:val="18"/>
           </w:rPr>
           <w:t>Apply AI at Work Pathway Completion</w:t>
@@ -1130,7 +1130,7 @@
           <w:rFonts w:ascii="Inter" w:hAnsi="Inter"/>
           <w:b w:val="0"/>
           <w:i w:val="0"/>
-          <w:color w:val="0D1117"/>
+          <w:color w:val="141413"/>
           <w:sz w:val="18"/>
         </w:rPr>
       </w:r>
@@ -1139,7 +1139,7 @@
           <w:rFonts w:ascii="Inter" w:hAnsi="Inter"/>
           <w:b w:val="0"/>
           <w:i w:val="0"/>
-          <w:color w:val="0D1117"/>
+          <w:color w:val="141413"/>
           <w:sz w:val="18"/>
         </w:rPr>
         <w:t xml:space="preserve">Palantir | Issued 2026: </w:t>
@@ -1150,7 +1150,7 @@
             <w:rFonts w:ascii="Inter" w:hAnsi="Inter"/>
             <w:b w:val="0"/>
             <w:i w:val="0"/>
-            <w:color w:val="0A6B5D"/>
+            <w:color w:val="9C4128"/>
             <w:sz w:val="18"/>
           </w:rPr>
           <w:t>Speedrun: Your First End-to-End Workflow</w:t>
@@ -1161,7 +1161,7 @@
           <w:rFonts w:ascii="Inter" w:hAnsi="Inter"/>
           <w:b w:val="0"/>
           <w:i w:val="0"/>
-          <w:color w:val="0D1117"/>
+          <w:color w:val="141413"/>
           <w:sz w:val="18"/>
         </w:rPr>
         <w:t xml:space="preserve">; </w:t>
@@ -1172,7 +1172,7 @@
             <w:rFonts w:ascii="Inter" w:hAnsi="Inter"/>
             <w:b w:val="0"/>
             <w:i w:val="0"/>
-            <w:color w:val="0A6B5D"/>
+            <w:color w:val="9C4128"/>
             <w:sz w:val="18"/>
           </w:rPr>
           <w:t>Foundry &amp; AIP Builder Foundations Quiz</w:t>
@@ -1188,7 +1188,7 @@
           <w:rFonts w:ascii="Inter" w:hAnsi="Inter"/>
           <w:b w:val="0"/>
           <w:i w:val="0"/>
-          <w:color w:val="0D1117"/>
+          <w:color w:val="141413"/>
           <w:sz w:val="18"/>
         </w:rPr>
       </w:r>
@@ -1197,7 +1197,7 @@
           <w:rFonts w:ascii="Inter" w:hAnsi="Inter"/>
           <w:b w:val="0"/>
           <w:i w:val="0"/>
-          <w:color w:val="0D1117"/>
+          <w:color w:val="141413"/>
           <w:sz w:val="18"/>
         </w:rPr>
         <w:t xml:space="preserve">Scaled Agile | Issued 2021: </w:t>
@@ -1207,7 +1207,7 @@
           <w:rFonts w:ascii="Inter" w:hAnsi="Inter"/>
           <w:b w:val="0"/>
           <w:i w:val="0"/>
-          <w:color w:val="0D1117"/>
+          <w:color w:val="141413"/>
           <w:sz w:val="18"/>
         </w:rPr>
         <w:t>Implementing SAFe Course (5.1)</w:t>
@@ -1236,7 +1236,7 @@
         <w:rFonts w:ascii="Inter" w:hAnsi="Inter"/>
         <w:b w:val="0"/>
         <w:i w:val="0"/>
-        <w:color w:val="56606C"/>
+        <w:color w:val="5E5D59"/>
         <w:sz w:val="14"/>
       </w:rPr>
       <w:t>Detailed resume | mohamedmoheyeldin.com</w:t>
@@ -1613,7 +1613,7 @@
     </w:pPr>
     <w:rPr>
       <w:rFonts w:ascii="Inter" w:hAnsi="Inter"/>
-      <w:color w:val="0D1117"/>
+      <w:color w:val="141413"/>
       <w:sz w:val="18"/>
     </w:rPr>
   </w:style>

</xml_diff>